<commit_message>
atualização da aula 14/09/2026
</commit_message>
<xml_diff>
--- a/Apostila/Projeto Space for Men.docx
+++ b/Apostila/Projeto Space for Men.docx
@@ -6577,7 +6577,15 @@
         <w:t>54-</w:t>
       </w:r>
       <w:r>
-        <w:t xml:space="preserve">Inserindo uma imagem de fundo no site ao contrario do </w:t>
+        <w:t xml:space="preserve">Inserindo uma imagem de fundo no site ao </w:t>
+      </w:r>
+      <w:proofErr w:type="spellStart"/>
+      <w:r>
+        <w:t>contrario</w:t>
+      </w:r>
+      <w:proofErr w:type="spellEnd"/>
+      <w:r>
+        <w:t xml:space="preserve"> do </w:t>
       </w:r>
       <w:proofErr w:type="spellStart"/>
       <w:r>
@@ -6598,6 +6606,9 @@
         <w:t xml:space="preserve">     </w:t>
       </w:r>
       <w:r>
+        <w:rPr>
+          <w:noProof/>
+        </w:rPr>
         <w:drawing>
           <wp:inline distT="0" distB="0" distL="0" distR="0" wp14:anchorId="271B2B52" wp14:editId="257FEFE6">
             <wp:extent cx="2847975" cy="1141284"/>
@@ -6745,6 +6756,9 @@
         <w:t xml:space="preserve">        </w:t>
       </w:r>
       <w:r>
+        <w:rPr>
+          <w:noProof/>
+        </w:rPr>
         <w:drawing>
           <wp:inline distT="0" distB="0" distL="0" distR="0" wp14:anchorId="79FC5C5C" wp14:editId="3999822D">
             <wp:extent cx="3505689" cy="1914792"/>
@@ -6842,12 +6856,520 @@
         <w:t>57-</w:t>
       </w:r>
       <w:r>
-        <w:t xml:space="preserve">    </w:t>
-      </w:r>
+        <w:t xml:space="preserve">Na pagina contato.html inserimos o </w:t>
+      </w:r>
+      <w:proofErr w:type="spellStart"/>
+      <w:r>
+        <w:t>main</w:t>
+      </w:r>
+      <w:proofErr w:type="spellEnd"/>
+      <w:r>
+        <w:t xml:space="preserve"> </w:t>
+      </w:r>
+      <w:proofErr w:type="spellStart"/>
+      <w:r>
+        <w:t>del</w:t>
+      </w:r>
+      <w:proofErr w:type="spellEnd"/>
+      <w:r>
+        <w:t xml:space="preserve"> adicionamos o </w:t>
+      </w:r>
+      <w:proofErr w:type="spellStart"/>
+      <w:r>
+        <w:t>form</w:t>
+      </w:r>
+      <w:proofErr w:type="spellEnd"/>
+      <w:r>
+        <w:t xml:space="preserve"> e começamos a trabalhar com </w:t>
+      </w:r>
+      <w:proofErr w:type="spellStart"/>
+      <w:r>
+        <w:t>label</w:t>
+      </w:r>
+      <w:proofErr w:type="spellEnd"/>
+      <w:r>
+        <w:t xml:space="preserve"> (etiqueta) e input de texto.</w:t>
+      </w:r>
+    </w:p>
+    <w:p>
+      <w:r>
+        <w:t xml:space="preserve">        </w:t>
+      </w:r>
+      <w:r>
+        <w:drawing>
+          <wp:inline distT="0" distB="0" distL="0" distR="0" wp14:anchorId="2EA35E40" wp14:editId="21D70048">
+            <wp:extent cx="3181350" cy="1607074"/>
+            <wp:effectExtent l="0" t="0" r="0" b="0"/>
+            <wp:docPr id="90" name="Imagem 90"/>
+            <wp:cNvGraphicFramePr>
+              <a:graphicFrameLocks xmlns:a="http://schemas.openxmlformats.org/drawingml/2006/main" noChangeAspect="1"/>
+            </wp:cNvGraphicFramePr>
+            <a:graphic xmlns:a="http://schemas.openxmlformats.org/drawingml/2006/main">
+              <a:graphicData uri="http://schemas.openxmlformats.org/drawingml/2006/picture">
+                <pic:pic xmlns:pic="http://schemas.openxmlformats.org/drawingml/2006/picture">
+                  <pic:nvPicPr>
+                    <pic:cNvPr id="1" name=""/>
+                    <pic:cNvPicPr/>
+                  </pic:nvPicPr>
+                  <pic:blipFill>
+                    <a:blip r:embed="rId96"/>
+                    <a:stretch>
+                      <a:fillRect/>
+                    </a:stretch>
+                  </pic:blipFill>
+                  <pic:spPr>
+                    <a:xfrm>
+                      <a:off x="0" y="0"/>
+                      <a:ext cx="3193408" cy="1613165"/>
+                    </a:xfrm>
+                    <a:prstGeom prst="rect">
+                      <a:avLst/>
+                    </a:prstGeom>
+                  </pic:spPr>
+                </pic:pic>
+              </a:graphicData>
+            </a:graphic>
+          </wp:inline>
+        </w:drawing>
+      </w:r>
+      <w:r>
+        <w:t xml:space="preserve">       </w:t>
+      </w:r>
+    </w:p>
+    <w:p/>
+    <w:p/>
+    <w:p/>
+    <w:p/>
+    <w:p/>
+    <w:p>
+      <w:r>
+        <w:t xml:space="preserve">58-Para unir o </w:t>
+      </w:r>
+      <w:proofErr w:type="spellStart"/>
+      <w:r>
+        <w:t>label</w:t>
+      </w:r>
+      <w:proofErr w:type="spellEnd"/>
+      <w:r>
+        <w:t xml:space="preserve"> com input adicionamos o mesmo nome tanto no for da </w:t>
+      </w:r>
+      <w:proofErr w:type="spellStart"/>
+      <w:r>
+        <w:t>label</w:t>
+      </w:r>
+      <w:proofErr w:type="spellEnd"/>
+      <w:r>
+        <w:t xml:space="preserve"> com no id do input.</w:t>
+      </w:r>
+    </w:p>
+    <w:p>
+      <w:r>
+        <w:rPr>
+          <w:noProof/>
+        </w:rPr>
+        <w:drawing>
+          <wp:inline distT="0" distB="0" distL="0" distR="0" wp14:anchorId="00AF4571">
+            <wp:extent cx="3449473" cy="1000125"/>
+            <wp:effectExtent l="0" t="0" r="0" b="0"/>
+            <wp:docPr id="92" name="Imagem 92"/>
+            <wp:cNvGraphicFramePr>
+              <a:graphicFrameLocks xmlns:a="http://schemas.openxmlformats.org/drawingml/2006/main" noChangeAspect="1"/>
+            </wp:cNvGraphicFramePr>
+            <a:graphic xmlns:a="http://schemas.openxmlformats.org/drawingml/2006/main">
+              <a:graphicData uri="http://schemas.openxmlformats.org/drawingml/2006/picture">
+                <pic:pic xmlns:pic="http://schemas.openxmlformats.org/drawingml/2006/picture">
+                  <pic:nvPicPr>
+                    <pic:cNvPr id="0" name="Picture 3"/>
+                    <pic:cNvPicPr>
+                      <a:picLocks noChangeAspect="1" noChangeArrowheads="1"/>
+                    </pic:cNvPicPr>
+                  </pic:nvPicPr>
+                  <pic:blipFill>
+                    <a:blip r:embed="rId97">
+                      <a:extLst>
+                        <a:ext uri="{28A0092B-C50C-407E-A947-70E740481C1C}">
+                          <a14:useLocalDpi xmlns:a14="http://schemas.microsoft.com/office/drawing/2010/main" val="0"/>
+                        </a:ext>
+                      </a:extLst>
+                    </a:blip>
+                    <a:srcRect/>
+                    <a:stretch>
+                      <a:fillRect/>
+                    </a:stretch>
+                  </pic:blipFill>
+                  <pic:spPr bwMode="auto">
+                    <a:xfrm>
+                      <a:off x="0" y="0"/>
+                      <a:ext cx="3473596" cy="1007119"/>
+                    </a:xfrm>
+                    <a:prstGeom prst="rect">
+                      <a:avLst/>
+                    </a:prstGeom>
+                    <a:noFill/>
+                  </pic:spPr>
+                </pic:pic>
+              </a:graphicData>
+            </a:graphic>
+          </wp:inline>
+        </w:drawing>
+      </w:r>
+    </w:p>
+    <w:p/>
+    <w:p>
+      <w:r>
+        <w:t>59-</w:t>
+      </w:r>
+      <w:r>
+        <w:t xml:space="preserve">Para centralizar </w:t>
+      </w:r>
+      <w:r>
+        <w:t xml:space="preserve">o conteúdo dentro do </w:t>
+      </w:r>
+      <w:proofErr w:type="spellStart"/>
+      <w:r>
+        <w:t>main</w:t>
+      </w:r>
+      <w:proofErr w:type="spellEnd"/>
+      <w:r>
+        <w:t xml:space="preserve"> demos uma largura e utilizamos o </w:t>
+      </w:r>
+      <w:proofErr w:type="spellStart"/>
+      <w:r>
+        <w:t>margin</w:t>
+      </w:r>
+      <w:proofErr w:type="spellEnd"/>
+      <w:r>
+        <w:t>: 0 auto conforme imagem:</w:t>
+      </w:r>
+    </w:p>
+    <w:p>
+      <w:r>
+        <w:rPr>
+          <w:noProof/>
+        </w:rPr>
+        <w:drawing>
+          <wp:inline distT="0" distB="0" distL="0" distR="0" wp14:anchorId="56FDC06F">
+            <wp:extent cx="1447800" cy="638175"/>
+            <wp:effectExtent l="0" t="0" r="0" b="9525"/>
+            <wp:docPr id="95" name="Imagem 95"/>
+            <wp:cNvGraphicFramePr>
+              <a:graphicFrameLocks xmlns:a="http://schemas.openxmlformats.org/drawingml/2006/main" noChangeAspect="1"/>
+            </wp:cNvGraphicFramePr>
+            <a:graphic xmlns:a="http://schemas.openxmlformats.org/drawingml/2006/main">
+              <a:graphicData uri="http://schemas.openxmlformats.org/drawingml/2006/picture">
+                <pic:pic xmlns:pic="http://schemas.openxmlformats.org/drawingml/2006/picture">
+                  <pic:nvPicPr>
+                    <pic:cNvPr id="0" name="Picture 6"/>
+                    <pic:cNvPicPr>
+                      <a:picLocks noChangeAspect="1" noChangeArrowheads="1"/>
+                    </pic:cNvPicPr>
+                  </pic:nvPicPr>
+                  <pic:blipFill>
+                    <a:blip r:embed="rId98">
+                      <a:extLst>
+                        <a:ext uri="{28A0092B-C50C-407E-A947-70E740481C1C}">
+                          <a14:useLocalDpi xmlns:a14="http://schemas.microsoft.com/office/drawing/2010/main" val="0"/>
+                        </a:ext>
+                      </a:extLst>
+                    </a:blip>
+                    <a:srcRect/>
+                    <a:stretch>
+                      <a:fillRect/>
+                    </a:stretch>
+                  </pic:blipFill>
+                  <pic:spPr bwMode="auto">
+                    <a:xfrm>
+                      <a:off x="0" y="0"/>
+                      <a:ext cx="1447800" cy="638175"/>
+                    </a:xfrm>
+                    <a:prstGeom prst="rect">
+                      <a:avLst/>
+                    </a:prstGeom>
+                    <a:noFill/>
+                  </pic:spPr>
+                </pic:pic>
+              </a:graphicData>
+            </a:graphic>
+          </wp:inline>
+        </w:drawing>
+      </w:r>
+    </w:p>
+    <w:p>
+      <w:r>
+        <w:t>60-Observamos que o nosso formulário estava apertado entre o cabeçalho e o rodapé inserimos uma altura tanto para cima quanto para baixo.</w:t>
+      </w:r>
+    </w:p>
+    <w:p/>
+    <w:p>
+      <w:r>
+        <w:rPr>
+          <w:noProof/>
+        </w:rPr>
+        <w:drawing>
+          <wp:inline distT="0" distB="0" distL="0" distR="0" wp14:anchorId="4E6A5C2C">
+            <wp:extent cx="1447800" cy="447675"/>
+            <wp:effectExtent l="0" t="0" r="0" b="9525"/>
+            <wp:docPr id="94" name="Imagem 94"/>
+            <wp:cNvGraphicFramePr>
+              <a:graphicFrameLocks xmlns:a="http://schemas.openxmlformats.org/drawingml/2006/main" noChangeAspect="1"/>
+            </wp:cNvGraphicFramePr>
+            <a:graphic xmlns:a="http://schemas.openxmlformats.org/drawingml/2006/main">
+              <a:graphicData uri="http://schemas.openxmlformats.org/drawingml/2006/picture">
+                <pic:pic xmlns:pic="http://schemas.openxmlformats.org/drawingml/2006/picture">
+                  <pic:nvPicPr>
+                    <pic:cNvPr id="0" name="Picture 5"/>
+                    <pic:cNvPicPr>
+                      <a:picLocks noChangeAspect="1" noChangeArrowheads="1"/>
+                    </pic:cNvPicPr>
+                  </pic:nvPicPr>
+                  <pic:blipFill>
+                    <a:blip r:embed="rId99">
+                      <a:extLst>
+                        <a:ext uri="{28A0092B-C50C-407E-A947-70E740481C1C}">
+                          <a14:useLocalDpi xmlns:a14="http://schemas.microsoft.com/office/drawing/2010/main" val="0"/>
+                        </a:ext>
+                      </a:extLst>
+                    </a:blip>
+                    <a:srcRect/>
+                    <a:stretch>
+                      <a:fillRect/>
+                    </a:stretch>
+                  </pic:blipFill>
+                  <pic:spPr bwMode="auto">
+                    <a:xfrm>
+                      <a:off x="0" y="0"/>
+                      <a:ext cx="1447800" cy="447675"/>
+                    </a:xfrm>
+                    <a:prstGeom prst="rect">
+                      <a:avLst/>
+                    </a:prstGeom>
+                    <a:noFill/>
+                  </pic:spPr>
+                </pic:pic>
+              </a:graphicData>
+            </a:graphic>
+          </wp:inline>
+        </w:drawing>
+      </w:r>
+    </w:p>
+    <w:p>
+      <w:r>
+        <w:rPr>
+          <w:noProof/>
+        </w:rPr>
+        <w:drawing>
+          <wp:inline distT="0" distB="0" distL="0" distR="0" wp14:anchorId="56CC425A">
+            <wp:extent cx="4783599" cy="2162175"/>
+            <wp:effectExtent l="0" t="0" r="0" b="0"/>
+            <wp:docPr id="93" name="Imagem 93"/>
+            <wp:cNvGraphicFramePr>
+              <a:graphicFrameLocks xmlns:a="http://schemas.openxmlformats.org/drawingml/2006/main" noChangeAspect="1"/>
+            </wp:cNvGraphicFramePr>
+            <a:graphic xmlns:a="http://schemas.openxmlformats.org/drawingml/2006/main">
+              <a:graphicData uri="http://schemas.openxmlformats.org/drawingml/2006/picture">
+                <pic:pic xmlns:pic="http://schemas.openxmlformats.org/drawingml/2006/picture">
+                  <pic:nvPicPr>
+                    <pic:cNvPr id="0" name="Picture 4"/>
+                    <pic:cNvPicPr>
+                      <a:picLocks noChangeAspect="1" noChangeArrowheads="1"/>
+                    </pic:cNvPicPr>
+                  </pic:nvPicPr>
+                  <pic:blipFill>
+                    <a:blip r:embed="rId100" cstate="print">
+                      <a:extLst>
+                        <a:ext uri="{28A0092B-C50C-407E-A947-70E740481C1C}">
+                          <a14:useLocalDpi xmlns:a14="http://schemas.microsoft.com/office/drawing/2010/main" val="0"/>
+                        </a:ext>
+                      </a:extLst>
+                    </a:blip>
+                    <a:srcRect/>
+                    <a:stretch>
+                      <a:fillRect/>
+                    </a:stretch>
+                  </pic:blipFill>
+                  <pic:spPr bwMode="auto">
+                    <a:xfrm>
+                      <a:off x="0" y="0"/>
+                      <a:ext cx="5002691" cy="2261204"/>
+                    </a:xfrm>
+                    <a:prstGeom prst="rect">
+                      <a:avLst/>
+                    </a:prstGeom>
+                    <a:noFill/>
+                  </pic:spPr>
+                </pic:pic>
+              </a:graphicData>
+            </a:graphic>
+          </wp:inline>
+        </w:drawing>
+      </w:r>
+    </w:p>
+    <w:p/>
+    <w:p/>
+    <w:p/>
+    <w:p/>
+    <w:p/>
+    <w:p/>
+    <w:p/>
+    <w:p>
+      <w:r>
+        <w:t xml:space="preserve">61-Podemos avaliar que o </w:t>
+      </w:r>
+      <w:proofErr w:type="gramStart"/>
+      <w:r>
+        <w:t>nossos formulário</w:t>
+      </w:r>
+      <w:proofErr w:type="gramEnd"/>
+      <w:r>
+        <w:t xml:space="preserve"> tem um tipo de comportamento mesmo colocando um elemento </w:t>
+      </w:r>
+      <w:r>
+        <w:t xml:space="preserve">em baixo do outro no </w:t>
+      </w:r>
+      <w:proofErr w:type="spellStart"/>
+      <w:r>
+        <w:t>html</w:t>
+      </w:r>
+      <w:proofErr w:type="spellEnd"/>
+      <w:r>
+        <w:t xml:space="preserve"> ao </w:t>
+      </w:r>
+      <w:proofErr w:type="spellStart"/>
+      <w:r>
+        <w:t>renderizar</w:t>
+      </w:r>
+      <w:proofErr w:type="spellEnd"/>
+      <w:r>
+        <w:t xml:space="preserve"> a pagina os elementos (</w:t>
+      </w:r>
+      <w:proofErr w:type="spellStart"/>
+      <w:r>
+        <w:t>label</w:t>
+      </w:r>
+      <w:proofErr w:type="spellEnd"/>
+      <w:r>
+        <w:t xml:space="preserve"> e input) ficam um ao lado do outro. Para mudar essa situação mudamos a natureza do </w:t>
+      </w:r>
+      <w:proofErr w:type="spellStart"/>
+      <w:r>
+        <w:t>label</w:t>
+      </w:r>
+      <w:proofErr w:type="spellEnd"/>
+      <w:r>
+        <w:t xml:space="preserve"> e input conforme código abaixo.</w:t>
+      </w:r>
+    </w:p>
+    <w:p/>
+    <w:p>
       <w:bookmarkStart w:id="0" w:name="_GoBack"/>
+      <w:r>
+        <w:rPr>
+          <w:noProof/>
+        </w:rPr>
+        <w:drawing>
+          <wp:inline distT="0" distB="0" distL="0" distR="0" wp14:anchorId="4F397568">
+            <wp:extent cx="1586590" cy="1661825"/>
+            <wp:effectExtent l="0" t="0" r="0" b="0"/>
+            <wp:docPr id="96" name="Imagem 96"/>
+            <wp:cNvGraphicFramePr>
+              <a:graphicFrameLocks xmlns:a="http://schemas.openxmlformats.org/drawingml/2006/main" noChangeAspect="1"/>
+            </wp:cNvGraphicFramePr>
+            <a:graphic xmlns:a="http://schemas.openxmlformats.org/drawingml/2006/main">
+              <a:graphicData uri="http://schemas.openxmlformats.org/drawingml/2006/picture">
+                <pic:pic xmlns:pic="http://schemas.openxmlformats.org/drawingml/2006/picture">
+                  <pic:nvPicPr>
+                    <pic:cNvPr id="0" name="Picture 7"/>
+                    <pic:cNvPicPr>
+                      <a:picLocks noChangeAspect="1" noChangeArrowheads="1"/>
+                    </pic:cNvPicPr>
+                  </pic:nvPicPr>
+                  <pic:blipFill>
+                    <a:blip r:embed="rId101">
+                      <a:extLst>
+                        <a:ext uri="{28A0092B-C50C-407E-A947-70E740481C1C}">
+                          <a14:useLocalDpi xmlns:a14="http://schemas.microsoft.com/office/drawing/2010/main" val="0"/>
+                        </a:ext>
+                      </a:extLst>
+                    </a:blip>
+                    <a:srcRect/>
+                    <a:stretch>
+                      <a:fillRect/>
+                    </a:stretch>
+                  </pic:blipFill>
+                  <pic:spPr bwMode="auto">
+                    <a:xfrm>
+                      <a:off x="0" y="0"/>
+                      <a:ext cx="1606415" cy="1682591"/>
+                    </a:xfrm>
+                    <a:prstGeom prst="rect">
+                      <a:avLst/>
+                    </a:prstGeom>
+                    <a:noFill/>
+                  </pic:spPr>
+                </pic:pic>
+              </a:graphicData>
+            </a:graphic>
+          </wp:inline>
+        </w:drawing>
+      </w:r>
       <w:bookmarkEnd w:id="0"/>
       <w:r>
-        <w:t xml:space="preserve">                                                                                                                                                                                                                                                                                                                                                                                                                                                                                                                                                                                                                                                                                                                                                                                                                                               </w:t>
+        <w:rPr>
+          <w:noProof/>
+        </w:rPr>
+        <w:drawing>
+          <wp:inline distT="0" distB="0" distL="0" distR="0" wp14:anchorId="49B905E8">
+            <wp:extent cx="3810726" cy="1885687"/>
+            <wp:effectExtent l="0" t="0" r="0" b="635"/>
+            <wp:docPr id="97" name="Imagem 97"/>
+            <wp:cNvGraphicFramePr>
+              <a:graphicFrameLocks xmlns:a="http://schemas.openxmlformats.org/drawingml/2006/main" noChangeAspect="1"/>
+            </wp:cNvGraphicFramePr>
+            <a:graphic xmlns:a="http://schemas.openxmlformats.org/drawingml/2006/main">
+              <a:graphicData uri="http://schemas.openxmlformats.org/drawingml/2006/picture">
+                <pic:pic xmlns:pic="http://schemas.openxmlformats.org/drawingml/2006/picture">
+                  <pic:nvPicPr>
+                    <pic:cNvPr id="0" name="Picture 8"/>
+                    <pic:cNvPicPr>
+                      <a:picLocks noChangeAspect="1" noChangeArrowheads="1"/>
+                    </pic:cNvPicPr>
+                  </pic:nvPicPr>
+                  <pic:blipFill>
+                    <a:blip r:embed="rId102" cstate="print">
+                      <a:extLst>
+                        <a:ext uri="{28A0092B-C50C-407E-A947-70E740481C1C}">
+                          <a14:useLocalDpi xmlns:a14="http://schemas.microsoft.com/office/drawing/2010/main" val="0"/>
+                        </a:ext>
+                      </a:extLst>
+                    </a:blip>
+                    <a:srcRect/>
+                    <a:stretch>
+                      <a:fillRect/>
+                    </a:stretch>
+                  </pic:blipFill>
+                  <pic:spPr bwMode="auto">
+                    <a:xfrm>
+                      <a:off x="0" y="0"/>
+                      <a:ext cx="3853793" cy="1906998"/>
+                    </a:xfrm>
+                    <a:prstGeom prst="rect">
+                      <a:avLst/>
+                    </a:prstGeom>
+                    <a:noFill/>
+                  </pic:spPr>
+                </pic:pic>
+              </a:graphicData>
+            </a:graphic>
+          </wp:inline>
+        </w:drawing>
+      </w:r>
+    </w:p>
+    <w:p>
+      <w:r>
+        <w:t xml:space="preserve"> </w:t>
+      </w:r>
+      <w:r>
+        <w:t xml:space="preserve">                                                                                                                                                                                                                                                                                                                                                                                                                                                                                                                                                                                                                                                                                                                                                               </w:t>
       </w:r>
     </w:p>
     <w:sectPr>
@@ -7833,7 +8355,7 @@
 </file>
 
 <file path=customXml/itemProps1.xml><?xml version="1.0" encoding="utf-8"?>
-<ds:datastoreItem xmlns:ds="http://schemas.openxmlformats.org/officeDocument/2006/customXml" ds:itemID="{F61E97F1-2421-4AA3-82DF-CEEA1DC3A1BC}">
+<ds:datastoreItem xmlns:ds="http://schemas.openxmlformats.org/officeDocument/2006/customXml" ds:itemID="{6FB9FFB4-B566-4738-9DF6-87F5B3BFB8DD}">
   <ds:schemaRefs>
     <ds:schemaRef ds:uri="http://schemas.openxmlformats.org/officeDocument/2006/bibliography"/>
   </ds:schemaRefs>

</xml_diff>

<commit_message>
atualização da aula 21/09/2026
</commit_message>
<xml_diff>
--- a/Apostila/Projeto Space for Men.docx
+++ b/Apostila/Projeto Space for Men.docx
@@ -6896,6 +6896,9 @@
         <w:t xml:space="preserve">        </w:t>
       </w:r>
       <w:r>
+        <w:rPr>
+          <w:noProof/>
+        </w:rPr>
         <w:drawing>
           <wp:inline distT="0" distB="0" distL="0" distR="0" wp14:anchorId="2EA35E40" wp14:editId="21D70048">
             <wp:extent cx="3181350" cy="1607074"/>
@@ -7261,7 +7264,6 @@
     </w:p>
     <w:p/>
     <w:p>
-      <w:bookmarkStart w:id="0" w:name="_GoBack"/>
       <w:r>
         <w:rPr>
           <w:noProof/>
@@ -7312,7 +7314,6 @@
           </wp:inline>
         </w:drawing>
       </w:r>
-      <w:bookmarkEnd w:id="0"/>
       <w:r>
         <w:rPr>
           <w:noProof/>
@@ -7364,12 +7365,990 @@
         </w:drawing>
       </w:r>
     </w:p>
-    <w:p>
+    <w:p/>
+    <w:p>
+      <w:r>
+        <w:t xml:space="preserve">62-Demos um espaço para lado de baixo da </w:t>
+      </w:r>
+      <w:proofErr w:type="spellStart"/>
+      <w:r>
+        <w:t>label</w:t>
+      </w:r>
+      <w:proofErr w:type="spellEnd"/>
       <w:r>
         <w:t xml:space="preserve"> </w:t>
       </w:r>
-      <w:r>
-        <w:t xml:space="preserve">                                                                                                                                                                                                                                                                                                                                                                                                                                                                                                                                                                                                                                                                                                                                                               </w:t>
+      <w:proofErr w:type="spellStart"/>
+      <w:r>
+        <w:t>margin</w:t>
+      </w:r>
+      <w:proofErr w:type="spellEnd"/>
+      <w:r>
+        <w:t xml:space="preserve">: 20px e aumentamos o tamanho da fonte, o input também </w:t>
+      </w:r>
+      <w:proofErr w:type="spellStart"/>
+      <w:r>
+        <w:t>acresentamos</w:t>
+      </w:r>
+      <w:proofErr w:type="spellEnd"/>
+      <w:r>
+        <w:t xml:space="preserve"> um espaço do lado de baixo e aumentamos o espaço interno tanto na parte de cima, baixo, direita e esquerda </w:t>
+      </w:r>
+    </w:p>
+    <w:p/>
+    <w:p>
+      <w:r>
+        <w:drawing>
+          <wp:inline distT="0" distB="0" distL="0" distR="0" wp14:anchorId="4051DCAF" wp14:editId="35E79EEA">
+            <wp:extent cx="1867161" cy="1705213"/>
+            <wp:effectExtent l="0" t="0" r="0" b="9525"/>
+            <wp:docPr id="91" name="Imagem 91"/>
+            <wp:cNvGraphicFramePr>
+              <a:graphicFrameLocks xmlns:a="http://schemas.openxmlformats.org/drawingml/2006/main" noChangeAspect="1"/>
+            </wp:cNvGraphicFramePr>
+            <a:graphic xmlns:a="http://schemas.openxmlformats.org/drawingml/2006/main">
+              <a:graphicData uri="http://schemas.openxmlformats.org/drawingml/2006/picture">
+                <pic:pic xmlns:pic="http://schemas.openxmlformats.org/drawingml/2006/picture">
+                  <pic:nvPicPr>
+                    <pic:cNvPr id="1" name=""/>
+                    <pic:cNvPicPr/>
+                  </pic:nvPicPr>
+                  <pic:blipFill>
+                    <a:blip r:embed="rId103"/>
+                    <a:stretch>
+                      <a:fillRect/>
+                    </a:stretch>
+                  </pic:blipFill>
+                  <pic:spPr>
+                    <a:xfrm>
+                      <a:off x="0" y="0"/>
+                      <a:ext cx="1867161" cy="1705213"/>
+                    </a:xfrm>
+                    <a:prstGeom prst="rect">
+                      <a:avLst/>
+                    </a:prstGeom>
+                  </pic:spPr>
+                </pic:pic>
+              </a:graphicData>
+            </a:graphic>
+          </wp:inline>
+        </w:drawing>
+      </w:r>
+      <w:r>
+        <w:t xml:space="preserve">                                    </w:t>
+      </w:r>
+      <w:r>
+        <w:rPr>
+          <w:noProof/>
+        </w:rPr>
+        <w:drawing>
+          <wp:inline distT="0" distB="0" distL="0" distR="0" wp14:anchorId="6DB3CA0B">
+            <wp:extent cx="1666875" cy="2327720"/>
+            <wp:effectExtent l="0" t="0" r="0" b="0"/>
+            <wp:docPr id="98" name="Imagem 98"/>
+            <wp:cNvGraphicFramePr>
+              <a:graphicFrameLocks xmlns:a="http://schemas.openxmlformats.org/drawingml/2006/main" noChangeAspect="1"/>
+            </wp:cNvGraphicFramePr>
+            <a:graphic xmlns:a="http://schemas.openxmlformats.org/drawingml/2006/main">
+              <a:graphicData uri="http://schemas.openxmlformats.org/drawingml/2006/picture">
+                <pic:pic xmlns:pic="http://schemas.openxmlformats.org/drawingml/2006/picture">
+                  <pic:nvPicPr>
+                    <pic:cNvPr id="0" name="Picture 2"/>
+                    <pic:cNvPicPr>
+                      <a:picLocks noChangeAspect="1" noChangeArrowheads="1"/>
+                    </pic:cNvPicPr>
+                  </pic:nvPicPr>
+                  <pic:blipFill>
+                    <a:blip r:embed="rId104">
+                      <a:extLst>
+                        <a:ext uri="{28A0092B-C50C-407E-A947-70E740481C1C}">
+                          <a14:useLocalDpi xmlns:a14="http://schemas.microsoft.com/office/drawing/2010/main" val="0"/>
+                        </a:ext>
+                      </a:extLst>
+                    </a:blip>
+                    <a:srcRect/>
+                    <a:stretch>
+                      <a:fillRect/>
+                    </a:stretch>
+                  </pic:blipFill>
+                  <pic:spPr bwMode="auto">
+                    <a:xfrm>
+                      <a:off x="0" y="0"/>
+                      <a:ext cx="1745093" cy="2436948"/>
+                    </a:xfrm>
+                    <a:prstGeom prst="rect">
+                      <a:avLst/>
+                    </a:prstGeom>
+                    <a:noFill/>
+                  </pic:spPr>
+                </pic:pic>
+              </a:graphicData>
+            </a:graphic>
+          </wp:inline>
+        </w:drawing>
+      </w:r>
+    </w:p>
+    <w:p/>
+    <w:p/>
+    <w:p>
+      <w:r>
+        <w:t xml:space="preserve">63- </w:t>
+      </w:r>
+      <w:proofErr w:type="spellStart"/>
+      <w:r>
+        <w:t>Incluimos</w:t>
+      </w:r>
+      <w:proofErr w:type="spellEnd"/>
+      <w:r>
+        <w:t xml:space="preserve"> uma porcentagem de 50% para cada input do nosso formulário</w:t>
+      </w:r>
+      <w:r>
+        <w:rPr>
+          <w:noProof/>
+        </w:rPr>
+        <w:drawing>
+          <wp:inline distT="0" distB="0" distL="0" distR="0" wp14:anchorId="58354F20">
+            <wp:extent cx="1704975" cy="962025"/>
+            <wp:effectExtent l="0" t="0" r="9525" b="9525"/>
+            <wp:docPr id="99" name="Imagem 99"/>
+            <wp:cNvGraphicFramePr>
+              <a:graphicFrameLocks xmlns:a="http://schemas.openxmlformats.org/drawingml/2006/main" noChangeAspect="1"/>
+            </wp:cNvGraphicFramePr>
+            <a:graphic xmlns:a="http://schemas.openxmlformats.org/drawingml/2006/main">
+              <a:graphicData uri="http://schemas.openxmlformats.org/drawingml/2006/picture">
+                <pic:pic xmlns:pic="http://schemas.openxmlformats.org/drawingml/2006/picture">
+                  <pic:nvPicPr>
+                    <pic:cNvPr id="0" name="Picture 3"/>
+                    <pic:cNvPicPr>
+                      <a:picLocks noChangeAspect="1" noChangeArrowheads="1"/>
+                    </pic:cNvPicPr>
+                  </pic:nvPicPr>
+                  <pic:blipFill>
+                    <a:blip r:embed="rId105">
+                      <a:extLst>
+                        <a:ext uri="{28A0092B-C50C-407E-A947-70E740481C1C}">
+                          <a14:useLocalDpi xmlns:a14="http://schemas.microsoft.com/office/drawing/2010/main" val="0"/>
+                        </a:ext>
+                      </a:extLst>
+                    </a:blip>
+                    <a:srcRect/>
+                    <a:stretch>
+                      <a:fillRect/>
+                    </a:stretch>
+                  </pic:blipFill>
+                  <pic:spPr bwMode="auto">
+                    <a:xfrm>
+                      <a:off x="0" y="0"/>
+                      <a:ext cx="1704975" cy="962025"/>
+                    </a:xfrm>
+                    <a:prstGeom prst="rect">
+                      <a:avLst/>
+                    </a:prstGeom>
+                    <a:noFill/>
+                  </pic:spPr>
+                </pic:pic>
+              </a:graphicData>
+            </a:graphic>
+          </wp:inline>
+        </w:drawing>
+      </w:r>
+      <w:r>
+        <w:rPr>
+          <w:noProof/>
+        </w:rPr>
+        <w:drawing>
+          <wp:inline distT="0" distB="0" distL="0" distR="0" wp14:anchorId="3C5995C9">
+            <wp:extent cx="3753485" cy="2400105"/>
+            <wp:effectExtent l="0" t="0" r="0" b="635"/>
+            <wp:docPr id="100" name="Imagem 100"/>
+            <wp:cNvGraphicFramePr>
+              <a:graphicFrameLocks xmlns:a="http://schemas.openxmlformats.org/drawingml/2006/main" noChangeAspect="1"/>
+            </wp:cNvGraphicFramePr>
+            <a:graphic xmlns:a="http://schemas.openxmlformats.org/drawingml/2006/main">
+              <a:graphicData uri="http://schemas.openxmlformats.org/drawingml/2006/picture">
+                <pic:pic xmlns:pic="http://schemas.openxmlformats.org/drawingml/2006/picture">
+                  <pic:nvPicPr>
+                    <pic:cNvPr id="0" name="Picture 4"/>
+                    <pic:cNvPicPr>
+                      <a:picLocks noChangeAspect="1" noChangeArrowheads="1"/>
+                    </pic:cNvPicPr>
+                  </pic:nvPicPr>
+                  <pic:blipFill>
+                    <a:blip r:embed="rId106">
+                      <a:extLst>
+                        <a:ext uri="{28A0092B-C50C-407E-A947-70E740481C1C}">
+                          <a14:useLocalDpi xmlns:a14="http://schemas.microsoft.com/office/drawing/2010/main" val="0"/>
+                        </a:ext>
+                      </a:extLst>
+                    </a:blip>
+                    <a:srcRect/>
+                    <a:stretch>
+                      <a:fillRect/>
+                    </a:stretch>
+                  </pic:blipFill>
+                  <pic:spPr bwMode="auto">
+                    <a:xfrm>
+                      <a:off x="0" y="0"/>
+                      <a:ext cx="3773228" cy="2412729"/>
+                    </a:xfrm>
+                    <a:prstGeom prst="rect">
+                      <a:avLst/>
+                    </a:prstGeom>
+                    <a:noFill/>
+                  </pic:spPr>
+                </pic:pic>
+              </a:graphicData>
+            </a:graphic>
+          </wp:inline>
+        </w:drawing>
+      </w:r>
+    </w:p>
+    <w:p>
+      <w:r>
+        <w:t>64-Inserimos</w:t>
+      </w:r>
+      <w:r>
+        <w:t xml:space="preserve"> um </w:t>
+      </w:r>
+      <w:proofErr w:type="spellStart"/>
+      <w:r>
+        <w:t>textarea</w:t>
+      </w:r>
+      <w:proofErr w:type="spellEnd"/>
+      <w:r>
+        <w:t xml:space="preserve"> (inputs de mensagens) em baixo do input telefone e aumentamos o tamanho da coluna para ficar alinhado com outros inputs</w:t>
+      </w:r>
+    </w:p>
+    <w:p>
+      <w:r>
+        <w:rPr>
+          <w:noProof/>
+        </w:rPr>
+        <w:drawing>
+          <wp:inline distT="0" distB="0" distL="0" distR="0" wp14:anchorId="45654922">
+            <wp:extent cx="2600884" cy="2105025"/>
+            <wp:effectExtent l="0" t="0" r="9525" b="0"/>
+            <wp:docPr id="101" name="Imagem 101"/>
+            <wp:cNvGraphicFramePr>
+              <a:graphicFrameLocks xmlns:a="http://schemas.openxmlformats.org/drawingml/2006/main" noChangeAspect="1"/>
+            </wp:cNvGraphicFramePr>
+            <a:graphic xmlns:a="http://schemas.openxmlformats.org/drawingml/2006/main">
+              <a:graphicData uri="http://schemas.openxmlformats.org/drawingml/2006/picture">
+                <pic:pic xmlns:pic="http://schemas.openxmlformats.org/drawingml/2006/picture">
+                  <pic:nvPicPr>
+                    <pic:cNvPr id="0" name="Picture 5"/>
+                    <pic:cNvPicPr>
+                      <a:picLocks noChangeAspect="1" noChangeArrowheads="1"/>
+                    </pic:cNvPicPr>
+                  </pic:nvPicPr>
+                  <pic:blipFill>
+                    <a:blip r:embed="rId107">
+                      <a:extLst>
+                        <a:ext uri="{28A0092B-C50C-407E-A947-70E740481C1C}">
+                          <a14:useLocalDpi xmlns:a14="http://schemas.microsoft.com/office/drawing/2010/main" val="0"/>
+                        </a:ext>
+                      </a:extLst>
+                    </a:blip>
+                    <a:srcRect/>
+                    <a:stretch>
+                      <a:fillRect/>
+                    </a:stretch>
+                  </pic:blipFill>
+                  <pic:spPr bwMode="auto">
+                    <a:xfrm>
+                      <a:off x="0" y="0"/>
+                      <a:ext cx="2864400" cy="2318301"/>
+                    </a:xfrm>
+                    <a:prstGeom prst="rect">
+                      <a:avLst/>
+                    </a:prstGeom>
+                    <a:noFill/>
+                  </pic:spPr>
+                </pic:pic>
+              </a:graphicData>
+            </a:graphic>
+          </wp:inline>
+        </w:drawing>
+      </w:r>
+      <w:r>
+        <w:rPr>
+          <w:noProof/>
+        </w:rPr>
+        <w:drawing>
+          <wp:inline distT="0" distB="0" distL="0" distR="0" wp14:anchorId="61980971">
+            <wp:extent cx="2156588" cy="2105025"/>
+            <wp:effectExtent l="0" t="0" r="0" b="0"/>
+            <wp:docPr id="102" name="Imagem 102"/>
+            <wp:cNvGraphicFramePr>
+              <a:graphicFrameLocks xmlns:a="http://schemas.openxmlformats.org/drawingml/2006/main" noChangeAspect="1"/>
+            </wp:cNvGraphicFramePr>
+            <a:graphic xmlns:a="http://schemas.openxmlformats.org/drawingml/2006/main">
+              <a:graphicData uri="http://schemas.openxmlformats.org/drawingml/2006/picture">
+                <pic:pic xmlns:pic="http://schemas.openxmlformats.org/drawingml/2006/picture">
+                  <pic:nvPicPr>
+                    <pic:cNvPr id="0" name="Picture 6"/>
+                    <pic:cNvPicPr>
+                      <a:picLocks noChangeAspect="1" noChangeArrowheads="1"/>
+                    </pic:cNvPicPr>
+                  </pic:nvPicPr>
+                  <pic:blipFill>
+                    <a:blip r:embed="rId108">
+                      <a:extLst>
+                        <a:ext uri="{28A0092B-C50C-407E-A947-70E740481C1C}">
+                          <a14:useLocalDpi xmlns:a14="http://schemas.microsoft.com/office/drawing/2010/main" val="0"/>
+                        </a:ext>
+                      </a:extLst>
+                    </a:blip>
+                    <a:srcRect/>
+                    <a:stretch>
+                      <a:fillRect/>
+                    </a:stretch>
+                  </pic:blipFill>
+                  <pic:spPr bwMode="auto">
+                    <a:xfrm>
+                      <a:off x="0" y="0"/>
+                      <a:ext cx="2418048" cy="2360233"/>
+                    </a:xfrm>
+                    <a:prstGeom prst="rect">
+                      <a:avLst/>
+                    </a:prstGeom>
+                    <a:noFill/>
+                  </pic:spPr>
+                </pic:pic>
+              </a:graphicData>
+            </a:graphic>
+          </wp:inline>
+        </w:drawing>
+      </w:r>
+    </w:p>
+    <w:p/>
+    <w:p/>
+    <w:p/>
+    <w:p/>
+    <w:p/>
+    <w:p/>
+    <w:p/>
+    <w:p>
+      <w:r>
+        <w:t>65-</w:t>
+      </w:r>
+      <w:r>
+        <w:t xml:space="preserve">Trabalhando com input </w:t>
+      </w:r>
+      <w:proofErr w:type="spellStart"/>
+      <w:r>
+        <w:t>radio</w:t>
+      </w:r>
+      <w:proofErr w:type="spellEnd"/>
+      <w:r>
+        <w:t xml:space="preserve"> em nosso formulário inserimos os </w:t>
+      </w:r>
+      <w:proofErr w:type="spellStart"/>
+      <w:r>
+        <w:t>label</w:t>
+      </w:r>
+      <w:proofErr w:type="spellEnd"/>
+      <w:r>
+        <w:t xml:space="preserve"> e os inputs radio </w:t>
+      </w:r>
+      <w:proofErr w:type="spellStart"/>
+      <w:r>
+        <w:t>confome</w:t>
+      </w:r>
+      <w:proofErr w:type="spellEnd"/>
+      <w:r>
+        <w:t xml:space="preserve"> código a baixo e transformamos que somente uma opção pode ser escolhida utilizando o </w:t>
+      </w:r>
+      <w:proofErr w:type="spellStart"/>
+      <w:r>
+        <w:t>msm</w:t>
+      </w:r>
+      <w:proofErr w:type="spellEnd"/>
+      <w:r>
+        <w:t xml:space="preserve"> nome na palavra </w:t>
+      </w:r>
+      <w:proofErr w:type="spellStart"/>
+      <w:r>
+        <w:t>name</w:t>
+      </w:r>
+      <w:proofErr w:type="spellEnd"/>
+      <w:r>
+        <w:t xml:space="preserve"> do código.</w:t>
+      </w:r>
+    </w:p>
+    <w:p>
+      <w:r>
+        <w:rPr>
+          <w:noProof/>
+        </w:rPr>
+        <w:drawing>
+          <wp:inline distT="0" distB="0" distL="0" distR="0" wp14:anchorId="291AE3FD">
+            <wp:extent cx="2864073" cy="2533650"/>
+            <wp:effectExtent l="0" t="0" r="0" b="0"/>
+            <wp:docPr id="104" name="Imagem 104"/>
+            <wp:cNvGraphicFramePr>
+              <a:graphicFrameLocks xmlns:a="http://schemas.openxmlformats.org/drawingml/2006/main" noChangeAspect="1"/>
+            </wp:cNvGraphicFramePr>
+            <a:graphic xmlns:a="http://schemas.openxmlformats.org/drawingml/2006/main">
+              <a:graphicData uri="http://schemas.openxmlformats.org/drawingml/2006/picture">
+                <pic:pic xmlns:pic="http://schemas.openxmlformats.org/drawingml/2006/picture">
+                  <pic:nvPicPr>
+                    <pic:cNvPr id="0" name="Picture 7"/>
+                    <pic:cNvPicPr>
+                      <a:picLocks noChangeAspect="1" noChangeArrowheads="1"/>
+                    </pic:cNvPicPr>
+                  </pic:nvPicPr>
+                  <pic:blipFill>
+                    <a:blip r:embed="rId109">
+                      <a:extLst>
+                        <a:ext uri="{28A0092B-C50C-407E-A947-70E740481C1C}">
+                          <a14:useLocalDpi xmlns:a14="http://schemas.microsoft.com/office/drawing/2010/main" val="0"/>
+                        </a:ext>
+                      </a:extLst>
+                    </a:blip>
+                    <a:srcRect/>
+                    <a:stretch>
+                      <a:fillRect/>
+                    </a:stretch>
+                  </pic:blipFill>
+                  <pic:spPr bwMode="auto">
+                    <a:xfrm>
+                      <a:off x="0" y="0"/>
+                      <a:ext cx="2893220" cy="2559435"/>
+                    </a:xfrm>
+                    <a:prstGeom prst="rect">
+                      <a:avLst/>
+                    </a:prstGeom>
+                    <a:noFill/>
+                  </pic:spPr>
+                </pic:pic>
+              </a:graphicData>
+            </a:graphic>
+          </wp:inline>
+        </w:drawing>
+      </w:r>
+      <w:r>
+        <w:t xml:space="preserve">   </w:t>
+      </w:r>
+      <w:r>
+        <w:rPr>
+          <w:noProof/>
+        </w:rPr>
+        <w:drawing>
+          <wp:inline distT="0" distB="0" distL="0" distR="0" wp14:anchorId="4F808C86">
+            <wp:extent cx="2293845" cy="2647950"/>
+            <wp:effectExtent l="0" t="0" r="0" b="0"/>
+            <wp:docPr id="105" name="Imagem 105"/>
+            <wp:cNvGraphicFramePr>
+              <a:graphicFrameLocks xmlns:a="http://schemas.openxmlformats.org/drawingml/2006/main" noChangeAspect="1"/>
+            </wp:cNvGraphicFramePr>
+            <a:graphic xmlns:a="http://schemas.openxmlformats.org/drawingml/2006/main">
+              <a:graphicData uri="http://schemas.openxmlformats.org/drawingml/2006/picture">
+                <pic:pic xmlns:pic="http://schemas.openxmlformats.org/drawingml/2006/picture">
+                  <pic:nvPicPr>
+                    <pic:cNvPr id="0" name="Picture 8"/>
+                    <pic:cNvPicPr>
+                      <a:picLocks noChangeAspect="1" noChangeArrowheads="1"/>
+                    </pic:cNvPicPr>
+                  </pic:nvPicPr>
+                  <pic:blipFill>
+                    <a:blip r:embed="rId110">
+                      <a:extLst>
+                        <a:ext uri="{28A0092B-C50C-407E-A947-70E740481C1C}">
+                          <a14:useLocalDpi xmlns:a14="http://schemas.microsoft.com/office/drawing/2010/main" val="0"/>
+                        </a:ext>
+                      </a:extLst>
+                    </a:blip>
+                    <a:srcRect/>
+                    <a:stretch>
+                      <a:fillRect/>
+                    </a:stretch>
+                  </pic:blipFill>
+                  <pic:spPr bwMode="auto">
+                    <a:xfrm>
+                      <a:off x="0" y="0"/>
+                      <a:ext cx="2321178" cy="2679502"/>
+                    </a:xfrm>
+                    <a:prstGeom prst="rect">
+                      <a:avLst/>
+                    </a:prstGeom>
+                    <a:noFill/>
+                  </pic:spPr>
+                </pic:pic>
+              </a:graphicData>
+            </a:graphic>
+          </wp:inline>
+        </w:drawing>
+      </w:r>
+    </w:p>
+    <w:p>
+      <w:pPr>
+        <w:jc w:val="both"/>
+      </w:pPr>
+      <w:r>
+        <w:t xml:space="preserve"> </w:t>
+      </w:r>
+      <w:r>
+        <w:t xml:space="preserve">                                                                                    </w:t>
+      </w:r>
+    </w:p>
+    <w:p>
+      <w:pPr>
+        <w:jc w:val="both"/>
+      </w:pPr>
+      <w:r>
+        <w:t xml:space="preserve">66-Inserimos um paragrafo em cima da </w:t>
+      </w:r>
+      <w:proofErr w:type="spellStart"/>
+      <w:proofErr w:type="gramStart"/>
+      <w:r>
+        <w:t>label</w:t>
+      </w:r>
+      <w:proofErr w:type="spellEnd"/>
+      <w:r>
+        <w:t xml:space="preserve">  radio</w:t>
+      </w:r>
+      <w:proofErr w:type="gramEnd"/>
+      <w:r>
+        <w:t>-box telefone.</w:t>
+      </w:r>
+      <w:r>
+        <w:t xml:space="preserve">  </w:t>
+      </w:r>
+    </w:p>
+    <w:p>
+      <w:pPr>
+        <w:jc w:val="both"/>
+      </w:pPr>
+    </w:p>
+    <w:p>
+      <w:pPr>
+        <w:jc w:val="both"/>
+      </w:pPr>
+      <w:r>
+        <w:t xml:space="preserve">  </w:t>
+      </w:r>
+      <w:r>
+        <w:rPr>
+          <w:noProof/>
+        </w:rPr>
+        <w:drawing>
+          <wp:inline distT="0" distB="0" distL="0" distR="0" wp14:anchorId="508656E9">
+            <wp:extent cx="4039235" cy="619125"/>
+            <wp:effectExtent l="0" t="0" r="0" b="9525"/>
+            <wp:docPr id="106" name="Imagem 106"/>
+            <wp:cNvGraphicFramePr>
+              <a:graphicFrameLocks xmlns:a="http://schemas.openxmlformats.org/drawingml/2006/main" noChangeAspect="1"/>
+            </wp:cNvGraphicFramePr>
+            <a:graphic xmlns:a="http://schemas.openxmlformats.org/drawingml/2006/main">
+              <a:graphicData uri="http://schemas.openxmlformats.org/drawingml/2006/picture">
+                <pic:pic xmlns:pic="http://schemas.openxmlformats.org/drawingml/2006/picture">
+                  <pic:nvPicPr>
+                    <pic:cNvPr id="0" name="Picture 9"/>
+                    <pic:cNvPicPr>
+                      <a:picLocks noChangeAspect="1" noChangeArrowheads="1"/>
+                    </pic:cNvPicPr>
+                  </pic:nvPicPr>
+                  <pic:blipFill>
+                    <a:blip r:embed="rId111">
+                      <a:extLst>
+                        <a:ext uri="{28A0092B-C50C-407E-A947-70E740481C1C}">
+                          <a14:useLocalDpi xmlns:a14="http://schemas.microsoft.com/office/drawing/2010/main" val="0"/>
+                        </a:ext>
+                      </a:extLst>
+                    </a:blip>
+                    <a:srcRect/>
+                    <a:stretch>
+                      <a:fillRect/>
+                    </a:stretch>
+                  </pic:blipFill>
+                  <pic:spPr bwMode="auto">
+                    <a:xfrm>
+                      <a:off x="0" y="0"/>
+                      <a:ext cx="4039235" cy="619125"/>
+                    </a:xfrm>
+                    <a:prstGeom prst="rect">
+                      <a:avLst/>
+                    </a:prstGeom>
+                    <a:noFill/>
+                  </pic:spPr>
+                </pic:pic>
+              </a:graphicData>
+            </a:graphic>
+          </wp:inline>
+        </w:drawing>
+      </w:r>
+      <w:r>
+        <w:t xml:space="preserve">  </w:t>
+      </w:r>
+    </w:p>
+    <w:p>
+      <w:pPr>
+        <w:jc w:val="both"/>
+      </w:pPr>
+      <w:r>
+        <w:t>67-</w:t>
+      </w:r>
+      <w:r>
+        <w:t xml:space="preserve"> Adicionamos uma </w:t>
+      </w:r>
+      <w:proofErr w:type="spellStart"/>
+      <w:r>
+        <w:t>div</w:t>
+      </w:r>
+      <w:proofErr w:type="spellEnd"/>
+      <w:r>
+        <w:t xml:space="preserve"> envolvendo o parágrafo como prefere o nosso contato </w:t>
+      </w:r>
+    </w:p>
+    <w:p>
+      <w:pPr>
+        <w:jc w:val="both"/>
+      </w:pPr>
+      <w:r>
+        <w:t xml:space="preserve">       </w:t>
+      </w:r>
+      <w:r>
+        <w:drawing>
+          <wp:inline distT="0" distB="0" distL="0" distR="0" wp14:anchorId="71230F6D" wp14:editId="74EE8907">
+            <wp:extent cx="4115374" cy="1914792"/>
+            <wp:effectExtent l="0" t="0" r="0" b="9525"/>
+            <wp:docPr id="107" name="Imagem 107"/>
+            <wp:cNvGraphicFramePr>
+              <a:graphicFrameLocks xmlns:a="http://schemas.openxmlformats.org/drawingml/2006/main" noChangeAspect="1"/>
+            </wp:cNvGraphicFramePr>
+            <a:graphic xmlns:a="http://schemas.openxmlformats.org/drawingml/2006/main">
+              <a:graphicData uri="http://schemas.openxmlformats.org/drawingml/2006/picture">
+                <pic:pic xmlns:pic="http://schemas.openxmlformats.org/drawingml/2006/picture">
+                  <pic:nvPicPr>
+                    <pic:cNvPr id="1" name=""/>
+                    <pic:cNvPicPr/>
+                  </pic:nvPicPr>
+                  <pic:blipFill>
+                    <a:blip r:embed="rId112"/>
+                    <a:stretch>
+                      <a:fillRect/>
+                    </a:stretch>
+                  </pic:blipFill>
+                  <pic:spPr>
+                    <a:xfrm>
+                      <a:off x="0" y="0"/>
+                      <a:ext cx="4115374" cy="1914792"/>
+                    </a:xfrm>
+                    <a:prstGeom prst="rect">
+                      <a:avLst/>
+                    </a:prstGeom>
+                  </pic:spPr>
+                </pic:pic>
+              </a:graphicData>
+            </a:graphic>
+          </wp:inline>
+        </w:drawing>
+      </w:r>
+      <w:r>
+        <w:t xml:space="preserve">       </w:t>
+      </w:r>
+    </w:p>
+    <w:p>
+      <w:pPr>
+        <w:jc w:val="both"/>
+      </w:pPr>
+    </w:p>
+    <w:p>
+      <w:pPr>
+        <w:jc w:val="both"/>
+      </w:pPr>
+      <w:r>
+        <w:t xml:space="preserve">68-Posterior adicionamos um </w:t>
+      </w:r>
+      <w:proofErr w:type="spellStart"/>
+      <w:r>
+        <w:t>label</w:t>
+      </w:r>
+      <w:proofErr w:type="spellEnd"/>
+      <w:r>
+        <w:t xml:space="preserve"> com inputs </w:t>
+      </w:r>
+      <w:proofErr w:type="spellStart"/>
+      <w:r>
+        <w:t>checkbox</w:t>
+      </w:r>
+      <w:proofErr w:type="spellEnd"/>
+      <w:r>
+        <w:t>.</w:t>
+      </w:r>
+    </w:p>
+    <w:p>
+      <w:pPr>
+        <w:jc w:val="both"/>
+      </w:pPr>
+    </w:p>
+    <w:p>
+      <w:pPr>
+        <w:jc w:val="both"/>
+      </w:pPr>
+      <w:r>
+        <w:t xml:space="preserve">    </w:t>
+      </w:r>
+      <w:r>
+        <w:rPr>
+          <w:noProof/>
+        </w:rPr>
+        <w:drawing>
+          <wp:inline distT="0" distB="0" distL="0" distR="0" wp14:anchorId="0F9E3272">
+            <wp:extent cx="3688210" cy="485775"/>
+            <wp:effectExtent l="0" t="0" r="7620" b="0"/>
+            <wp:docPr id="108" name="Imagem 108"/>
+            <wp:cNvGraphicFramePr>
+              <a:graphicFrameLocks xmlns:a="http://schemas.openxmlformats.org/drawingml/2006/main" noChangeAspect="1"/>
+            </wp:cNvGraphicFramePr>
+            <a:graphic xmlns:a="http://schemas.openxmlformats.org/drawingml/2006/main">
+              <a:graphicData uri="http://schemas.openxmlformats.org/drawingml/2006/picture">
+                <pic:pic xmlns:pic="http://schemas.openxmlformats.org/drawingml/2006/picture">
+                  <pic:nvPicPr>
+                    <pic:cNvPr id="0" name="Picture 10"/>
+                    <pic:cNvPicPr>
+                      <a:picLocks noChangeAspect="1" noChangeArrowheads="1"/>
+                    </pic:cNvPicPr>
+                  </pic:nvPicPr>
+                  <pic:blipFill>
+                    <a:blip r:embed="rId113">
+                      <a:extLst>
+                        <a:ext uri="{28A0092B-C50C-407E-A947-70E740481C1C}">
+                          <a14:useLocalDpi xmlns:a14="http://schemas.microsoft.com/office/drawing/2010/main" val="0"/>
+                        </a:ext>
+                      </a:extLst>
+                    </a:blip>
+                    <a:srcRect/>
+                    <a:stretch>
+                      <a:fillRect/>
+                    </a:stretch>
+                  </pic:blipFill>
+                  <pic:spPr bwMode="auto">
+                    <a:xfrm>
+                      <a:off x="0" y="0"/>
+                      <a:ext cx="3709832" cy="488623"/>
+                    </a:xfrm>
+                    <a:prstGeom prst="rect">
+                      <a:avLst/>
+                    </a:prstGeom>
+                    <a:noFill/>
+                  </pic:spPr>
+                </pic:pic>
+              </a:graphicData>
+            </a:graphic>
+          </wp:inline>
+        </w:drawing>
+      </w:r>
+      <w:r>
+        <w:t xml:space="preserve">   </w:t>
+      </w:r>
+    </w:p>
+    <w:p>
+      <w:pPr>
+        <w:jc w:val="both"/>
+      </w:pPr>
+      <w:r>
+        <w:t xml:space="preserve">69-Para colocar os inputs radio-box e </w:t>
+      </w:r>
+      <w:proofErr w:type="spellStart"/>
+      <w:r>
+        <w:t>checkbox</w:t>
+      </w:r>
+      <w:proofErr w:type="spellEnd"/>
+      <w:r>
+        <w:t xml:space="preserve"> ao lado da </w:t>
+      </w:r>
+      <w:proofErr w:type="spellStart"/>
+      <w:r>
+        <w:t>label</w:t>
+      </w:r>
+      <w:proofErr w:type="spellEnd"/>
+      <w:r>
+        <w:t xml:space="preserve"> precisamos adicionamos os inputs dentro da </w:t>
+      </w:r>
+      <w:proofErr w:type="spellStart"/>
+      <w:r>
+        <w:t>label</w:t>
+      </w:r>
+      <w:proofErr w:type="spellEnd"/>
+      <w:r>
+        <w:t xml:space="preserve"> conforme imagem abaixo.</w:t>
+      </w:r>
+    </w:p>
+    <w:p>
+      <w:pPr>
+        <w:jc w:val="both"/>
+      </w:pPr>
+      <w:r>
+        <w:t xml:space="preserve">      </w:t>
+      </w:r>
+      <w:r>
+        <w:drawing>
+          <wp:inline distT="0" distB="0" distL="0" distR="0" wp14:anchorId="1BEC0726" wp14:editId="7E4B899F">
+            <wp:extent cx="5400040" cy="1494155"/>
+            <wp:effectExtent l="0" t="0" r="0" b="0"/>
+            <wp:docPr id="109" name="Imagem 109"/>
+            <wp:cNvGraphicFramePr>
+              <a:graphicFrameLocks xmlns:a="http://schemas.openxmlformats.org/drawingml/2006/main" noChangeAspect="1"/>
+            </wp:cNvGraphicFramePr>
+            <a:graphic xmlns:a="http://schemas.openxmlformats.org/drawingml/2006/main">
+              <a:graphicData uri="http://schemas.openxmlformats.org/drawingml/2006/picture">
+                <pic:pic xmlns:pic="http://schemas.openxmlformats.org/drawingml/2006/picture">
+                  <pic:nvPicPr>
+                    <pic:cNvPr id="1" name=""/>
+                    <pic:cNvPicPr/>
+                  </pic:nvPicPr>
+                  <pic:blipFill>
+                    <a:blip r:embed="rId114"/>
+                    <a:stretch>
+                      <a:fillRect/>
+                    </a:stretch>
+                  </pic:blipFill>
+                  <pic:spPr>
+                    <a:xfrm>
+                      <a:off x="0" y="0"/>
+                      <a:ext cx="5400040" cy="1494155"/>
+                    </a:xfrm>
+                    <a:prstGeom prst="rect">
+                      <a:avLst/>
+                    </a:prstGeom>
+                  </pic:spPr>
+                </pic:pic>
+              </a:graphicData>
+            </a:graphic>
+          </wp:inline>
+        </w:drawing>
+      </w:r>
+      <w:r>
+        <w:t xml:space="preserve"> </w:t>
+      </w:r>
+    </w:p>
+    <w:p>
+      <w:pPr>
+        <w:jc w:val="both"/>
+      </w:pPr>
+      <w:r>
+        <w:rPr>
+          <w:noProof/>
+        </w:rPr>
+        <w:drawing>
+          <wp:inline distT="0" distB="0" distL="0" distR="0" wp14:anchorId="05F45842">
+            <wp:extent cx="2850277" cy="1419225"/>
+            <wp:effectExtent l="0" t="0" r="7620" b="0"/>
+            <wp:docPr id="110" name="Imagem 110"/>
+            <wp:cNvGraphicFramePr>
+              <a:graphicFrameLocks xmlns:a="http://schemas.openxmlformats.org/drawingml/2006/main" noChangeAspect="1"/>
+            </wp:cNvGraphicFramePr>
+            <a:graphic xmlns:a="http://schemas.openxmlformats.org/drawingml/2006/main">
+              <a:graphicData uri="http://schemas.openxmlformats.org/drawingml/2006/picture">
+                <pic:pic xmlns:pic="http://schemas.openxmlformats.org/drawingml/2006/picture">
+                  <pic:nvPicPr>
+                    <pic:cNvPr id="0" name="Picture 11"/>
+                    <pic:cNvPicPr>
+                      <a:picLocks noChangeAspect="1" noChangeArrowheads="1"/>
+                    </pic:cNvPicPr>
+                  </pic:nvPicPr>
+                  <pic:blipFill>
+                    <a:blip r:embed="rId115">
+                      <a:extLst>
+                        <a:ext uri="{28A0092B-C50C-407E-A947-70E740481C1C}">
+                          <a14:useLocalDpi xmlns:a14="http://schemas.microsoft.com/office/drawing/2010/main" val="0"/>
+                        </a:ext>
+                      </a:extLst>
+                    </a:blip>
+                    <a:srcRect/>
+                    <a:stretch>
+                      <a:fillRect/>
+                    </a:stretch>
+                  </pic:blipFill>
+                  <pic:spPr bwMode="auto">
+                    <a:xfrm>
+                      <a:off x="0" y="0"/>
+                      <a:ext cx="2852447" cy="1420306"/>
+                    </a:xfrm>
+                    <a:prstGeom prst="rect">
+                      <a:avLst/>
+                    </a:prstGeom>
+                    <a:noFill/>
+                  </pic:spPr>
+                </pic:pic>
+              </a:graphicData>
+            </a:graphic>
+          </wp:inline>
+        </w:drawing>
+      </w:r>
+    </w:p>
+    <w:p>
+      <w:pPr>
+        <w:jc w:val="both"/>
+      </w:pPr>
+      <w:r>
+        <w:t xml:space="preserve">70-Notamos que em nosso caso </w:t>
+      </w:r>
+      <w:r>
+        <w:t xml:space="preserve">o </w:t>
+      </w:r>
+      <w:proofErr w:type="spellStart"/>
+      <w:r>
+        <w:t>form</w:t>
+      </w:r>
+      <w:proofErr w:type="spellEnd"/>
+      <w:r>
+        <w:t xml:space="preserve"> inputs estava configurando como display: </w:t>
+      </w:r>
+      <w:proofErr w:type="spellStart"/>
+      <w:r>
+        <w:t>block</w:t>
+      </w:r>
+      <w:proofErr w:type="spellEnd"/>
+      <w:r>
+        <w:t xml:space="preserve"> impedido que as </w:t>
+      </w:r>
+      <w:proofErr w:type="spellStart"/>
+      <w:r>
+        <w:t>label</w:t>
+      </w:r>
+      <w:proofErr w:type="spellEnd"/>
+      <w:r>
+        <w:t xml:space="preserve"> e os inputs de ficarem um ao lado do outro. Para resolver essa situação mudamos onde antigamente era </w:t>
+      </w:r>
+      <w:proofErr w:type="spellStart"/>
+      <w:r>
+        <w:t>form</w:t>
+      </w:r>
+      <w:proofErr w:type="spellEnd"/>
+      <w:r>
+        <w:t xml:space="preserve"> inputs  trocamos para uma </w:t>
+      </w:r>
+      <w:proofErr w:type="spellStart"/>
+      <w:r>
+        <w:t>class</w:t>
+      </w:r>
+      <w:proofErr w:type="spellEnd"/>
+      <w:r>
+        <w:t xml:space="preserve"> inputs-padrão e adicionamos nos inputs os quais queríamos que ficassem um a baixo do outro.</w:t>
+      </w:r>
+      <w:bookmarkStart w:id="0" w:name="_GoBack"/>
+      <w:bookmarkEnd w:id="0"/>
+      <w:r>
+        <w:t xml:space="preserve"> </w:t>
+      </w:r>
+    </w:p>
+    <w:p>
+      <w:pPr>
+        <w:jc w:val="both"/>
+      </w:pPr>
+      <w:r>
+        <w:t xml:space="preserve">  </w:t>
+      </w:r>
+    </w:p>
+    <w:p>
+      <w:pPr>
+        <w:jc w:val="both"/>
+      </w:pPr>
+      <w:r>
+        <w:t xml:space="preserve">                                                                                                                                                                                                                                                                                                                                                                                                                                                                                                                                                                                                                                       </w:t>
       </w:r>
     </w:p>
     <w:sectPr>
@@ -8355,7 +9334,7 @@
 </file>
 
 <file path=customXml/itemProps1.xml><?xml version="1.0" encoding="utf-8"?>
-<ds:datastoreItem xmlns:ds="http://schemas.openxmlformats.org/officeDocument/2006/customXml" ds:itemID="{6FB9FFB4-B566-4738-9DF6-87F5B3BFB8DD}">
+<ds:datastoreItem xmlns:ds="http://schemas.openxmlformats.org/officeDocument/2006/customXml" ds:itemID="{1DAF2786-60C3-4723-9887-945FD466B3CE}">
   <ds:schemaRefs>
     <ds:schemaRef ds:uri="http://schemas.openxmlformats.org/officeDocument/2006/bibliography"/>
   </ds:schemaRefs>

</xml_diff>

<commit_message>
atualização da aula 24/09/2026
</commit_message>
<xml_diff>
--- a/Apostila/Projeto Space for Men.docx
+++ b/Apostila/Projeto Space for Men.docx
@@ -8355,6 +8355,9 @@
         <w:jc w:val="both"/>
       </w:pPr>
       <w:r>
+        <w:rPr>
+          <w:noProof/>
+        </w:rPr>
         <w:drawing>
           <wp:inline distT="0" distB="0" distL="0" distR="0" wp14:anchorId="409EFC5E" wp14:editId="10AAA518">
             <wp:extent cx="3982006" cy="1438476"/>
@@ -8607,6 +8610,9 @@
         <w:jc w:val="both"/>
       </w:pPr>
       <w:r>
+        <w:rPr>
+          <w:noProof/>
+        </w:rPr>
         <w:drawing>
           <wp:inline distT="0" distB="0" distL="0" distR="0" wp14:anchorId="762E8923" wp14:editId="0096B86F">
             <wp:extent cx="2762636" cy="1276528"/>
@@ -9178,6 +9184,9 @@
         <w:t xml:space="preserve">        </w:t>
       </w:r>
       <w:r>
+        <w:rPr>
+          <w:noProof/>
+        </w:rPr>
         <w:drawing>
           <wp:inline distT="0" distB="0" distL="0" distR="0" wp14:anchorId="68208C0D" wp14:editId="21670635">
             <wp:extent cx="3385820" cy="2714625"/>
@@ -9546,8 +9555,6 @@
         <w:pStyle w:val="PargrafodaLista"/>
         <w:jc w:val="both"/>
       </w:pPr>
-      <w:bookmarkStart w:id="0" w:name="_GoBack"/>
-      <w:bookmarkEnd w:id="0"/>
     </w:p>
     <w:p>
       <w:pPr>
@@ -9607,7 +9614,401 @@
         </w:drawing>
       </w:r>
       <w:r>
-        <w:t xml:space="preserve">                                                                                                                                                                                                                                                                                                                                                                                                                                                                                                                                                      </w:t>
+        <w:t xml:space="preserve">               </w:t>
+      </w:r>
+    </w:p>
+    <w:p>
+      <w:pPr>
+        <w:jc w:val="both"/>
+      </w:pPr>
+    </w:p>
+    <w:p>
+      <w:pPr>
+        <w:jc w:val="both"/>
+      </w:pPr>
+      <w:r>
+        <w:t xml:space="preserve">79-Trabalhando com </w:t>
+      </w:r>
+      <w:proofErr w:type="spellStart"/>
+      <w:r>
+        <w:t>hover</w:t>
+      </w:r>
+      <w:proofErr w:type="spellEnd"/>
+      <w:r>
+        <w:t xml:space="preserve"> no botão enviar mudamos a cor de fundo ao passar do mouse utilizando background-color, e também criamos uma animação com </w:t>
+      </w:r>
+      <w:proofErr w:type="spellStart"/>
+      <w:r>
+        <w:t>transform</w:t>
+      </w:r>
+      <w:proofErr w:type="spellEnd"/>
+      <w:r>
+        <w:t xml:space="preserve"> </w:t>
+      </w:r>
+      <w:proofErr w:type="spellStart"/>
+      <w:r>
+        <w:t>rotate</w:t>
+      </w:r>
+      <w:proofErr w:type="spellEnd"/>
+      <w:r>
+        <w:t xml:space="preserve"> e </w:t>
+      </w:r>
+      <w:proofErr w:type="spellStart"/>
+      <w:r>
+        <w:t>scale</w:t>
+      </w:r>
+      <w:proofErr w:type="spellEnd"/>
+      <w:r>
+        <w:t xml:space="preserve"> que ao passar o mouse ele realiza uma rotação e o </w:t>
+      </w:r>
+      <w:proofErr w:type="spellStart"/>
+      <w:r>
+        <w:t>scale</w:t>
+      </w:r>
+      <w:proofErr w:type="spellEnd"/>
+      <w:r>
+        <w:t xml:space="preserve"> aumenta o tamanho do botão</w:t>
+      </w:r>
+    </w:p>
+    <w:p>
+      <w:pPr>
+        <w:jc w:val="both"/>
+      </w:pPr>
+      <w:proofErr w:type="spellStart"/>
+      <w:r>
+        <w:t>Obs</w:t>
+      </w:r>
+      <w:proofErr w:type="spellEnd"/>
+      <w:r>
+        <w:t xml:space="preserve">- Não podemos deixar de esquecer de colocar uma </w:t>
+      </w:r>
+      <w:proofErr w:type="spellStart"/>
+      <w:r>
+        <w:t>transition</w:t>
+      </w:r>
+      <w:proofErr w:type="spellEnd"/>
+      <w:r>
+        <w:t xml:space="preserve"> na </w:t>
+      </w:r>
+      <w:proofErr w:type="spellStart"/>
+      <w:r>
+        <w:t>class</w:t>
+      </w:r>
+      <w:proofErr w:type="spellEnd"/>
+      <w:r>
+        <w:t xml:space="preserve"> enviar para controlar o tempo da animação.</w:t>
+      </w:r>
+    </w:p>
+    <w:p>
+      <w:pPr>
+        <w:jc w:val="both"/>
+      </w:pPr>
+      <w:r>
+        <w:t xml:space="preserve">  </w:t>
+      </w:r>
+      <w:r>
+        <w:t xml:space="preserve">    </w:t>
+      </w:r>
+      <w:r>
+        <w:drawing>
+          <wp:inline distT="0" distB="0" distL="0" distR="0" wp14:anchorId="041E791C" wp14:editId="1938B497">
+            <wp:extent cx="2314898" cy="2086266"/>
+            <wp:effectExtent l="0" t="0" r="9525" b="9525"/>
+            <wp:docPr id="124" name="Imagem 124"/>
+            <wp:cNvGraphicFramePr>
+              <a:graphicFrameLocks xmlns:a="http://schemas.openxmlformats.org/drawingml/2006/main" noChangeAspect="1"/>
+            </wp:cNvGraphicFramePr>
+            <a:graphic xmlns:a="http://schemas.openxmlformats.org/drawingml/2006/main">
+              <a:graphicData uri="http://schemas.openxmlformats.org/drawingml/2006/picture">
+                <pic:pic xmlns:pic="http://schemas.openxmlformats.org/drawingml/2006/picture">
+                  <pic:nvPicPr>
+                    <pic:cNvPr id="1" name=""/>
+                    <pic:cNvPicPr/>
+                  </pic:nvPicPr>
+                  <pic:blipFill>
+                    <a:blip r:embed="rId130"/>
+                    <a:stretch>
+                      <a:fillRect/>
+                    </a:stretch>
+                  </pic:blipFill>
+                  <pic:spPr>
+                    <a:xfrm>
+                      <a:off x="0" y="0"/>
+                      <a:ext cx="2314898" cy="2086266"/>
+                    </a:xfrm>
+                    <a:prstGeom prst="rect">
+                      <a:avLst/>
+                    </a:prstGeom>
+                  </pic:spPr>
+                </pic:pic>
+              </a:graphicData>
+            </a:graphic>
+          </wp:inline>
+        </w:drawing>
+      </w:r>
+      <w:r>
+        <w:t xml:space="preserve">    </w:t>
+      </w:r>
+    </w:p>
+    <w:p>
+      <w:pPr>
+        <w:jc w:val="both"/>
+      </w:pPr>
+    </w:p>
+    <w:p>
+      <w:pPr>
+        <w:jc w:val="both"/>
+      </w:pPr>
+    </w:p>
+    <w:p>
+      <w:pPr>
+        <w:jc w:val="both"/>
+      </w:pPr>
+    </w:p>
+    <w:p>
+      <w:pPr>
+        <w:jc w:val="both"/>
+      </w:pPr>
+    </w:p>
+    <w:p>
+      <w:pPr>
+        <w:jc w:val="both"/>
+      </w:pPr>
+    </w:p>
+    <w:p>
+      <w:pPr>
+        <w:jc w:val="both"/>
+      </w:pPr>
+    </w:p>
+    <w:p>
+      <w:pPr>
+        <w:jc w:val="both"/>
+      </w:pPr>
+      <w:r>
+        <w:t>80-</w:t>
+      </w:r>
+      <w:r>
+        <w:t xml:space="preserve">Na </w:t>
+      </w:r>
+      <w:proofErr w:type="spellStart"/>
+      <w:r>
+        <w:t>pagina</w:t>
+      </w:r>
+      <w:proofErr w:type="spellEnd"/>
+      <w:r>
+        <w:t xml:space="preserve"> de contato adicionamos uma tabela onde iniciamos utilizando as </w:t>
+      </w:r>
+      <w:proofErr w:type="spellStart"/>
+      <w:r>
+        <w:t>tags</w:t>
+      </w:r>
+      <w:proofErr w:type="spellEnd"/>
+      <w:r>
+        <w:t xml:space="preserve"> TR -&gt;linha da tabela e as </w:t>
+      </w:r>
+      <w:proofErr w:type="spellStart"/>
+      <w:r>
+        <w:t>tags</w:t>
+      </w:r>
+      <w:proofErr w:type="spellEnd"/>
+      <w:r>
+        <w:t xml:space="preserve"> TD -&gt;dados da tabela conforme código abaixo</w:t>
+      </w:r>
+    </w:p>
+    <w:p>
+      <w:pPr>
+        <w:jc w:val="both"/>
+      </w:pPr>
+      <w:r>
+        <w:rPr>
+          <w:noProof/>
+        </w:rPr>
+        <w:drawing>
+          <wp:inline distT="0" distB="0" distL="0" distR="0" wp14:anchorId="79CCB0F4">
+            <wp:extent cx="2076450" cy="3562985"/>
+            <wp:effectExtent l="0" t="0" r="0" b="0"/>
+            <wp:docPr id="126" name="Imagem 126"/>
+            <wp:cNvGraphicFramePr>
+              <a:graphicFrameLocks xmlns:a="http://schemas.openxmlformats.org/drawingml/2006/main" noChangeAspect="1"/>
+            </wp:cNvGraphicFramePr>
+            <a:graphic xmlns:a="http://schemas.openxmlformats.org/drawingml/2006/main">
+              <a:graphicData uri="http://schemas.openxmlformats.org/drawingml/2006/picture">
+                <pic:pic xmlns:pic="http://schemas.openxmlformats.org/drawingml/2006/picture">
+                  <pic:nvPicPr>
+                    <pic:cNvPr id="0" name="Picture 2"/>
+                    <pic:cNvPicPr>
+                      <a:picLocks noChangeAspect="1" noChangeArrowheads="1"/>
+                    </pic:cNvPicPr>
+                  </pic:nvPicPr>
+                  <pic:blipFill>
+                    <a:blip r:embed="rId131">
+                      <a:extLst>
+                        <a:ext uri="{28A0092B-C50C-407E-A947-70E740481C1C}">
+                          <a14:useLocalDpi xmlns:a14="http://schemas.microsoft.com/office/drawing/2010/main" val="0"/>
+                        </a:ext>
+                      </a:extLst>
+                    </a:blip>
+                    <a:srcRect/>
+                    <a:stretch>
+                      <a:fillRect/>
+                    </a:stretch>
+                  </pic:blipFill>
+                  <pic:spPr bwMode="auto">
+                    <a:xfrm>
+                      <a:off x="0" y="0"/>
+                      <a:ext cx="2076450" cy="3562985"/>
+                    </a:xfrm>
+                    <a:prstGeom prst="rect">
+                      <a:avLst/>
+                    </a:prstGeom>
+                    <a:noFill/>
+                  </pic:spPr>
+                </pic:pic>
+              </a:graphicData>
+            </a:graphic>
+          </wp:inline>
+        </w:drawing>
+      </w:r>
+    </w:p>
+    <w:p>
+      <w:pPr>
+        <w:jc w:val="both"/>
+      </w:pPr>
+    </w:p>
+    <w:p>
+      <w:pPr>
+        <w:jc w:val="both"/>
+      </w:pPr>
+      <w:r>
+        <w:t>81-</w:t>
+      </w:r>
+      <w:r>
+        <w:t xml:space="preserve">Na tabela adicionamos o </w:t>
+      </w:r>
+      <w:proofErr w:type="spellStart"/>
+      <w:r>
+        <w:t>thead</w:t>
+      </w:r>
+      <w:proofErr w:type="spellEnd"/>
+      <w:r>
+        <w:t xml:space="preserve"> -&gt; o cabeçalho da tabela e </w:t>
+      </w:r>
+      <w:proofErr w:type="spellStart"/>
+      <w:r>
+        <w:t>th</w:t>
+      </w:r>
+      <w:proofErr w:type="spellEnd"/>
+      <w:r>
+        <w:t xml:space="preserve"> -&gt; dados do cabeçalho e </w:t>
+      </w:r>
+      <w:proofErr w:type="spellStart"/>
+      <w:r>
+        <w:t>tbody</w:t>
+      </w:r>
+      <w:proofErr w:type="spellEnd"/>
+      <w:r>
+        <w:t xml:space="preserve"> -&gt; o corpo da tabela.</w:t>
+      </w:r>
+    </w:p>
+    <w:p>
+      <w:pPr>
+        <w:jc w:val="both"/>
+      </w:pPr>
+      <w:r>
+        <w:drawing>
+          <wp:inline distT="0" distB="0" distL="0" distR="0" wp14:anchorId="4ED56050" wp14:editId="6405CA98">
+            <wp:extent cx="1995469" cy="3648075"/>
+            <wp:effectExtent l="0" t="0" r="5080" b="0"/>
+            <wp:docPr id="127" name="Imagem 127"/>
+            <wp:cNvGraphicFramePr>
+              <a:graphicFrameLocks xmlns:a="http://schemas.openxmlformats.org/drawingml/2006/main" noChangeAspect="1"/>
+            </wp:cNvGraphicFramePr>
+            <a:graphic xmlns:a="http://schemas.openxmlformats.org/drawingml/2006/main">
+              <a:graphicData uri="http://schemas.openxmlformats.org/drawingml/2006/picture">
+                <pic:pic xmlns:pic="http://schemas.openxmlformats.org/drawingml/2006/picture">
+                  <pic:nvPicPr>
+                    <pic:cNvPr id="1" name=""/>
+                    <pic:cNvPicPr/>
+                  </pic:nvPicPr>
+                  <pic:blipFill>
+                    <a:blip r:embed="rId132"/>
+                    <a:stretch>
+                      <a:fillRect/>
+                    </a:stretch>
+                  </pic:blipFill>
+                  <pic:spPr>
+                    <a:xfrm>
+                      <a:off x="0" y="0"/>
+                      <a:ext cx="2017621" cy="3688573"/>
+                    </a:xfrm>
+                    <a:prstGeom prst="rect">
+                      <a:avLst/>
+                    </a:prstGeom>
+                  </pic:spPr>
+                </pic:pic>
+              </a:graphicData>
+            </a:graphic>
+          </wp:inline>
+        </w:drawing>
+      </w:r>
+    </w:p>
+    <w:p>
+      <w:pPr>
+        <w:jc w:val="both"/>
+      </w:pPr>
+      <w:r>
+        <w:t xml:space="preserve">                                                              </w:t>
+      </w:r>
+    </w:p>
+    <w:p>
+      <w:pPr>
+        <w:jc w:val="both"/>
+      </w:pPr>
+      <w:r>
+        <w:t>82-</w:t>
+      </w:r>
+      <w:proofErr w:type="gramStart"/>
+      <w:r>
+        <w:t>adiciona</w:t>
+      </w:r>
+      <w:r>
+        <w:t>ei</w:t>
+      </w:r>
+      <w:proofErr w:type="gramEnd"/>
+      <w:r>
+        <w:t xml:space="preserve"> uma cor de fundo no cabeçalho da tabela, mudamos a cor da letra para branco e </w:t>
+      </w:r>
+      <w:proofErr w:type="spellStart"/>
+      <w:r>
+        <w:t>encorporamos</w:t>
+      </w:r>
+      <w:proofErr w:type="spellEnd"/>
+      <w:r>
+        <w:t xml:space="preserve"> o texto.</w:t>
+      </w:r>
+    </w:p>
+    <w:p>
+      <w:pPr>
+        <w:jc w:val="both"/>
+      </w:pPr>
+      <w:r>
+        <w:t xml:space="preserve">No </w:t>
+      </w:r>
+      <w:proofErr w:type="spellStart"/>
+      <w:r>
+        <w:t>td,th</w:t>
+      </w:r>
+      <w:proofErr w:type="spellEnd"/>
+      <w:r>
+        <w:t xml:space="preserve"> -&gt;Inserimos uma borda solida e aumentamos o espaço interno tanto para cima como para baixo e do lado direito e esquerdo </w:t>
+      </w:r>
+      <w:bookmarkStart w:id="0" w:name="_GoBack"/>
+      <w:bookmarkEnd w:id="0"/>
+      <w:r>
+        <w:t xml:space="preserve"> </w:t>
+      </w:r>
+      <w:r>
+        <w:t xml:space="preserve">                                                                                                                                                                                                                                                                                                                                                                                                                                                               </w:t>
       </w:r>
     </w:p>
     <w:sectPr>
@@ -10593,7 +10994,7 @@
 </file>
 
 <file path=customXml/itemProps1.xml><?xml version="1.0" encoding="utf-8"?>
-<ds:datastoreItem xmlns:ds="http://schemas.openxmlformats.org/officeDocument/2006/customXml" ds:itemID="{5498B00E-D6B3-4BE7-88BA-8C78521878FB}">
+<ds:datastoreItem xmlns:ds="http://schemas.openxmlformats.org/officeDocument/2006/customXml" ds:itemID="{37B6D4C3-DC46-4FCD-A7B7-64A671869D65}">
   <ds:schemaRefs>
     <ds:schemaRef ds:uri="http://schemas.openxmlformats.org/officeDocument/2006/bibliography"/>
   </ds:schemaRefs>

</xml_diff>

<commit_message>
atualização da aula 29/09/2026
</commit_message>
<xml_diff>
--- a/Apostila/Projeto Space for Men.docx
+++ b/Apostila/Projeto Space for Men.docx
@@ -9710,6 +9710,9 @@
         <w:t xml:space="preserve">    </w:t>
       </w:r>
       <w:r>
+        <w:rPr>
+          <w:noProof/>
+        </w:rPr>
         <w:drawing>
           <wp:inline distT="0" distB="0" distL="0" distR="0" wp14:anchorId="041E791C" wp14:editId="1938B497">
             <wp:extent cx="2314898" cy="2086266"/>
@@ -9915,6 +9918,9 @@
         <w:jc w:val="both"/>
       </w:pPr>
       <w:r>
+        <w:rPr>
+          <w:noProof/>
+        </w:rPr>
         <w:drawing>
           <wp:inline distT="0" distB="0" distL="0" distR="0" wp14:anchorId="4ED56050" wp14:editId="6405CA98">
             <wp:extent cx="1995469" cy="3648075"/>
@@ -9995,20 +10001,1167 @@
         <w:t xml:space="preserve">No </w:t>
       </w:r>
       <w:proofErr w:type="spellStart"/>
+      <w:proofErr w:type="gramStart"/>
       <w:r>
         <w:t>td,th</w:t>
       </w:r>
       <w:proofErr w:type="spellEnd"/>
-      <w:r>
-        <w:t xml:space="preserve"> -&gt;Inserimos uma borda solida e aumentamos o espaço interno tanto para cima como para baixo e do lado direito e esquerdo </w:t>
+      <w:proofErr w:type="gramEnd"/>
+      <w:r>
+        <w:t xml:space="preserve"> -&gt;Inserimos uma borda solida e aumentamos o espaço interno tanto para cima como para baixo e do lado direito e esquerdo  </w:t>
+      </w:r>
+      <w:r>
+        <w:t xml:space="preserve">                                      </w:t>
+      </w:r>
+    </w:p>
+    <w:p>
+      <w:pPr>
+        <w:jc w:val="both"/>
+      </w:pPr>
+      <w:r>
+        <w:t xml:space="preserve">   </w:t>
+      </w:r>
+      <w:r>
+        <w:rPr>
+          <w:noProof/>
+        </w:rPr>
+        <w:drawing>
+          <wp:inline distT="0" distB="0" distL="0" distR="0" wp14:anchorId="51AC0FBC" wp14:editId="7D301FC6">
+            <wp:extent cx="2390775" cy="1895769"/>
+            <wp:effectExtent l="0" t="0" r="0" b="9525"/>
+            <wp:docPr id="125" name="Imagem 125"/>
+            <wp:cNvGraphicFramePr>
+              <a:graphicFrameLocks xmlns:a="http://schemas.openxmlformats.org/drawingml/2006/main" noChangeAspect="1"/>
+            </wp:cNvGraphicFramePr>
+            <a:graphic xmlns:a="http://schemas.openxmlformats.org/drawingml/2006/main">
+              <a:graphicData uri="http://schemas.openxmlformats.org/drawingml/2006/picture">
+                <pic:pic xmlns:pic="http://schemas.openxmlformats.org/drawingml/2006/picture">
+                  <pic:nvPicPr>
+                    <pic:cNvPr id="1" name=""/>
+                    <pic:cNvPicPr/>
+                  </pic:nvPicPr>
+                  <pic:blipFill>
+                    <a:blip r:embed="rId133"/>
+                    <a:stretch>
+                      <a:fillRect/>
+                    </a:stretch>
+                  </pic:blipFill>
+                  <pic:spPr>
+                    <a:xfrm>
+                      <a:off x="0" y="0"/>
+                      <a:ext cx="2400358" cy="1903368"/>
+                    </a:xfrm>
+                    <a:prstGeom prst="rect">
+                      <a:avLst/>
+                    </a:prstGeom>
+                  </pic:spPr>
+                </pic:pic>
+              </a:graphicData>
+            </a:graphic>
+          </wp:inline>
+        </w:drawing>
+      </w:r>
+      <w:r>
+        <w:t xml:space="preserve">     </w:t>
+      </w:r>
+    </w:p>
+    <w:p>
+      <w:pPr>
+        <w:jc w:val="both"/>
+      </w:pPr>
+    </w:p>
+    <w:p>
+      <w:pPr>
+        <w:jc w:val="both"/>
+      </w:pPr>
+      <w:r>
+        <w:t xml:space="preserve">83-Trabalahando com a </w:t>
+      </w:r>
+      <w:proofErr w:type="spellStart"/>
+      <w:r>
+        <w:t>pagina</w:t>
+      </w:r>
+      <w:proofErr w:type="spellEnd"/>
+      <w:r>
+        <w:t xml:space="preserve"> do home copiamos o </w:t>
+      </w:r>
+      <w:proofErr w:type="spellStart"/>
+      <w:r>
+        <w:t>html</w:t>
+      </w:r>
+      <w:proofErr w:type="spellEnd"/>
+      <w:r>
+        <w:t xml:space="preserve"> </w:t>
+      </w:r>
+      <w:proofErr w:type="spellStart"/>
+      <w:r>
+        <w:t>fo</w:t>
+      </w:r>
+      <w:proofErr w:type="spellEnd"/>
+      <w:r>
+        <w:t xml:space="preserve"> header que nosso menu que já se encontrava pronto na outra </w:t>
+      </w:r>
+      <w:proofErr w:type="spellStart"/>
+      <w:r>
+        <w:t>pagina</w:t>
+      </w:r>
+      <w:proofErr w:type="spellEnd"/>
+      <w:r>
+        <w:t xml:space="preserve"> e o </w:t>
+      </w:r>
+      <w:proofErr w:type="spellStart"/>
+      <w:r>
+        <w:t>css</w:t>
+      </w:r>
+      <w:proofErr w:type="spellEnd"/>
+      <w:r>
+        <w:t xml:space="preserve"> da configuração do mesmo e colamos na nossa pagina do home e no style.css e repetimos o mesmo processo com </w:t>
+      </w:r>
+      <w:proofErr w:type="spellStart"/>
+      <w:r>
+        <w:t>footer</w:t>
+      </w:r>
+      <w:proofErr w:type="spellEnd"/>
+      <w:r>
+        <w:t xml:space="preserve"> com isso já ficou pronto o menu e nosso rodapé da pagina </w:t>
+      </w:r>
+    </w:p>
+    <w:p>
+      <w:pPr>
+        <w:jc w:val="both"/>
+      </w:pPr>
+      <w:r>
+        <w:t xml:space="preserve">            </w:t>
+      </w:r>
+      <w:r>
+        <w:rPr>
+          <w:noProof/>
+        </w:rPr>
+        <w:drawing>
+          <wp:inline distT="0" distB="0" distL="0" distR="0" wp14:anchorId="0EC1757D">
+            <wp:extent cx="3648710" cy="1990725"/>
+            <wp:effectExtent l="0" t="0" r="8890" b="9525"/>
+            <wp:docPr id="128" name="Imagem 128"/>
+            <wp:cNvGraphicFramePr>
+              <a:graphicFrameLocks xmlns:a="http://schemas.openxmlformats.org/drawingml/2006/main" noChangeAspect="1"/>
+            </wp:cNvGraphicFramePr>
+            <a:graphic xmlns:a="http://schemas.openxmlformats.org/drawingml/2006/main">
+              <a:graphicData uri="http://schemas.openxmlformats.org/drawingml/2006/picture">
+                <pic:pic xmlns:pic="http://schemas.openxmlformats.org/drawingml/2006/picture">
+                  <pic:nvPicPr>
+                    <pic:cNvPr id="0" name="Picture 2"/>
+                    <pic:cNvPicPr>
+                      <a:picLocks noChangeAspect="1" noChangeArrowheads="1"/>
+                    </pic:cNvPicPr>
+                  </pic:nvPicPr>
+                  <pic:blipFill>
+                    <a:blip r:embed="rId134">
+                      <a:extLst>
+                        <a:ext uri="{28A0092B-C50C-407E-A947-70E740481C1C}">
+                          <a14:useLocalDpi xmlns:a14="http://schemas.microsoft.com/office/drawing/2010/main" val="0"/>
+                        </a:ext>
+                      </a:extLst>
+                    </a:blip>
+                    <a:srcRect/>
+                    <a:stretch>
+                      <a:fillRect/>
+                    </a:stretch>
+                  </pic:blipFill>
+                  <pic:spPr bwMode="auto">
+                    <a:xfrm>
+                      <a:off x="0" y="0"/>
+                      <a:ext cx="3648710" cy="1990725"/>
+                    </a:xfrm>
+                    <a:prstGeom prst="rect">
+                      <a:avLst/>
+                    </a:prstGeom>
+                    <a:noFill/>
+                  </pic:spPr>
+                </pic:pic>
+              </a:graphicData>
+            </a:graphic>
+          </wp:inline>
+        </w:drawing>
+      </w:r>
+      <w:r>
+        <w:t xml:space="preserve">       </w:t>
+      </w:r>
+    </w:p>
+    <w:p>
+      <w:pPr>
+        <w:jc w:val="both"/>
+      </w:pPr>
+      <w:r>
+        <w:t xml:space="preserve">   </w:t>
+      </w:r>
+      <w:r>
+        <w:rPr>
+          <w:noProof/>
+        </w:rPr>
+        <w:drawing>
+          <wp:inline distT="0" distB="0" distL="0" distR="0" wp14:anchorId="67BC09D2">
+            <wp:extent cx="4220210" cy="752475"/>
+            <wp:effectExtent l="0" t="0" r="8890" b="9525"/>
+            <wp:docPr id="129" name="Imagem 129"/>
+            <wp:cNvGraphicFramePr>
+              <a:graphicFrameLocks xmlns:a="http://schemas.openxmlformats.org/drawingml/2006/main" noChangeAspect="1"/>
+            </wp:cNvGraphicFramePr>
+            <a:graphic xmlns:a="http://schemas.openxmlformats.org/drawingml/2006/main">
+              <a:graphicData uri="http://schemas.openxmlformats.org/drawingml/2006/picture">
+                <pic:pic xmlns:pic="http://schemas.openxmlformats.org/drawingml/2006/picture">
+                  <pic:nvPicPr>
+                    <pic:cNvPr id="0" name="Picture 3"/>
+                    <pic:cNvPicPr>
+                      <a:picLocks noChangeAspect="1" noChangeArrowheads="1"/>
+                    </pic:cNvPicPr>
+                  </pic:nvPicPr>
+                  <pic:blipFill>
+                    <a:blip r:embed="rId135">
+                      <a:extLst>
+                        <a:ext uri="{28A0092B-C50C-407E-A947-70E740481C1C}">
+                          <a14:useLocalDpi xmlns:a14="http://schemas.microsoft.com/office/drawing/2010/main" val="0"/>
+                        </a:ext>
+                      </a:extLst>
+                    </a:blip>
+                    <a:srcRect/>
+                    <a:stretch>
+                      <a:fillRect/>
+                    </a:stretch>
+                  </pic:blipFill>
+                  <pic:spPr bwMode="auto">
+                    <a:xfrm>
+                      <a:off x="0" y="0"/>
+                      <a:ext cx="4220210" cy="752475"/>
+                    </a:xfrm>
+                    <a:prstGeom prst="rect">
+                      <a:avLst/>
+                    </a:prstGeom>
+                    <a:noFill/>
+                  </pic:spPr>
+                </pic:pic>
+              </a:graphicData>
+            </a:graphic>
+          </wp:inline>
+        </w:drawing>
+      </w:r>
+      <w:r>
+        <w:t xml:space="preserve">        </w:t>
+      </w:r>
+    </w:p>
+    <w:p>
+      <w:pPr>
+        <w:jc w:val="both"/>
+      </w:pPr>
+    </w:p>
+    <w:p>
+      <w:pPr>
+        <w:jc w:val="both"/>
+      </w:pPr>
+      <w:r>
+        <w:t xml:space="preserve">84- Aumentamos a largura da imagem do banner para ocupar 100% de espaço na pagina e demos uma largura para o </w:t>
+      </w:r>
+      <w:proofErr w:type="spellStart"/>
+      <w:r>
+        <w:t>main</w:t>
+      </w:r>
+      <w:proofErr w:type="spellEnd"/>
+      <w:r>
+        <w:t xml:space="preserve"> e centralizamos </w:t>
+      </w:r>
+      <w:proofErr w:type="spellStart"/>
+      <w:r>
+        <w:t>o</w:t>
+      </w:r>
+      <w:r>
+        <w:t>conteudo</w:t>
+      </w:r>
+      <w:proofErr w:type="spellEnd"/>
+      <w:r>
+        <w:t xml:space="preserve"> dentro dele </w:t>
+      </w:r>
+    </w:p>
+    <w:p>
+      <w:pPr>
+        <w:jc w:val="both"/>
+      </w:pPr>
+      <w:r>
+        <w:t xml:space="preserve">           </w:t>
+      </w:r>
+      <w:r>
+        <w:rPr>
+          <w:noProof/>
+        </w:rPr>
+        <w:drawing>
+          <wp:inline distT="0" distB="0" distL="0" distR="0" wp14:anchorId="2F27A58B">
+            <wp:extent cx="1346496" cy="923925"/>
+            <wp:effectExtent l="0" t="0" r="6350" b="0"/>
+            <wp:docPr id="130" name="Imagem 130"/>
+            <wp:cNvGraphicFramePr>
+              <a:graphicFrameLocks xmlns:a="http://schemas.openxmlformats.org/drawingml/2006/main" noChangeAspect="1"/>
+            </wp:cNvGraphicFramePr>
+            <a:graphic xmlns:a="http://schemas.openxmlformats.org/drawingml/2006/main">
+              <a:graphicData uri="http://schemas.openxmlformats.org/drawingml/2006/picture">
+                <pic:pic xmlns:pic="http://schemas.openxmlformats.org/drawingml/2006/picture">
+                  <pic:nvPicPr>
+                    <pic:cNvPr id="0" name="Picture 4"/>
+                    <pic:cNvPicPr>
+                      <a:picLocks noChangeAspect="1" noChangeArrowheads="1"/>
+                    </pic:cNvPicPr>
+                  </pic:nvPicPr>
+                  <pic:blipFill>
+                    <a:blip r:embed="rId136">
+                      <a:extLst>
+                        <a:ext uri="{28A0092B-C50C-407E-A947-70E740481C1C}">
+                          <a14:useLocalDpi xmlns:a14="http://schemas.microsoft.com/office/drawing/2010/main" val="0"/>
+                        </a:ext>
+                      </a:extLst>
+                    </a:blip>
+                    <a:srcRect/>
+                    <a:stretch>
+                      <a:fillRect/>
+                    </a:stretch>
+                  </pic:blipFill>
+                  <pic:spPr bwMode="auto">
+                    <a:xfrm>
+                      <a:off x="0" y="0"/>
+                      <a:ext cx="1360175" cy="933311"/>
+                    </a:xfrm>
+                    <a:prstGeom prst="rect">
+                      <a:avLst/>
+                    </a:prstGeom>
+                    <a:noFill/>
+                  </pic:spPr>
+                </pic:pic>
+              </a:graphicData>
+            </a:graphic>
+          </wp:inline>
+        </w:drawing>
+      </w:r>
+      <w:r>
+        <w:t xml:space="preserve">                                        </w:t>
+      </w:r>
+    </w:p>
+    <w:p>
+      <w:pPr>
+        <w:jc w:val="both"/>
+      </w:pPr>
+      <w:r>
+        <w:t xml:space="preserve">85-Na pagina do index.html trocamos as </w:t>
+      </w:r>
+      <w:proofErr w:type="spellStart"/>
+      <w:r>
+        <w:t>div</w:t>
+      </w:r>
+      <w:proofErr w:type="spellEnd"/>
+      <w:r>
+        <w:t xml:space="preserve"> por </w:t>
+      </w:r>
+      <w:proofErr w:type="spellStart"/>
+      <w:r>
+        <w:t>section</w:t>
+      </w:r>
+      <w:proofErr w:type="spellEnd"/>
+      <w:r>
+        <w:t xml:space="preserve"> a diferença entre </w:t>
+      </w:r>
+      <w:proofErr w:type="spellStart"/>
+      <w:r>
+        <w:t>div</w:t>
+      </w:r>
+      <w:proofErr w:type="spellEnd"/>
+      <w:r>
+        <w:t xml:space="preserve"> e </w:t>
+      </w:r>
+      <w:proofErr w:type="spellStart"/>
+      <w:r>
+        <w:t>section</w:t>
+      </w:r>
+      <w:proofErr w:type="spellEnd"/>
+      <w:r>
+        <w:t xml:space="preserve"> e que a </w:t>
+      </w:r>
+      <w:proofErr w:type="spellStart"/>
+      <w:r>
+        <w:t>div</w:t>
+      </w:r>
+      <w:proofErr w:type="spellEnd"/>
+      <w:r>
+        <w:t xml:space="preserve"> geralmente e usada para conteúdo visual dentro dela e não necessariamente são correspondentes ao mesmo assunto.</w:t>
+      </w:r>
+    </w:p>
+    <w:p>
+      <w:pPr>
+        <w:jc w:val="both"/>
+      </w:pPr>
+      <w:r>
+        <w:t xml:space="preserve">Ao </w:t>
+      </w:r>
+      <w:proofErr w:type="spellStart"/>
+      <w:r>
+        <w:t>contrario</w:t>
+      </w:r>
+      <w:proofErr w:type="spellEnd"/>
+      <w:r>
+        <w:t xml:space="preserve"> da </w:t>
+      </w:r>
+      <w:proofErr w:type="spellStart"/>
+      <w:r>
+        <w:t>div</w:t>
+      </w:r>
+      <w:proofErr w:type="spellEnd"/>
+      <w:r>
+        <w:t xml:space="preserve"> o </w:t>
+      </w:r>
+      <w:proofErr w:type="spellStart"/>
+      <w:r>
+        <w:t>section</w:t>
+      </w:r>
+      <w:proofErr w:type="spellEnd"/>
+      <w:r>
+        <w:t xml:space="preserve"> cria uma divisão na pagina em que o conteúdo interno </w:t>
+      </w:r>
+      <w:proofErr w:type="spellStart"/>
+      <w:proofErr w:type="gramStart"/>
+      <w:r>
+        <w:t>esta</w:t>
+      </w:r>
+      <w:proofErr w:type="spellEnd"/>
+      <w:proofErr w:type="gramEnd"/>
+      <w:r>
+        <w:t xml:space="preserve"> relacionado a um único tema ou seja ao mesmo assunto então por </w:t>
+      </w:r>
+      <w:proofErr w:type="spellStart"/>
+      <w:r>
+        <w:t>tal</w:t>
+      </w:r>
+      <w:proofErr w:type="spellEnd"/>
+      <w:r>
+        <w:t xml:space="preserve"> motivo trocamos </w:t>
+      </w:r>
+      <w:proofErr w:type="spellStart"/>
+      <w:r>
+        <w:t>div</w:t>
+      </w:r>
+      <w:proofErr w:type="spellEnd"/>
+      <w:r>
+        <w:t xml:space="preserve"> principal por </w:t>
+      </w:r>
+      <w:proofErr w:type="spellStart"/>
+      <w:r>
+        <w:t>section</w:t>
+      </w:r>
+      <w:proofErr w:type="spellEnd"/>
+      <w:r>
+        <w:t xml:space="preserve"> </w:t>
+      </w:r>
+      <w:r>
+        <w:t xml:space="preserve">e a </w:t>
+      </w:r>
+      <w:proofErr w:type="spellStart"/>
+      <w:r>
+        <w:t>div</w:t>
+      </w:r>
+      <w:proofErr w:type="spellEnd"/>
+      <w:r>
+        <w:t xml:space="preserve"> benefícios.</w:t>
+      </w:r>
+    </w:p>
+    <w:p>
+      <w:pPr>
+        <w:jc w:val="both"/>
+      </w:pPr>
+      <w:r>
+        <w:rPr>
+          <w:noProof/>
+        </w:rPr>
+        <w:drawing>
+          <wp:inline distT="0" distB="0" distL="0" distR="0" wp14:anchorId="4C3C3064">
+            <wp:extent cx="4692316" cy="495300"/>
+            <wp:effectExtent l="0" t="0" r="0" b="0"/>
+            <wp:docPr id="132" name="Imagem 132"/>
+            <wp:cNvGraphicFramePr>
+              <a:graphicFrameLocks xmlns:a="http://schemas.openxmlformats.org/drawingml/2006/main" noChangeAspect="1"/>
+            </wp:cNvGraphicFramePr>
+            <a:graphic xmlns:a="http://schemas.openxmlformats.org/drawingml/2006/main">
+              <a:graphicData uri="http://schemas.openxmlformats.org/drawingml/2006/picture">
+                <pic:pic xmlns:pic="http://schemas.openxmlformats.org/drawingml/2006/picture">
+                  <pic:nvPicPr>
+                    <pic:cNvPr id="0" name="Picture 6"/>
+                    <pic:cNvPicPr>
+                      <a:picLocks noChangeAspect="1" noChangeArrowheads="1"/>
+                    </pic:cNvPicPr>
+                  </pic:nvPicPr>
+                  <pic:blipFill>
+                    <a:blip r:embed="rId137">
+                      <a:extLst>
+                        <a:ext uri="{28A0092B-C50C-407E-A947-70E740481C1C}">
+                          <a14:useLocalDpi xmlns:a14="http://schemas.microsoft.com/office/drawing/2010/main" val="0"/>
+                        </a:ext>
+                      </a:extLst>
+                    </a:blip>
+                    <a:srcRect/>
+                    <a:stretch>
+                      <a:fillRect/>
+                    </a:stretch>
+                  </pic:blipFill>
+                  <pic:spPr bwMode="auto">
+                    <a:xfrm>
+                      <a:off x="0" y="0"/>
+                      <a:ext cx="4736560" cy="499970"/>
+                    </a:xfrm>
+                    <a:prstGeom prst="rect">
+                      <a:avLst/>
+                    </a:prstGeom>
+                    <a:noFill/>
+                  </pic:spPr>
+                </pic:pic>
+              </a:graphicData>
+            </a:graphic>
+          </wp:inline>
+        </w:drawing>
+      </w:r>
+    </w:p>
+    <w:p>
+      <w:pPr>
+        <w:jc w:val="both"/>
+      </w:pPr>
+      <w:r>
+        <w:t xml:space="preserve">  </w:t>
+      </w:r>
+      <w:r>
+        <w:rPr>
+          <w:noProof/>
+        </w:rPr>
+        <w:drawing>
+          <wp:inline distT="0" distB="0" distL="0" distR="0" wp14:anchorId="171D8A33">
+            <wp:extent cx="4648200" cy="304800"/>
+            <wp:effectExtent l="0" t="0" r="0" b="0"/>
+            <wp:docPr id="131" name="Imagem 131"/>
+            <wp:cNvGraphicFramePr>
+              <a:graphicFrameLocks xmlns:a="http://schemas.openxmlformats.org/drawingml/2006/main" noChangeAspect="1"/>
+            </wp:cNvGraphicFramePr>
+            <a:graphic xmlns:a="http://schemas.openxmlformats.org/drawingml/2006/main">
+              <a:graphicData uri="http://schemas.openxmlformats.org/drawingml/2006/picture">
+                <pic:pic xmlns:pic="http://schemas.openxmlformats.org/drawingml/2006/picture">
+                  <pic:nvPicPr>
+                    <pic:cNvPr id="0" name="Picture 5"/>
+                    <pic:cNvPicPr>
+                      <a:picLocks noChangeAspect="1" noChangeArrowheads="1"/>
+                    </pic:cNvPicPr>
+                  </pic:nvPicPr>
+                  <pic:blipFill>
+                    <a:blip r:embed="rId138">
+                      <a:extLst>
+                        <a:ext uri="{28A0092B-C50C-407E-A947-70E740481C1C}">
+                          <a14:useLocalDpi xmlns:a14="http://schemas.microsoft.com/office/drawing/2010/main" val="0"/>
+                        </a:ext>
+                      </a:extLst>
+                    </a:blip>
+                    <a:srcRect/>
+                    <a:stretch>
+                      <a:fillRect/>
+                    </a:stretch>
+                  </pic:blipFill>
+                  <pic:spPr bwMode="auto">
+                    <a:xfrm>
+                      <a:off x="0" y="0"/>
+                      <a:ext cx="4671731" cy="306343"/>
+                    </a:xfrm>
+                    <a:prstGeom prst="rect">
+                      <a:avLst/>
+                    </a:prstGeom>
+                    <a:noFill/>
+                  </pic:spPr>
+                </pic:pic>
+              </a:graphicData>
+            </a:graphic>
+          </wp:inline>
+        </w:drawing>
+      </w:r>
+      <w:r>
+        <w:t xml:space="preserve">              </w:t>
+      </w:r>
+    </w:p>
+    <w:p>
+      <w:pPr>
+        <w:jc w:val="both"/>
+      </w:pPr>
+    </w:p>
+    <w:p>
+      <w:pPr>
+        <w:jc w:val="both"/>
+      </w:pPr>
+      <w:r>
+        <w:t>86-</w:t>
+      </w:r>
+      <w:r>
+        <w:t xml:space="preserve">Adicionamos a </w:t>
+      </w:r>
+      <w:proofErr w:type="spellStart"/>
+      <w:r>
+        <w:t>class</w:t>
+      </w:r>
+      <w:proofErr w:type="spellEnd"/>
+      <w:r>
+        <w:t xml:space="preserve"> </w:t>
+      </w:r>
+      <w:proofErr w:type="spellStart"/>
+      <w:r>
+        <w:t>titulo</w:t>
+      </w:r>
+      <w:proofErr w:type="spellEnd"/>
+      <w:r>
+        <w:t>-principal no h2 e h3 da nossa pagina centralizamos os subtítulos e aumentamos o tamanho da fonte utilizando a medida padrão do navegador 2em e dobro da medida padrão e assim por diante ao utilizamos.</w:t>
+      </w:r>
+    </w:p>
+    <w:p>
+      <w:pPr>
+        <w:jc w:val="both"/>
+      </w:pPr>
+      <w:r>
+        <w:t>E para finalizar colocamos um espaço externo para baixo de 1em proximamente 16px com margin:0 0 1em;</w:t>
+      </w:r>
+    </w:p>
+    <w:p>
+      <w:pPr>
+        <w:jc w:val="both"/>
+      </w:pPr>
+      <w:r>
+        <w:rPr>
+          <w:noProof/>
+        </w:rPr>
+        <w:drawing>
+          <wp:inline distT="0" distB="0" distL="0" distR="0" wp14:anchorId="602BB380">
+            <wp:extent cx="1796702" cy="971550"/>
+            <wp:effectExtent l="0" t="0" r="0" b="0"/>
+            <wp:docPr id="133" name="Imagem 133"/>
+            <wp:cNvGraphicFramePr>
+              <a:graphicFrameLocks xmlns:a="http://schemas.openxmlformats.org/drawingml/2006/main" noChangeAspect="1"/>
+            </wp:cNvGraphicFramePr>
+            <a:graphic xmlns:a="http://schemas.openxmlformats.org/drawingml/2006/main">
+              <a:graphicData uri="http://schemas.openxmlformats.org/drawingml/2006/picture">
+                <pic:pic xmlns:pic="http://schemas.openxmlformats.org/drawingml/2006/picture">
+                  <pic:nvPicPr>
+                    <pic:cNvPr id="0" name="Picture 7"/>
+                    <pic:cNvPicPr>
+                      <a:picLocks noChangeAspect="1" noChangeArrowheads="1"/>
+                    </pic:cNvPicPr>
+                  </pic:nvPicPr>
+                  <pic:blipFill>
+                    <a:blip r:embed="rId139">
+                      <a:extLst>
+                        <a:ext uri="{28A0092B-C50C-407E-A947-70E740481C1C}">
+                          <a14:useLocalDpi xmlns:a14="http://schemas.microsoft.com/office/drawing/2010/main" val="0"/>
+                        </a:ext>
+                      </a:extLst>
+                    </a:blip>
+                    <a:srcRect/>
+                    <a:stretch>
+                      <a:fillRect/>
+                    </a:stretch>
+                  </pic:blipFill>
+                  <pic:spPr bwMode="auto">
+                    <a:xfrm>
+                      <a:off x="0" y="0"/>
+                      <a:ext cx="1812206" cy="979934"/>
+                    </a:xfrm>
+                    <a:prstGeom prst="rect">
+                      <a:avLst/>
+                    </a:prstGeom>
+                    <a:noFill/>
+                  </pic:spPr>
+                </pic:pic>
+              </a:graphicData>
+            </a:graphic>
+          </wp:inline>
+        </w:drawing>
+      </w:r>
+      <w:r>
+        <w:t xml:space="preserve">        </w:t>
+      </w:r>
+    </w:p>
+    <w:p>
+      <w:pPr>
+        <w:jc w:val="both"/>
+      </w:pPr>
+    </w:p>
+    <w:p>
+      <w:pPr>
+        <w:jc w:val="both"/>
+      </w:pPr>
+      <w:r>
+        <w:t>87-</w:t>
+      </w:r>
+      <w:proofErr w:type="gramStart"/>
+      <w:r>
+        <w:t>Para  colocar</w:t>
+      </w:r>
+      <w:proofErr w:type="gramEnd"/>
+      <w:r>
+        <w:t xml:space="preserve"> </w:t>
+      </w:r>
+    </w:p>
+    <w:p>
+      <w:pPr>
+        <w:jc w:val="both"/>
+      </w:pPr>
+    </w:p>
+    <w:p>
+      <w:pPr>
+        <w:jc w:val="both"/>
+      </w:pPr>
+    </w:p>
+    <w:p>
+      <w:pPr>
+        <w:jc w:val="both"/>
+      </w:pPr>
+      <w:r>
+        <w:t>88-Utilizamos o CSS como referencias para aplicar as propriedades usamos os seguintes códigos:</w:t>
+      </w:r>
+    </w:p>
+    <w:p>
+      <w:pPr>
+        <w:pStyle w:val="PargrafodaLista"/>
+        <w:numPr>
+          <w:ilvl w:val="0"/>
+          <w:numId w:val="1"/>
+        </w:numPr>
+        <w:jc w:val="both"/>
+      </w:pPr>
+      <w:r>
+        <w:t xml:space="preserve">Encorpamos o texto deixando em negrito </w:t>
+      </w:r>
+      <w:proofErr w:type="gramStart"/>
+      <w:r>
+        <w:t>(.principal</w:t>
+      </w:r>
+      <w:proofErr w:type="gramEnd"/>
+      <w:r>
+        <w:t xml:space="preserve"> Strong)</w:t>
+      </w:r>
+    </w:p>
+    <w:p>
+      <w:pPr>
+        <w:pStyle w:val="PargrafodaLista"/>
+        <w:numPr>
+          <w:ilvl w:val="0"/>
+          <w:numId w:val="1"/>
+        </w:numPr>
+        <w:jc w:val="both"/>
+      </w:pPr>
+      <w:r>
+        <w:t xml:space="preserve">Deixamos o texto em </w:t>
+      </w:r>
+      <w:proofErr w:type="spellStart"/>
+      <w:r>
+        <w:t>italic</w:t>
+      </w:r>
+      <w:proofErr w:type="spellEnd"/>
+      <w:r>
+        <w:t xml:space="preserve"> </w:t>
+      </w:r>
+      <w:proofErr w:type="gramStart"/>
+      <w:r>
+        <w:t>(.principal</w:t>
+      </w:r>
+      <w:proofErr w:type="gramEnd"/>
+      <w:r>
+        <w:t xml:space="preserve"> em)</w:t>
+      </w:r>
+    </w:p>
+    <w:p>
+      <w:pPr>
+        <w:pStyle w:val="PargrafodaLista"/>
+        <w:jc w:val="both"/>
+      </w:pPr>
+    </w:p>
+    <w:p>
+      <w:pPr>
+        <w:pStyle w:val="PargrafodaLista"/>
+        <w:jc w:val="both"/>
+      </w:pPr>
+      <w:r>
+        <w:rPr>
+          <w:noProof/>
+        </w:rPr>
+        <w:drawing>
+          <wp:inline distT="0" distB="0" distL="0" distR="0" wp14:anchorId="2580E9DE">
+            <wp:extent cx="1514475" cy="952500"/>
+            <wp:effectExtent l="0" t="0" r="9525" b="0"/>
+            <wp:docPr id="134" name="Imagem 134"/>
+            <wp:cNvGraphicFramePr>
+              <a:graphicFrameLocks xmlns:a="http://schemas.openxmlformats.org/drawingml/2006/main" noChangeAspect="1"/>
+            </wp:cNvGraphicFramePr>
+            <a:graphic xmlns:a="http://schemas.openxmlformats.org/drawingml/2006/main">
+              <a:graphicData uri="http://schemas.openxmlformats.org/drawingml/2006/picture">
+                <pic:pic xmlns:pic="http://schemas.openxmlformats.org/drawingml/2006/picture">
+                  <pic:nvPicPr>
+                    <pic:cNvPr id="0" name="Picture 8"/>
+                    <pic:cNvPicPr>
+                      <a:picLocks noChangeAspect="1" noChangeArrowheads="1"/>
+                    </pic:cNvPicPr>
+                  </pic:nvPicPr>
+                  <pic:blipFill>
+                    <a:blip r:embed="rId140">
+                      <a:extLst>
+                        <a:ext uri="{28A0092B-C50C-407E-A947-70E740481C1C}">
+                          <a14:useLocalDpi xmlns:a14="http://schemas.microsoft.com/office/drawing/2010/main" val="0"/>
+                        </a:ext>
+                      </a:extLst>
+                    </a:blip>
+                    <a:srcRect/>
+                    <a:stretch>
+                      <a:fillRect/>
+                    </a:stretch>
+                  </pic:blipFill>
+                  <pic:spPr bwMode="auto">
+                    <a:xfrm>
+                      <a:off x="0" y="0"/>
+                      <a:ext cx="1514475" cy="952500"/>
+                    </a:xfrm>
+                    <a:prstGeom prst="rect">
+                      <a:avLst/>
+                    </a:prstGeom>
+                    <a:noFill/>
+                  </pic:spPr>
+                </pic:pic>
+              </a:graphicData>
+            </a:graphic>
+          </wp:inline>
+        </w:drawing>
+      </w:r>
+      <w:r>
+        <w:t xml:space="preserve">  </w:t>
+      </w:r>
+      <w:r>
+        <w:t xml:space="preserve">      </w:t>
+      </w:r>
+      <w:r>
+        <w:rPr>
+          <w:noProof/>
+        </w:rPr>
+        <w:drawing>
+          <wp:inline distT="0" distB="0" distL="0" distR="0" wp14:anchorId="47172CBB">
+            <wp:extent cx="2933686" cy="955675"/>
+            <wp:effectExtent l="0" t="0" r="635" b="0"/>
+            <wp:docPr id="135" name="Imagem 135"/>
+            <wp:cNvGraphicFramePr>
+              <a:graphicFrameLocks xmlns:a="http://schemas.openxmlformats.org/drawingml/2006/main" noChangeAspect="1"/>
+            </wp:cNvGraphicFramePr>
+            <a:graphic xmlns:a="http://schemas.openxmlformats.org/drawingml/2006/main">
+              <a:graphicData uri="http://schemas.openxmlformats.org/drawingml/2006/picture">
+                <pic:pic xmlns:pic="http://schemas.openxmlformats.org/drawingml/2006/picture">
+                  <pic:nvPicPr>
+                    <pic:cNvPr id="0" name="Picture 9"/>
+                    <pic:cNvPicPr>
+                      <a:picLocks noChangeAspect="1" noChangeArrowheads="1"/>
+                    </pic:cNvPicPr>
+                  </pic:nvPicPr>
+                  <pic:blipFill>
+                    <a:blip r:embed="rId141">
+                      <a:extLst>
+                        <a:ext uri="{28A0092B-C50C-407E-A947-70E740481C1C}">
+                          <a14:useLocalDpi xmlns:a14="http://schemas.microsoft.com/office/drawing/2010/main" val="0"/>
+                        </a:ext>
+                      </a:extLst>
+                    </a:blip>
+                    <a:srcRect/>
+                    <a:stretch>
+                      <a:fillRect/>
+                    </a:stretch>
+                  </pic:blipFill>
+                  <pic:spPr bwMode="auto">
+                    <a:xfrm>
+                      <a:off x="0" y="0"/>
+                      <a:ext cx="3041808" cy="990897"/>
+                    </a:xfrm>
+                    <a:prstGeom prst="rect">
+                      <a:avLst/>
+                    </a:prstGeom>
+                    <a:noFill/>
+                  </pic:spPr>
+                </pic:pic>
+              </a:graphicData>
+            </a:graphic>
+          </wp:inline>
+        </w:drawing>
+      </w:r>
+      <w:r>
+        <w:t xml:space="preserve">            </w:t>
+      </w:r>
+    </w:p>
+    <w:p>
+      <w:pPr>
+        <w:pStyle w:val="PargrafodaLista"/>
+        <w:jc w:val="both"/>
+      </w:pPr>
+    </w:p>
+    <w:p>
+      <w:pPr>
+        <w:pStyle w:val="PargrafodaLista"/>
+        <w:jc w:val="both"/>
+      </w:pPr>
+      <w:r>
+        <w:t xml:space="preserve">   </w:t>
+      </w:r>
+      <w:r>
+        <w:rPr>
+          <w:noProof/>
+        </w:rPr>
+        <w:drawing>
+          <wp:inline distT="0" distB="0" distL="0" distR="0" wp14:anchorId="14D415C1">
+            <wp:extent cx="3934460" cy="304800"/>
+            <wp:effectExtent l="0" t="0" r="8890" b="0"/>
+            <wp:docPr id="136" name="Imagem 136"/>
+            <wp:cNvGraphicFramePr>
+              <a:graphicFrameLocks xmlns:a="http://schemas.openxmlformats.org/drawingml/2006/main" noChangeAspect="1"/>
+            </wp:cNvGraphicFramePr>
+            <a:graphic xmlns:a="http://schemas.openxmlformats.org/drawingml/2006/main">
+              <a:graphicData uri="http://schemas.openxmlformats.org/drawingml/2006/picture">
+                <pic:pic xmlns:pic="http://schemas.openxmlformats.org/drawingml/2006/picture">
+                  <pic:nvPicPr>
+                    <pic:cNvPr id="0" name="Picture 10"/>
+                    <pic:cNvPicPr>
+                      <a:picLocks noChangeAspect="1" noChangeArrowheads="1"/>
+                    </pic:cNvPicPr>
+                  </pic:nvPicPr>
+                  <pic:blipFill>
+                    <a:blip r:embed="rId142">
+                      <a:extLst>
+                        <a:ext uri="{28A0092B-C50C-407E-A947-70E740481C1C}">
+                          <a14:useLocalDpi xmlns:a14="http://schemas.microsoft.com/office/drawing/2010/main" val="0"/>
+                        </a:ext>
+                      </a:extLst>
+                    </a:blip>
+                    <a:srcRect/>
+                    <a:stretch>
+                      <a:fillRect/>
+                    </a:stretch>
+                  </pic:blipFill>
+                  <pic:spPr bwMode="auto">
+                    <a:xfrm>
+                      <a:off x="0" y="0"/>
+                      <a:ext cx="3934460" cy="304800"/>
+                    </a:xfrm>
+                    <a:prstGeom prst="rect">
+                      <a:avLst/>
+                    </a:prstGeom>
+                    <a:noFill/>
+                  </pic:spPr>
+                </pic:pic>
+              </a:graphicData>
+            </a:graphic>
+          </wp:inline>
+        </w:drawing>
+      </w:r>
+      <w:r>
+        <w:t xml:space="preserve">    </w:t>
+      </w:r>
+    </w:p>
+    <w:p>
+      <w:pPr>
+        <w:pStyle w:val="PargrafodaLista"/>
+        <w:jc w:val="both"/>
+      </w:pPr>
+    </w:p>
+    <w:p>
+      <w:pPr>
+        <w:pStyle w:val="PargrafodaLista"/>
+        <w:jc w:val="both"/>
+      </w:pPr>
+    </w:p>
+    <w:p>
+      <w:pPr>
+        <w:jc w:val="both"/>
+      </w:pPr>
+      <w:r>
+        <w:t xml:space="preserve">89-Diminuimos o tamanho da imagem benefícios utilizando o </w:t>
+      </w:r>
+      <w:proofErr w:type="gramStart"/>
+      <w:r>
+        <w:t>seguintes comando</w:t>
+      </w:r>
+      <w:proofErr w:type="gramEnd"/>
+      <w:r>
+        <w:t>:</w:t>
+      </w:r>
+    </w:p>
+    <w:p>
+      <w:pPr>
+        <w:jc w:val="both"/>
+      </w:pPr>
+      <w:r>
+        <w:rPr>
+          <w:noProof/>
+        </w:rPr>
+        <w:drawing>
+          <wp:inline distT="0" distB="0" distL="0" distR="0" wp14:anchorId="4B7E51A0">
+            <wp:extent cx="1422400" cy="609600"/>
+            <wp:effectExtent l="0" t="0" r="6350" b="0"/>
+            <wp:docPr id="137" name="Imagem 137"/>
+            <wp:cNvGraphicFramePr>
+              <a:graphicFrameLocks xmlns:a="http://schemas.openxmlformats.org/drawingml/2006/main" noChangeAspect="1"/>
+            </wp:cNvGraphicFramePr>
+            <a:graphic xmlns:a="http://schemas.openxmlformats.org/drawingml/2006/main">
+              <a:graphicData uri="http://schemas.openxmlformats.org/drawingml/2006/picture">
+                <pic:pic xmlns:pic="http://schemas.openxmlformats.org/drawingml/2006/picture">
+                  <pic:nvPicPr>
+                    <pic:cNvPr id="0" name="Picture 11"/>
+                    <pic:cNvPicPr>
+                      <a:picLocks noChangeAspect="1" noChangeArrowheads="1"/>
+                    </pic:cNvPicPr>
+                  </pic:nvPicPr>
+                  <pic:blipFill>
+                    <a:blip r:embed="rId143">
+                      <a:extLst>
+                        <a:ext uri="{28A0092B-C50C-407E-A947-70E740481C1C}">
+                          <a14:useLocalDpi xmlns:a14="http://schemas.microsoft.com/office/drawing/2010/main" val="0"/>
+                        </a:ext>
+                      </a:extLst>
+                    </a:blip>
+                    <a:srcRect/>
+                    <a:stretch>
+                      <a:fillRect/>
+                    </a:stretch>
+                  </pic:blipFill>
+                  <pic:spPr bwMode="auto">
+                    <a:xfrm>
+                      <a:off x="0" y="0"/>
+                      <a:ext cx="1422400" cy="609600"/>
+                    </a:xfrm>
+                    <a:prstGeom prst="rect">
+                      <a:avLst/>
+                    </a:prstGeom>
+                    <a:noFill/>
+                  </pic:spPr>
+                </pic:pic>
+              </a:graphicData>
+            </a:graphic>
+          </wp:inline>
+        </w:drawing>
+      </w:r>
+    </w:p>
+    <w:p>
+      <w:pPr>
+        <w:jc w:val="both"/>
+      </w:pPr>
+    </w:p>
+    <w:p>
+      <w:pPr>
+        <w:jc w:val="both"/>
+      </w:pPr>
+      <w:r>
+        <w:t>90-</w:t>
+      </w:r>
+    </w:p>
+    <w:p>
+      <w:pPr>
+        <w:jc w:val="both"/>
+      </w:pPr>
+    </w:p>
+    <w:p>
+      <w:pPr>
+        <w:jc w:val="both"/>
+      </w:pPr>
+      <w:r>
+        <w:t>91-</w:t>
+      </w:r>
+    </w:p>
+    <w:p>
+      <w:pPr>
+        <w:jc w:val="both"/>
+      </w:pPr>
+    </w:p>
+    <w:p>
+      <w:pPr>
+        <w:jc w:val="both"/>
+      </w:pPr>
+      <w:r>
+        <w:t>92-</w:t>
+      </w:r>
+    </w:p>
+    <w:p>
+      <w:pPr>
+        <w:jc w:val="both"/>
+      </w:pPr>
+      <w:r>
+        <w:t>93-</w:t>
+      </w:r>
+    </w:p>
+    <w:p>
+      <w:pPr>
+        <w:jc w:val="both"/>
+      </w:pPr>
+      <w:r>
+        <w:t xml:space="preserve">94-Trabalhando com fontes da internet vamos escolher uma fonte para nosso site que seja preparado pela internet </w:t>
+      </w:r>
+    </w:p>
+    <w:p>
+      <w:pPr>
+        <w:jc w:val="both"/>
+      </w:pPr>
+      <w:r>
+        <w:t>Qual a diferença ser preparado ou não para internet é que a fonte independente do navegador vai se</w:t>
+      </w:r>
+    </w:p>
+    <w:p>
+      <w:pPr>
+        <w:jc w:val="both"/>
+      </w:pPr>
+    </w:p>
+    <w:p>
+      <w:pPr>
+        <w:jc w:val="both"/>
+      </w:pPr>
+    </w:p>
+    <w:p>
+      <w:pPr>
+        <w:jc w:val="both"/>
+      </w:pPr>
+    </w:p>
+    <w:p>
+      <w:pPr>
+        <w:jc w:val="both"/>
+      </w:pPr>
+    </w:p>
+    <w:p>
+      <w:pPr>
+        <w:jc w:val="both"/>
+      </w:pPr>
+      <w:r>
+        <w:t xml:space="preserve">101-No </w:t>
+      </w:r>
+      <w:proofErr w:type="spellStart"/>
+      <w:r>
+        <w:t>css</w:t>
+      </w:r>
+      <w:proofErr w:type="spellEnd"/>
+      <w:r>
+        <w:t xml:space="preserve"> na </w:t>
+      </w:r>
+      <w:proofErr w:type="spellStart"/>
+      <w:r>
+        <w:t>class</w:t>
+      </w:r>
+      <w:proofErr w:type="spellEnd"/>
+      <w:r>
+        <w:t xml:space="preserve"> vídeo vamos colocar uma largura para vídeo 560px e vamos dar um espaço externo </w:t>
       </w:r>
       <w:bookmarkStart w:id="0" w:name="_GoBack"/>
       <w:bookmarkEnd w:id="0"/>
-      <w:r>
-        <w:t xml:space="preserve"> </w:t>
-      </w:r>
-      <w:r>
-        <w:t xml:space="preserve">                                                                                                                                                                                                                                                                                                                                                                                                                                                               </w:t>
+    </w:p>
+    <w:p>
+      <w:pPr>
+        <w:jc w:val="both"/>
+      </w:pPr>
+    </w:p>
+    <w:p>
+      <w:pPr>
+        <w:pStyle w:val="PargrafodaLista"/>
+        <w:jc w:val="both"/>
+      </w:pPr>
+      <w:r>
+        <w:t xml:space="preserve">                                                                                                                                                                                                                   </w:t>
       </w:r>
     </w:p>
     <w:sectPr>
@@ -10994,7 +12147,7 @@
 </file>
 
 <file path=customXml/itemProps1.xml><?xml version="1.0" encoding="utf-8"?>
-<ds:datastoreItem xmlns:ds="http://schemas.openxmlformats.org/officeDocument/2006/customXml" ds:itemID="{37B6D4C3-DC46-4FCD-A7B7-64A671869D65}">
+<ds:datastoreItem xmlns:ds="http://schemas.openxmlformats.org/officeDocument/2006/customXml" ds:itemID="{4568ABF6-8416-447C-85C2-C177CB304C51}">
   <ds:schemaRefs>
     <ds:schemaRef ds:uri="http://schemas.openxmlformats.org/officeDocument/2006/bibliography"/>
   </ds:schemaRefs>

</xml_diff>

<commit_message>
atualização da aula 13/10/2026
</commit_message>
<xml_diff>
--- a/Apostila/Projeto Space for Men.docx
+++ b/Apostila/Projeto Space for Men.docx
@@ -14266,6 +14266,7 @@
       <w:r>
         <w:rPr>
           <w:i/>
+          <w:noProof/>
         </w:rPr>
         <w:drawing>
           <wp:inline distT="0" distB="0" distL="0" distR="0" wp14:anchorId="77143ED8" wp14:editId="2EE7C0A8">
@@ -14416,6 +14417,7 @@
       <w:r>
         <w:rPr>
           <w:i/>
+          <w:noProof/>
         </w:rPr>
         <w:drawing>
           <wp:inline distT="0" distB="0" distL="0" distR="0" wp14:anchorId="0A357DE6" wp14:editId="413C58AC">
@@ -14635,33 +14637,1622 @@
         <w:rPr>
           <w:i/>
         </w:rPr>
-        <w:t>iste o 4 valores que seria a propriedade que configura a intensidade da borda a partir do tamanho do elemento, isto é, o tamanho da sombra projetada nesta casa inserimos 20px</w:t>
+        <w:t xml:space="preserve">iste </w:t>
+      </w:r>
+      <w:proofErr w:type="gramStart"/>
+      <w:r>
+        <w:rPr>
+          <w:i/>
+        </w:rPr>
+        <w:t>o 4 valores</w:t>
+      </w:r>
+      <w:proofErr w:type="gramEnd"/>
+      <w:r>
+        <w:rPr>
+          <w:i/>
+        </w:rPr>
+        <w:t xml:space="preserve"> que seria a propriedade que configura a intensidade da borda a partir do tamanho do elemento, isto é, o tamanho da sombra projetada nesta casa inserimos 20px</w:t>
+      </w:r>
+    </w:p>
+    <w:p>
+      <w:pPr>
+        <w:rPr>
+          <w:i/>
+        </w:rPr>
+      </w:pPr>
+    </w:p>
+    <w:p>
+      <w:pPr>
+        <w:rPr>
+          <w:i/>
+        </w:rPr>
+      </w:pPr>
+    </w:p>
+    <w:p>
+      <w:pPr>
+        <w:rPr>
+          <w:i/>
+        </w:rPr>
+      </w:pPr>
+      <w:r>
+        <w:rPr>
+          <w:i/>
+        </w:rPr>
+        <w:t>121-</w:t>
+      </w:r>
+      <w:r>
+        <w:rPr>
+          <w:i/>
+        </w:rPr>
+        <w:t>Design responsivo.</w:t>
+      </w:r>
+    </w:p>
+    <w:p>
+      <w:pPr>
+        <w:rPr>
+          <w:i/>
+        </w:rPr>
+      </w:pPr>
+      <w:r>
+        <w:rPr>
+          <w:i/>
+        </w:rPr>
+        <w:t>O que podemos fazer para saber se a nossa pagina está adaptada para uso do celular?</w:t>
+      </w:r>
+    </w:p>
+    <w:p>
+      <w:pPr>
+        <w:rPr>
+          <w:i/>
+        </w:rPr>
+      </w:pPr>
+      <w:r>
+        <w:rPr>
+          <w:i/>
+        </w:rPr>
+        <w:t xml:space="preserve">Tem </w:t>
+      </w:r>
+      <w:proofErr w:type="gramStart"/>
+      <w:r>
+        <w:rPr>
+          <w:i/>
+        </w:rPr>
+        <w:t>duas forma</w:t>
+      </w:r>
+      <w:proofErr w:type="gramEnd"/>
+      <w:r>
+        <w:rPr>
+          <w:i/>
+        </w:rPr>
+        <w:t xml:space="preserve"> formas de abrir e para verificar a ferramenta do desenvolvimento onde podemos verificar.</w:t>
+      </w:r>
+    </w:p>
+    <w:p>
+      <w:pPr>
+        <w:rPr>
+          <w:i/>
+        </w:rPr>
+      </w:pPr>
+      <w:r>
+        <w:rPr>
+          <w:i/>
+        </w:rPr>
+        <w:t>1-</w:t>
+      </w:r>
+      <w:proofErr w:type="gramStart"/>
+      <w:r>
+        <w:rPr>
+          <w:i/>
+        </w:rPr>
+        <w:t>contr</w:t>
+      </w:r>
+      <w:proofErr w:type="gramEnd"/>
+      <w:r>
+        <w:rPr>
+          <w:i/>
+        </w:rPr>
+        <w:t>+shift+l           2-F12</w:t>
+      </w:r>
+    </w:p>
+    <w:p>
+      <w:pPr>
+        <w:rPr>
+          <w:i/>
+        </w:rPr>
+      </w:pPr>
+      <w:r>
+        <w:rPr>
+          <w:i/>
+          <w:noProof/>
+        </w:rPr>
+        <w:drawing>
+          <wp:inline distT="0" distB="0" distL="0" distR="0" wp14:anchorId="121A43A3" wp14:editId="157074FB">
+            <wp:extent cx="5400040" cy="3488690"/>
+            <wp:effectExtent l="0" t="0" r="0" b="0"/>
+            <wp:docPr id="166" name="Imagem 166"/>
+            <wp:cNvGraphicFramePr>
+              <a:graphicFrameLocks xmlns:a="http://schemas.openxmlformats.org/drawingml/2006/main" noChangeAspect="1"/>
+            </wp:cNvGraphicFramePr>
+            <a:graphic xmlns:a="http://schemas.openxmlformats.org/drawingml/2006/main">
+              <a:graphicData uri="http://schemas.openxmlformats.org/drawingml/2006/picture">
+                <pic:pic xmlns:pic="http://schemas.openxmlformats.org/drawingml/2006/picture">
+                  <pic:nvPicPr>
+                    <pic:cNvPr id="1" name=""/>
+                    <pic:cNvPicPr/>
+                  </pic:nvPicPr>
+                  <pic:blipFill>
+                    <a:blip r:embed="rId175"/>
+                    <a:stretch>
+                      <a:fillRect/>
+                    </a:stretch>
+                  </pic:blipFill>
+                  <pic:spPr>
+                    <a:xfrm>
+                      <a:off x="0" y="0"/>
+                      <a:ext cx="5400040" cy="3488690"/>
+                    </a:xfrm>
+                    <a:prstGeom prst="rect">
+                      <a:avLst/>
+                    </a:prstGeom>
+                  </pic:spPr>
+                </pic:pic>
+              </a:graphicData>
+            </a:graphic>
+          </wp:inline>
+        </w:drawing>
+      </w:r>
+    </w:p>
+    <w:p>
+      <w:pPr>
+        <w:rPr>
+          <w:i/>
+        </w:rPr>
+      </w:pPr>
+    </w:p>
+    <w:p>
+      <w:pPr>
+        <w:rPr>
+          <w:i/>
+        </w:rPr>
+      </w:pPr>
+      <w:r>
+        <w:rPr>
+          <w:i/>
+        </w:rPr>
+        <w:t xml:space="preserve">Ao clicar no botão conforme desenho acima podemos </w:t>
+      </w:r>
+      <w:r>
+        <w:rPr>
+          <w:i/>
+        </w:rPr>
+        <w:t>vê o nosso site como ele se comporta no formato de celular.</w:t>
+      </w:r>
+    </w:p>
+    <w:p>
+      <w:pPr>
+        <w:rPr>
+          <w:i/>
+        </w:rPr>
+      </w:pPr>
+      <w:r>
+        <w:rPr>
+          <w:i/>
+        </w:rPr>
+        <w:t>122-</w:t>
+      </w:r>
+      <w:r>
+        <w:rPr>
+          <w:i/>
+        </w:rPr>
+        <w:t>Precisamos compreender quantos pixels existem na tela para trabalhamos em uma melhor exibição</w:t>
+      </w:r>
+      <w:r>
+        <w:rPr>
+          <w:i/>
+        </w:rPr>
+        <w:t>. Atualmente, nossa tela se adaptada ao tamanho disponibilizamos pelo navegador de 940px mínimo.</w:t>
+      </w:r>
+    </w:p>
+    <w:p>
+      <w:pPr>
+        <w:rPr>
+          <w:i/>
+        </w:rPr>
+      </w:pPr>
+    </w:p>
+    <w:p>
+      <w:pPr>
+        <w:rPr>
+          <w:i/>
+        </w:rPr>
+      </w:pPr>
+      <w:r>
+        <w:rPr>
+          <w:i/>
+        </w:rPr>
+        <w:t>No caso de celulares o panorama é diferente mesmo que a resolução do dispositivo de celulares seja 2000px, a quantidade de pixels na tela sempre será diferente. Esses valores são chamados de DPI que é densidade de pixels por polegada.</w:t>
+      </w:r>
+    </w:p>
+    <w:p>
+      <w:pPr>
+        <w:rPr>
+          <w:i/>
+        </w:rPr>
+      </w:pPr>
+      <w:r>
+        <w:rPr>
+          <w:i/>
+        </w:rPr>
+        <w:t>Geralmente, os celulares possuem 320px de largura de tela, alguns maiores 350px a 480px.</w:t>
+      </w:r>
+    </w:p>
+    <w:p>
+      <w:pPr>
+        <w:rPr>
+          <w:b/>
+          <w:i/>
+        </w:rPr>
+      </w:pPr>
+      <w:r>
+        <w:rPr>
+          <w:b/>
+          <w:i/>
+        </w:rPr>
+        <w:t xml:space="preserve">Para saber a quantidade de pixels </w:t>
+      </w:r>
+      <w:proofErr w:type="gramStart"/>
+      <w:r>
+        <w:rPr>
+          <w:b/>
+          <w:i/>
+        </w:rPr>
+        <w:t>o navegadores</w:t>
+      </w:r>
+      <w:proofErr w:type="gramEnd"/>
+      <w:r>
+        <w:rPr>
+          <w:b/>
+          <w:i/>
+        </w:rPr>
+        <w:t xml:space="preserve"> utiliza uma </w:t>
+      </w:r>
+      <w:proofErr w:type="spellStart"/>
+      <w:r>
+        <w:rPr>
+          <w:b/>
+          <w:i/>
+        </w:rPr>
+        <w:t>tag</w:t>
+      </w:r>
+      <w:proofErr w:type="spellEnd"/>
+      <w:r>
+        <w:rPr>
+          <w:b/>
+          <w:i/>
+        </w:rPr>
+        <w:t xml:space="preserve"> do </w:t>
+      </w:r>
+      <w:proofErr w:type="spellStart"/>
+      <w:r>
+        <w:rPr>
+          <w:b/>
+          <w:i/>
+        </w:rPr>
+        <w:t>html</w:t>
+      </w:r>
+      <w:proofErr w:type="spellEnd"/>
+      <w:r>
+        <w:rPr>
+          <w:b/>
+          <w:i/>
+        </w:rPr>
+        <w:t xml:space="preserve"> (ou sejas, para saber o tamanho da tela que está sendo </w:t>
+      </w:r>
+      <w:proofErr w:type="spellStart"/>
+      <w:r>
+        <w:rPr>
+          <w:b/>
+          <w:i/>
+        </w:rPr>
+        <w:t>renderizado</w:t>
+      </w:r>
+      <w:proofErr w:type="spellEnd"/>
+      <w:r>
+        <w:rPr>
+          <w:b/>
+          <w:i/>
+        </w:rPr>
+        <w:t xml:space="preserve"> o site.</w:t>
+      </w:r>
+    </w:p>
+    <w:p>
+      <w:pPr>
+        <w:rPr>
+          <w:i/>
+        </w:rPr>
+      </w:pPr>
+      <w:r>
+        <w:rPr>
+          <w:i/>
+          <w:noProof/>
+        </w:rPr>
+        <w:drawing>
+          <wp:inline distT="0" distB="0" distL="0" distR="0" wp14:anchorId="2B4E1553">
+            <wp:extent cx="5277485" cy="200025"/>
+            <wp:effectExtent l="0" t="0" r="0" b="9525"/>
+            <wp:docPr id="167" name="Imagem 167"/>
+            <wp:cNvGraphicFramePr>
+              <a:graphicFrameLocks xmlns:a="http://schemas.openxmlformats.org/drawingml/2006/main" noChangeAspect="1"/>
+            </wp:cNvGraphicFramePr>
+            <a:graphic xmlns:a="http://schemas.openxmlformats.org/drawingml/2006/main">
+              <a:graphicData uri="http://schemas.openxmlformats.org/drawingml/2006/picture">
+                <pic:pic xmlns:pic="http://schemas.openxmlformats.org/drawingml/2006/picture">
+                  <pic:nvPicPr>
+                    <pic:cNvPr id="0" name="Picture 2"/>
+                    <pic:cNvPicPr>
+                      <a:picLocks noChangeAspect="1" noChangeArrowheads="1"/>
+                    </pic:cNvPicPr>
+                  </pic:nvPicPr>
+                  <pic:blipFill>
+                    <a:blip r:embed="rId176">
+                      <a:extLst>
+                        <a:ext uri="{28A0092B-C50C-407E-A947-70E740481C1C}">
+                          <a14:useLocalDpi xmlns:a14="http://schemas.microsoft.com/office/drawing/2010/main" val="0"/>
+                        </a:ext>
+                      </a:extLst>
+                    </a:blip>
+                    <a:srcRect/>
+                    <a:stretch>
+                      <a:fillRect/>
+                    </a:stretch>
+                  </pic:blipFill>
+                  <pic:spPr bwMode="auto">
+                    <a:xfrm>
+                      <a:off x="0" y="0"/>
+                      <a:ext cx="5277485" cy="200025"/>
+                    </a:xfrm>
+                    <a:prstGeom prst="rect">
+                      <a:avLst/>
+                    </a:prstGeom>
+                    <a:noFill/>
+                  </pic:spPr>
+                </pic:pic>
+              </a:graphicData>
+            </a:graphic>
+          </wp:inline>
+        </w:drawing>
+      </w:r>
+    </w:p>
+    <w:p>
+      <w:pPr>
+        <w:rPr>
+          <w:i/>
+        </w:rPr>
+      </w:pPr>
+    </w:p>
+    <w:p>
+      <w:pPr>
+        <w:rPr>
+          <w:i/>
+        </w:rPr>
+      </w:pPr>
+      <w:r>
+        <w:rPr>
+          <w:i/>
+        </w:rPr>
+        <w:t xml:space="preserve">123-Estamos informando ao informando ao navegador ao fazer uma pesquisa a onde possui </w:t>
+      </w:r>
+      <w:proofErr w:type="gramStart"/>
+      <w:r>
+        <w:rPr>
+          <w:i/>
+        </w:rPr>
+        <w:t>um tela</w:t>
+      </w:r>
+      <w:proofErr w:type="gramEnd"/>
+      <w:r>
+        <w:rPr>
+          <w:i/>
+        </w:rPr>
+        <w:t xml:space="preserve"> que a largura máxima seja 480px precisa entregar seguintes configurações.</w:t>
+      </w:r>
+    </w:p>
+    <w:p>
+      <w:pPr>
+        <w:rPr>
+          <w:i/>
+        </w:rPr>
+      </w:pPr>
+      <w:r>
+        <w:rPr>
+          <w:i/>
+          <w:noProof/>
+        </w:rPr>
+        <w:drawing>
+          <wp:inline distT="0" distB="0" distL="0" distR="0" wp14:anchorId="5F4E56E9">
+            <wp:extent cx="3241963" cy="725017"/>
+            <wp:effectExtent l="0" t="0" r="0" b="0"/>
+            <wp:docPr id="168" name="Imagem 168"/>
+            <wp:cNvGraphicFramePr>
+              <a:graphicFrameLocks xmlns:a="http://schemas.openxmlformats.org/drawingml/2006/main" noChangeAspect="1"/>
+            </wp:cNvGraphicFramePr>
+            <a:graphic xmlns:a="http://schemas.openxmlformats.org/drawingml/2006/main">
+              <a:graphicData uri="http://schemas.openxmlformats.org/drawingml/2006/picture">
+                <pic:pic xmlns:pic="http://schemas.openxmlformats.org/drawingml/2006/picture">
+                  <pic:nvPicPr>
+                    <pic:cNvPr id="0" name="Picture 3"/>
+                    <pic:cNvPicPr>
+                      <a:picLocks noChangeAspect="1" noChangeArrowheads="1"/>
+                    </pic:cNvPicPr>
+                  </pic:nvPicPr>
+                  <pic:blipFill>
+                    <a:blip r:embed="rId177">
+                      <a:extLst>
+                        <a:ext uri="{28A0092B-C50C-407E-A947-70E740481C1C}">
+                          <a14:useLocalDpi xmlns:a14="http://schemas.microsoft.com/office/drawing/2010/main" val="0"/>
+                        </a:ext>
+                      </a:extLst>
+                    </a:blip>
+                    <a:srcRect/>
+                    <a:stretch>
+                      <a:fillRect/>
+                    </a:stretch>
+                  </pic:blipFill>
+                  <pic:spPr bwMode="auto">
+                    <a:xfrm>
+                      <a:off x="0" y="0"/>
+                      <a:ext cx="3266152" cy="730427"/>
+                    </a:xfrm>
+                    <a:prstGeom prst="rect">
+                      <a:avLst/>
+                    </a:prstGeom>
+                    <a:noFill/>
+                  </pic:spPr>
+                </pic:pic>
+              </a:graphicData>
+            </a:graphic>
+          </wp:inline>
+        </w:drawing>
+      </w:r>
+    </w:p>
+    <w:p>
+      <w:pPr>
+        <w:rPr>
+          <w:i/>
+        </w:rPr>
+      </w:pPr>
+    </w:p>
+    <w:p>
+      <w:pPr>
+        <w:rPr>
+          <w:i/>
+        </w:rPr>
+      </w:pPr>
+      <w:r>
+        <w:rPr>
+          <w:i/>
+        </w:rPr>
+        <w:t>124-</w:t>
+      </w:r>
+      <w:r>
+        <w:rPr>
+          <w:i/>
+        </w:rPr>
+        <w:t xml:space="preserve">A principal tática </w:t>
+      </w:r>
+      <w:proofErr w:type="gramStart"/>
+      <w:r>
+        <w:rPr>
+          <w:i/>
+        </w:rPr>
+        <w:t>para  não</w:t>
+      </w:r>
+      <w:proofErr w:type="gramEnd"/>
+      <w:r>
+        <w:rPr>
+          <w:i/>
+        </w:rPr>
+        <w:t xml:space="preserve"> perder muito tempo criando o layout responsivo e usar medidas proporcional para tudo ao criar uma site com layout que se adapte sempre</w:t>
+      </w:r>
+    </w:p>
+    <w:p>
+      <w:pPr>
+        <w:rPr>
+          <w:i/>
+        </w:rPr>
+      </w:pPr>
+    </w:p>
+    <w:p>
+      <w:pPr>
+        <w:rPr>
+          <w:i/>
+        </w:rPr>
+      </w:pPr>
+      <w:proofErr w:type="gramStart"/>
+      <w:r>
+        <w:rPr>
+          <w:i/>
+        </w:rPr>
+        <w:t>Ou seja</w:t>
+      </w:r>
+      <w:proofErr w:type="gramEnd"/>
+      <w:r>
+        <w:rPr>
+          <w:i/>
+        </w:rPr>
+        <w:t xml:space="preserve"> ao observamos o código a baixo podemos deduzir que a nossa pagina index.html está bem estruturada com </w:t>
+      </w:r>
+      <w:proofErr w:type="spellStart"/>
+      <w:r>
+        <w:rPr>
+          <w:i/>
+        </w:rPr>
+        <w:t>varias</w:t>
+      </w:r>
+      <w:proofErr w:type="spellEnd"/>
+      <w:r>
+        <w:rPr>
+          <w:i/>
+        </w:rPr>
+        <w:t xml:space="preserve"> divisões com medidas como por exemplo.</w:t>
+      </w:r>
+    </w:p>
+    <w:p>
+      <w:pPr>
+        <w:rPr>
+          <w:i/>
+        </w:rPr>
+      </w:pPr>
+      <w:proofErr w:type="gramStart"/>
+      <w:r>
+        <w:rPr>
+          <w:i/>
+        </w:rPr>
+        <w:t>.caixa</w:t>
+      </w:r>
+      <w:proofErr w:type="gramEnd"/>
+      <w:r>
+        <w:rPr>
+          <w:i/>
+        </w:rPr>
+        <w:t xml:space="preserve"> (</w:t>
+      </w:r>
+      <w:proofErr w:type="spellStart"/>
+      <w:r>
+        <w:rPr>
+          <w:i/>
+        </w:rPr>
+        <w:t>div</w:t>
+      </w:r>
+      <w:proofErr w:type="spellEnd"/>
+      <w:r>
+        <w:rPr>
+          <w:i/>
+        </w:rPr>
+        <w:t xml:space="preserve"> menu com tamanho 940px)</w:t>
+      </w:r>
+    </w:p>
+    <w:p>
+      <w:pPr>
+        <w:rPr>
+          <w:i/>
+        </w:rPr>
+      </w:pPr>
+      <w:proofErr w:type="gramStart"/>
+      <w:r>
+        <w:rPr>
+          <w:i/>
+        </w:rPr>
+        <w:t>.principal</w:t>
+      </w:r>
+      <w:proofErr w:type="gramEnd"/>
+      <w:r>
+        <w:rPr>
+          <w:i/>
+        </w:rPr>
+        <w:t xml:space="preserve"> (</w:t>
+      </w:r>
+      <w:proofErr w:type="spellStart"/>
+      <w:r>
+        <w:rPr>
+          <w:i/>
+        </w:rPr>
+        <w:t>div</w:t>
+      </w:r>
+      <w:proofErr w:type="spellEnd"/>
+      <w:r>
+        <w:rPr>
+          <w:i/>
+        </w:rPr>
+        <w:t xml:space="preserve"> da seção principal da </w:t>
+      </w:r>
+      <w:proofErr w:type="spellStart"/>
+      <w:r>
+        <w:rPr>
+          <w:i/>
+        </w:rPr>
+        <w:t>pagina</w:t>
+      </w:r>
+      <w:proofErr w:type="spellEnd"/>
+      <w:r>
+        <w:rPr>
+          <w:i/>
+        </w:rPr>
+        <w:t xml:space="preserve"> com medida 940px)</w:t>
+      </w:r>
+    </w:p>
+    <w:p>
+      <w:pPr>
+        <w:rPr>
+          <w:i/>
+        </w:rPr>
+      </w:pPr>
+    </w:p>
+    <w:p>
+      <w:pPr>
+        <w:rPr>
+          <w:i/>
+        </w:rPr>
+      </w:pPr>
+      <w:proofErr w:type="gramStart"/>
+      <w:r>
+        <w:rPr>
+          <w:i/>
+        </w:rPr>
+        <w:t>.mapa</w:t>
+      </w:r>
+      <w:proofErr w:type="gramEnd"/>
+      <w:r>
+        <w:rPr>
+          <w:i/>
+        </w:rPr>
+        <w:t>(</w:t>
+      </w:r>
+      <w:proofErr w:type="spellStart"/>
+      <w:r>
+        <w:rPr>
+          <w:i/>
+        </w:rPr>
+        <w:t>section</w:t>
+      </w:r>
+      <w:proofErr w:type="spellEnd"/>
+      <w:r>
+        <w:rPr>
+          <w:i/>
+        </w:rPr>
+        <w:t xml:space="preserve"> do mapa com medida 940px)</w:t>
+      </w:r>
+    </w:p>
+    <w:p>
+      <w:pPr>
+        <w:rPr>
+          <w:i/>
+        </w:rPr>
+      </w:pPr>
+      <w:r>
+        <w:rPr>
+          <w:i/>
+        </w:rPr>
+        <w:t xml:space="preserve">Colocamos uma medida para toda divisão da nossa pagina tornando fácil para a </w:t>
+      </w:r>
+      <w:proofErr w:type="spellStart"/>
+      <w:r>
+        <w:rPr>
+          <w:i/>
+        </w:rPr>
+        <w:t>pagina</w:t>
+      </w:r>
+      <w:proofErr w:type="spellEnd"/>
+      <w:r>
+        <w:rPr>
+          <w:i/>
+        </w:rPr>
+        <w:t xml:space="preserve"> ficar responsiva)</w:t>
+      </w:r>
+    </w:p>
+    <w:p>
+      <w:pPr>
+        <w:rPr>
+          <w:i/>
+        </w:rPr>
+      </w:pPr>
+      <w:r>
+        <w:rPr>
+          <w:i/>
+        </w:rPr>
+        <w:t>.</w:t>
+      </w:r>
+      <w:r>
+        <w:rPr>
+          <w:i/>
+          <w:noProof/>
+        </w:rPr>
+        <w:drawing>
+          <wp:inline distT="0" distB="0" distL="0" distR="0" wp14:anchorId="07B463CD">
+            <wp:extent cx="5258435" cy="1314450"/>
+            <wp:effectExtent l="0" t="0" r="0" b="0"/>
+            <wp:docPr id="169" name="Imagem 169"/>
+            <wp:cNvGraphicFramePr>
+              <a:graphicFrameLocks xmlns:a="http://schemas.openxmlformats.org/drawingml/2006/main" noChangeAspect="1"/>
+            </wp:cNvGraphicFramePr>
+            <a:graphic xmlns:a="http://schemas.openxmlformats.org/drawingml/2006/main">
+              <a:graphicData uri="http://schemas.openxmlformats.org/drawingml/2006/picture">
+                <pic:pic xmlns:pic="http://schemas.openxmlformats.org/drawingml/2006/picture">
+                  <pic:nvPicPr>
+                    <pic:cNvPr id="0" name="Picture 4"/>
+                    <pic:cNvPicPr>
+                      <a:picLocks noChangeAspect="1" noChangeArrowheads="1"/>
+                    </pic:cNvPicPr>
+                  </pic:nvPicPr>
+                  <pic:blipFill>
+                    <a:blip r:embed="rId178">
+                      <a:extLst>
+                        <a:ext uri="{28A0092B-C50C-407E-A947-70E740481C1C}">
+                          <a14:useLocalDpi xmlns:a14="http://schemas.microsoft.com/office/drawing/2010/main" val="0"/>
+                        </a:ext>
+                      </a:extLst>
+                    </a:blip>
+                    <a:srcRect/>
+                    <a:stretch>
+                      <a:fillRect/>
+                    </a:stretch>
+                  </pic:blipFill>
+                  <pic:spPr bwMode="auto">
+                    <a:xfrm>
+                      <a:off x="0" y="0"/>
+                      <a:ext cx="5258435" cy="1314450"/>
+                    </a:xfrm>
+                    <a:prstGeom prst="rect">
+                      <a:avLst/>
+                    </a:prstGeom>
+                    <a:noFill/>
+                  </pic:spPr>
+                </pic:pic>
+              </a:graphicData>
+            </a:graphic>
+          </wp:inline>
+        </w:drawing>
+      </w:r>
+    </w:p>
+    <w:p>
+      <w:pPr>
+        <w:rPr>
+          <w:i/>
+        </w:rPr>
+      </w:pPr>
+    </w:p>
+    <w:p>
+      <w:pPr>
+        <w:jc w:val="both"/>
+        <w:rPr>
+          <w:i/>
+        </w:rPr>
+      </w:pPr>
+      <w:r>
+        <w:rPr>
+          <w:i/>
+        </w:rPr>
+        <w:t xml:space="preserve"> </w:t>
+      </w:r>
+      <w:r>
+        <w:rPr>
+          <w:i/>
+        </w:rPr>
+        <w:t xml:space="preserve">125-O vídeo estava com uma largura fixa no </w:t>
+      </w:r>
+      <w:proofErr w:type="spellStart"/>
+      <w:r>
+        <w:rPr>
+          <w:i/>
+        </w:rPr>
+        <w:t>html</w:t>
+      </w:r>
+      <w:proofErr w:type="spellEnd"/>
+      <w:r>
+        <w:rPr>
+          <w:i/>
+        </w:rPr>
+        <w:t xml:space="preserve"> por isso trocamos o valor para </w:t>
+      </w:r>
+      <w:proofErr w:type="spellStart"/>
+      <w:r>
+        <w:rPr>
+          <w:i/>
+        </w:rPr>
+        <w:t>width</w:t>
+      </w:r>
+      <w:proofErr w:type="spellEnd"/>
+      <w:r>
+        <w:rPr>
+          <w:i/>
+        </w:rPr>
+        <w:t xml:space="preserve"> 100% e o vídeo ficou ajustado para o tamanho de tela do celular</w:t>
+      </w:r>
+    </w:p>
+    <w:p>
+      <w:pPr>
+        <w:jc w:val="both"/>
+        <w:rPr>
+          <w:i/>
+        </w:rPr>
+      </w:pPr>
+      <w:r>
+        <w:rPr>
+          <w:i/>
+          <w:noProof/>
+        </w:rPr>
+        <w:drawing>
+          <wp:inline distT="0" distB="0" distL="0" distR="0" wp14:anchorId="3F51A176">
+            <wp:extent cx="5546552" cy="1000870"/>
+            <wp:effectExtent l="0" t="0" r="0" b="8890"/>
+            <wp:docPr id="170" name="Imagem 170"/>
+            <wp:cNvGraphicFramePr>
+              <a:graphicFrameLocks xmlns:a="http://schemas.openxmlformats.org/drawingml/2006/main" noChangeAspect="1"/>
+            </wp:cNvGraphicFramePr>
+            <a:graphic xmlns:a="http://schemas.openxmlformats.org/drawingml/2006/main">
+              <a:graphicData uri="http://schemas.openxmlformats.org/drawingml/2006/picture">
+                <pic:pic xmlns:pic="http://schemas.openxmlformats.org/drawingml/2006/picture">
+                  <pic:nvPicPr>
+                    <pic:cNvPr id="0" name="Picture 5"/>
+                    <pic:cNvPicPr>
+                      <a:picLocks noChangeAspect="1" noChangeArrowheads="1"/>
+                    </pic:cNvPicPr>
+                  </pic:nvPicPr>
+                  <pic:blipFill>
+                    <a:blip r:embed="rId179">
+                      <a:extLst>
+                        <a:ext uri="{28A0092B-C50C-407E-A947-70E740481C1C}">
+                          <a14:useLocalDpi xmlns:a14="http://schemas.microsoft.com/office/drawing/2010/main" val="0"/>
+                        </a:ext>
+                      </a:extLst>
+                    </a:blip>
+                    <a:srcRect/>
+                    <a:stretch>
+                      <a:fillRect/>
+                    </a:stretch>
+                  </pic:blipFill>
+                  <pic:spPr bwMode="auto">
+                    <a:xfrm>
+                      <a:off x="0" y="0"/>
+                      <a:ext cx="5592143" cy="1009097"/>
+                    </a:xfrm>
+                    <a:prstGeom prst="rect">
+                      <a:avLst/>
+                    </a:prstGeom>
+                    <a:noFill/>
+                  </pic:spPr>
+                </pic:pic>
+              </a:graphicData>
+            </a:graphic>
+          </wp:inline>
+        </w:drawing>
+      </w:r>
+    </w:p>
+    <w:p>
+      <w:pPr>
+        <w:jc w:val="both"/>
+        <w:rPr>
+          <w:i/>
+        </w:rPr>
+      </w:pPr>
+    </w:p>
+    <w:p>
+      <w:pPr>
+        <w:jc w:val="both"/>
+        <w:rPr>
+          <w:i/>
+        </w:rPr>
+      </w:pPr>
+      <w:r>
+        <w:rPr>
+          <w:i/>
+        </w:rPr>
+        <w:t xml:space="preserve">126-Para </w:t>
+      </w:r>
+      <w:proofErr w:type="spellStart"/>
+      <w:r>
+        <w:rPr>
+          <w:i/>
+        </w:rPr>
+        <w:t>centaliza</w:t>
+      </w:r>
+      <w:proofErr w:type="spellEnd"/>
+      <w:r>
+        <w:rPr>
+          <w:i/>
+        </w:rPr>
+        <w:t xml:space="preserve"> o logo que </w:t>
+      </w:r>
+      <w:proofErr w:type="gramStart"/>
+      <w:r>
+        <w:rPr>
+          <w:i/>
+        </w:rPr>
+        <w:t>esta</w:t>
+      </w:r>
+      <w:proofErr w:type="gramEnd"/>
+      <w:r>
+        <w:rPr>
+          <w:i/>
+        </w:rPr>
+        <w:t xml:space="preserve"> dentro do h1 utilizamos o seguinte comando:</w:t>
+      </w:r>
+    </w:p>
+    <w:p>
+      <w:pPr>
+        <w:jc w:val="both"/>
+        <w:rPr>
+          <w:i/>
+        </w:rPr>
+      </w:pPr>
+      <w:r>
+        <w:rPr>
+          <w:i/>
+          <w:noProof/>
+        </w:rPr>
+        <w:drawing>
+          <wp:inline distT="0" distB="0" distL="0" distR="0" wp14:anchorId="07F706F7">
+            <wp:extent cx="5220335" cy="2085975"/>
+            <wp:effectExtent l="0" t="0" r="0" b="9525"/>
+            <wp:docPr id="171" name="Imagem 171"/>
+            <wp:cNvGraphicFramePr>
+              <a:graphicFrameLocks xmlns:a="http://schemas.openxmlformats.org/drawingml/2006/main" noChangeAspect="1"/>
+            </wp:cNvGraphicFramePr>
+            <a:graphic xmlns:a="http://schemas.openxmlformats.org/drawingml/2006/main">
+              <a:graphicData uri="http://schemas.openxmlformats.org/drawingml/2006/picture">
+                <pic:pic xmlns:pic="http://schemas.openxmlformats.org/drawingml/2006/picture">
+                  <pic:nvPicPr>
+                    <pic:cNvPr id="0" name="Picture 6"/>
+                    <pic:cNvPicPr>
+                      <a:picLocks noChangeAspect="1" noChangeArrowheads="1"/>
+                    </pic:cNvPicPr>
+                  </pic:nvPicPr>
+                  <pic:blipFill>
+                    <a:blip r:embed="rId180">
+                      <a:extLst>
+                        <a:ext uri="{28A0092B-C50C-407E-A947-70E740481C1C}">
+                          <a14:useLocalDpi xmlns:a14="http://schemas.microsoft.com/office/drawing/2010/main" val="0"/>
+                        </a:ext>
+                      </a:extLst>
+                    </a:blip>
+                    <a:srcRect/>
+                    <a:stretch>
+                      <a:fillRect/>
+                    </a:stretch>
+                  </pic:blipFill>
+                  <pic:spPr bwMode="auto">
+                    <a:xfrm>
+                      <a:off x="0" y="0"/>
+                      <a:ext cx="5220335" cy="2085975"/>
+                    </a:xfrm>
+                    <a:prstGeom prst="rect">
+                      <a:avLst/>
+                    </a:prstGeom>
+                    <a:noFill/>
+                  </pic:spPr>
+                </pic:pic>
+              </a:graphicData>
+            </a:graphic>
+          </wp:inline>
+        </w:drawing>
+      </w:r>
+    </w:p>
+    <w:p>
+      <w:pPr>
+        <w:jc w:val="both"/>
+        <w:rPr>
+          <w:i/>
+        </w:rPr>
+      </w:pPr>
+      <w:r>
+        <w:rPr>
+          <w:i/>
+        </w:rPr>
+        <w:t xml:space="preserve">127-Para ajustar o menu utilizamos o </w:t>
+      </w:r>
+      <w:proofErr w:type="spellStart"/>
+      <w:r>
+        <w:rPr>
+          <w:i/>
+        </w:rPr>
+        <w:t>position:static</w:t>
+      </w:r>
+      <w:proofErr w:type="spellEnd"/>
+      <w:r>
+        <w:rPr>
+          <w:i/>
+        </w:rPr>
+        <w:t xml:space="preserve"> onde queríamos que ele ficasse em baixo do logo conforme está no </w:t>
+      </w:r>
+      <w:proofErr w:type="spellStart"/>
+      <w:r>
+        <w:rPr>
+          <w:i/>
+        </w:rPr>
+        <w:t>html</w:t>
+      </w:r>
+      <w:proofErr w:type="spellEnd"/>
+      <w:r>
+        <w:rPr>
+          <w:i/>
+        </w:rPr>
+        <w:t xml:space="preserve"> com isso substituímos o </w:t>
+      </w:r>
+      <w:proofErr w:type="spellStart"/>
+      <w:r>
+        <w:rPr>
+          <w:i/>
+        </w:rPr>
+        <w:t>position:absolute</w:t>
+      </w:r>
+      <w:proofErr w:type="spellEnd"/>
+      <w:r>
+        <w:rPr>
+          <w:i/>
+        </w:rPr>
+        <w:t xml:space="preserve"> conforme código abaixo: </w:t>
+      </w:r>
+    </w:p>
+    <w:p>
+      <w:pPr>
+        <w:jc w:val="both"/>
+        <w:rPr>
+          <w:i/>
+        </w:rPr>
+      </w:pPr>
+      <w:r>
+        <w:rPr>
+          <w:i/>
+        </w:rPr>
+        <w:drawing>
+          <wp:inline distT="0" distB="0" distL="0" distR="0" wp14:anchorId="0D33F87E" wp14:editId="56DC77BF">
+            <wp:extent cx="5400040" cy="1957705"/>
+            <wp:effectExtent l="0" t="0" r="0" b="4445"/>
+            <wp:docPr id="172" name="Imagem 172"/>
+            <wp:cNvGraphicFramePr>
+              <a:graphicFrameLocks xmlns:a="http://schemas.openxmlformats.org/drawingml/2006/main" noChangeAspect="1"/>
+            </wp:cNvGraphicFramePr>
+            <a:graphic xmlns:a="http://schemas.openxmlformats.org/drawingml/2006/main">
+              <a:graphicData uri="http://schemas.openxmlformats.org/drawingml/2006/picture">
+                <pic:pic xmlns:pic="http://schemas.openxmlformats.org/drawingml/2006/picture">
+                  <pic:nvPicPr>
+                    <pic:cNvPr id="1" name=""/>
+                    <pic:cNvPicPr/>
+                  </pic:nvPicPr>
+                  <pic:blipFill>
+                    <a:blip r:embed="rId181"/>
+                    <a:stretch>
+                      <a:fillRect/>
+                    </a:stretch>
+                  </pic:blipFill>
+                  <pic:spPr>
+                    <a:xfrm>
+                      <a:off x="0" y="0"/>
+                      <a:ext cx="5400040" cy="1957705"/>
+                    </a:xfrm>
+                    <a:prstGeom prst="rect">
+                      <a:avLst/>
+                    </a:prstGeom>
+                  </pic:spPr>
+                </pic:pic>
+              </a:graphicData>
+            </a:graphic>
+          </wp:inline>
+        </w:drawing>
+      </w:r>
+    </w:p>
+    <w:p>
+      <w:pPr>
+        <w:jc w:val="both"/>
+        <w:rPr>
+          <w:i/>
+        </w:rPr>
+      </w:pPr>
+    </w:p>
+    <w:p>
+      <w:pPr>
+        <w:jc w:val="both"/>
+        <w:rPr>
+          <w:i/>
+        </w:rPr>
+      </w:pPr>
+      <w:r>
+        <w:rPr>
+          <w:i/>
+        </w:rPr>
+        <w:t>128-Para melhorar a visualização no celular da lista benefícios e da imagem colocamos uma em baixo da outra utilizando esse código:</w:t>
+      </w:r>
+    </w:p>
+    <w:p>
+      <w:pPr>
+        <w:jc w:val="both"/>
+        <w:rPr>
+          <w:i/>
+        </w:rPr>
+      </w:pPr>
+      <w:r>
+        <w:rPr>
+          <w:i/>
+          <w:noProof/>
+        </w:rPr>
+        <w:drawing>
+          <wp:inline distT="0" distB="0" distL="0" distR="0" wp14:anchorId="03A078A9">
+            <wp:extent cx="3341915" cy="653143"/>
+            <wp:effectExtent l="0" t="0" r="0" b="0"/>
+            <wp:docPr id="173" name="Imagem 173"/>
+            <wp:cNvGraphicFramePr>
+              <a:graphicFrameLocks xmlns:a="http://schemas.openxmlformats.org/drawingml/2006/main" noChangeAspect="1"/>
+            </wp:cNvGraphicFramePr>
+            <a:graphic xmlns:a="http://schemas.openxmlformats.org/drawingml/2006/main">
+              <a:graphicData uri="http://schemas.openxmlformats.org/drawingml/2006/picture">
+                <pic:pic xmlns:pic="http://schemas.openxmlformats.org/drawingml/2006/picture">
+                  <pic:nvPicPr>
+                    <pic:cNvPr id="0" name="Picture 2"/>
+                    <pic:cNvPicPr>
+                      <a:picLocks noChangeAspect="1" noChangeArrowheads="1"/>
+                    </pic:cNvPicPr>
+                  </pic:nvPicPr>
+                  <pic:blipFill>
+                    <a:blip r:embed="rId182">
+                      <a:extLst>
+                        <a:ext uri="{28A0092B-C50C-407E-A947-70E740481C1C}">
+                          <a14:useLocalDpi xmlns:a14="http://schemas.microsoft.com/office/drawing/2010/main" val="0"/>
+                        </a:ext>
+                      </a:extLst>
+                    </a:blip>
+                    <a:srcRect/>
+                    <a:stretch>
+                      <a:fillRect/>
+                    </a:stretch>
+                  </pic:blipFill>
+                  <pic:spPr bwMode="auto">
+                    <a:xfrm>
+                      <a:off x="0" y="0"/>
+                      <a:ext cx="3399108" cy="664321"/>
+                    </a:xfrm>
+                    <a:prstGeom prst="rect">
+                      <a:avLst/>
+                    </a:prstGeom>
+                    <a:noFill/>
+                  </pic:spPr>
+                </pic:pic>
+              </a:graphicData>
+            </a:graphic>
+          </wp:inline>
+        </w:drawing>
+      </w:r>
+    </w:p>
+    <w:p>
+      <w:pPr>
+        <w:jc w:val="both"/>
+        <w:rPr>
+          <w:i/>
+        </w:rPr>
+      </w:pPr>
+      <w:r>
+        <w:rPr>
+          <w:i/>
+          <w:noProof/>
+        </w:rPr>
+        <w:drawing>
+          <wp:inline distT="0" distB="0" distL="0" distR="0" wp14:anchorId="766E2017">
+            <wp:extent cx="2636322" cy="2791460"/>
+            <wp:effectExtent l="0" t="0" r="0" b="8890"/>
+            <wp:docPr id="174" name="Imagem 174"/>
+            <wp:cNvGraphicFramePr>
+              <a:graphicFrameLocks xmlns:a="http://schemas.openxmlformats.org/drawingml/2006/main" noChangeAspect="1"/>
+            </wp:cNvGraphicFramePr>
+            <a:graphic xmlns:a="http://schemas.openxmlformats.org/drawingml/2006/main">
+              <a:graphicData uri="http://schemas.openxmlformats.org/drawingml/2006/picture">
+                <pic:pic xmlns:pic="http://schemas.openxmlformats.org/drawingml/2006/picture">
+                  <pic:nvPicPr>
+                    <pic:cNvPr id="0" name="Picture 3"/>
+                    <pic:cNvPicPr>
+                      <a:picLocks noChangeAspect="1" noChangeArrowheads="1"/>
+                    </pic:cNvPicPr>
+                  </pic:nvPicPr>
+                  <pic:blipFill>
+                    <a:blip r:embed="rId183">
+                      <a:extLst>
+                        <a:ext uri="{28A0092B-C50C-407E-A947-70E740481C1C}">
+                          <a14:useLocalDpi xmlns:a14="http://schemas.microsoft.com/office/drawing/2010/main" val="0"/>
+                        </a:ext>
+                      </a:extLst>
+                    </a:blip>
+                    <a:srcRect/>
+                    <a:stretch>
+                      <a:fillRect/>
+                    </a:stretch>
+                  </pic:blipFill>
+                  <pic:spPr bwMode="auto">
+                    <a:xfrm>
+                      <a:off x="0" y="0"/>
+                      <a:ext cx="2648657" cy="2804521"/>
+                    </a:xfrm>
+                    <a:prstGeom prst="rect">
+                      <a:avLst/>
+                    </a:prstGeom>
+                    <a:noFill/>
+                  </pic:spPr>
+                </pic:pic>
+              </a:graphicData>
+            </a:graphic>
+          </wp:inline>
+        </w:drawing>
+      </w:r>
+    </w:p>
+    <w:p>
+      <w:pPr>
+        <w:jc w:val="both"/>
+      </w:pPr>
+    </w:p>
+    <w:p>
+      <w:pPr>
+        <w:jc w:val="both"/>
+      </w:pPr>
+    </w:p>
+    <w:p>
+      <w:pPr>
+        <w:jc w:val="both"/>
+      </w:pPr>
+    </w:p>
+    <w:p>
+      <w:pPr>
+        <w:jc w:val="both"/>
+      </w:pPr>
+    </w:p>
+    <w:p>
+      <w:pPr>
+        <w:jc w:val="both"/>
+      </w:pPr>
+    </w:p>
+    <w:p>
+      <w:pPr>
+        <w:jc w:val="both"/>
+      </w:pPr>
+      <w:r>
+        <w:t xml:space="preserve">129-Deixando a nossa pagina produto responsiva para celular no arquivo produtos.css no final colocamos o </w:t>
+      </w:r>
+      <w:proofErr w:type="gramStart"/>
+      <w:r>
+        <w:t>seguintes código</w:t>
+      </w:r>
+      <w:proofErr w:type="gramEnd"/>
+      <w:r>
+        <w:t xml:space="preserve"> para começar a começar a deixar a nossa pagina pronta para ser visualizado pelo celular.</w:t>
+      </w:r>
+    </w:p>
+    <w:p>
+      <w:pPr>
+        <w:jc w:val="both"/>
+      </w:pPr>
+      <w:r>
+        <w:t xml:space="preserve"> </w:t>
+      </w:r>
+      <w:r>
+        <w:rPr>
+          <w:noProof/>
+        </w:rPr>
+        <w:drawing>
+          <wp:inline distT="0" distB="0" distL="0" distR="0" wp14:anchorId="492D1914">
+            <wp:extent cx="2610485" cy="1152525"/>
+            <wp:effectExtent l="0" t="0" r="0" b="9525"/>
+            <wp:docPr id="175" name="Imagem 175"/>
+            <wp:cNvGraphicFramePr>
+              <a:graphicFrameLocks xmlns:a="http://schemas.openxmlformats.org/drawingml/2006/main" noChangeAspect="1"/>
+            </wp:cNvGraphicFramePr>
+            <a:graphic xmlns:a="http://schemas.openxmlformats.org/drawingml/2006/main">
+              <a:graphicData uri="http://schemas.openxmlformats.org/drawingml/2006/picture">
+                <pic:pic xmlns:pic="http://schemas.openxmlformats.org/drawingml/2006/picture">
+                  <pic:nvPicPr>
+                    <pic:cNvPr id="0" name="Picture 4"/>
+                    <pic:cNvPicPr>
+                      <a:picLocks noChangeAspect="1" noChangeArrowheads="1"/>
+                    </pic:cNvPicPr>
+                  </pic:nvPicPr>
+                  <pic:blipFill>
+                    <a:blip r:embed="rId184">
+                      <a:extLst>
+                        <a:ext uri="{28A0092B-C50C-407E-A947-70E740481C1C}">
+                          <a14:useLocalDpi xmlns:a14="http://schemas.microsoft.com/office/drawing/2010/main" val="0"/>
+                        </a:ext>
+                      </a:extLst>
+                    </a:blip>
+                    <a:srcRect/>
+                    <a:stretch>
+                      <a:fillRect/>
+                    </a:stretch>
+                  </pic:blipFill>
+                  <pic:spPr bwMode="auto">
+                    <a:xfrm>
+                      <a:off x="0" y="0"/>
+                      <a:ext cx="2610485" cy="1152525"/>
+                    </a:xfrm>
+                    <a:prstGeom prst="rect">
+                      <a:avLst/>
+                    </a:prstGeom>
+                    <a:noFill/>
+                  </pic:spPr>
+                </pic:pic>
+              </a:graphicData>
+            </a:graphic>
+          </wp:inline>
+        </w:drawing>
+      </w:r>
+    </w:p>
+    <w:p>
+      <w:pPr>
+        <w:jc w:val="both"/>
+      </w:pPr>
+    </w:p>
+    <w:p>
+      <w:pPr>
+        <w:jc w:val="both"/>
+      </w:pPr>
+      <w:r>
+        <w:t>130-</w:t>
+      </w:r>
+      <w:r>
+        <w:t>Centralizamos o logo utilizando o seguinte código abaixo</w:t>
+      </w:r>
+    </w:p>
+    <w:p>
+      <w:pPr>
+        <w:jc w:val="both"/>
+      </w:pPr>
+      <w:r>
+        <w:rPr>
+          <w:noProof/>
+        </w:rPr>
+        <w:drawing>
+          <wp:inline distT="0" distB="0" distL="0" distR="0" wp14:anchorId="16FE9948">
+            <wp:extent cx="2282743" cy="700644"/>
+            <wp:effectExtent l="0" t="0" r="3810" b="4445"/>
+            <wp:docPr id="176" name="Imagem 176"/>
+            <wp:cNvGraphicFramePr>
+              <a:graphicFrameLocks xmlns:a="http://schemas.openxmlformats.org/drawingml/2006/main" noChangeAspect="1"/>
+            </wp:cNvGraphicFramePr>
+            <a:graphic xmlns:a="http://schemas.openxmlformats.org/drawingml/2006/main">
+              <a:graphicData uri="http://schemas.openxmlformats.org/drawingml/2006/picture">
+                <pic:pic xmlns:pic="http://schemas.openxmlformats.org/drawingml/2006/picture">
+                  <pic:nvPicPr>
+                    <pic:cNvPr id="0" name="Picture 5"/>
+                    <pic:cNvPicPr>
+                      <a:picLocks noChangeAspect="1" noChangeArrowheads="1"/>
+                    </pic:cNvPicPr>
+                  </pic:nvPicPr>
+                  <pic:blipFill>
+                    <a:blip r:embed="rId185">
+                      <a:extLst>
+                        <a:ext uri="{28A0092B-C50C-407E-A947-70E740481C1C}">
+                          <a14:useLocalDpi xmlns:a14="http://schemas.microsoft.com/office/drawing/2010/main" val="0"/>
+                        </a:ext>
+                      </a:extLst>
+                    </a:blip>
+                    <a:srcRect/>
+                    <a:stretch>
+                      <a:fillRect/>
+                    </a:stretch>
+                  </pic:blipFill>
+                  <pic:spPr bwMode="auto">
+                    <a:xfrm>
+                      <a:off x="0" y="0"/>
+                      <a:ext cx="2301503" cy="706402"/>
+                    </a:xfrm>
+                    <a:prstGeom prst="rect">
+                      <a:avLst/>
+                    </a:prstGeom>
+                    <a:noFill/>
+                  </pic:spPr>
+                </pic:pic>
+              </a:graphicData>
+            </a:graphic>
+          </wp:inline>
+        </w:drawing>
+      </w:r>
+    </w:p>
+    <w:p>
+      <w:pPr>
+        <w:jc w:val="both"/>
+      </w:pPr>
+    </w:p>
+    <w:p>
+      <w:pPr>
+        <w:jc w:val="both"/>
+      </w:pPr>
+      <w:r>
+        <w:t>131-</w:t>
+      </w:r>
+      <w:r>
+        <w:t>P</w:t>
+      </w:r>
+      <w:r>
+        <w:t xml:space="preserve">ara colocar o menu a baixo do logo utilizamos </w:t>
+      </w:r>
+      <w:proofErr w:type="gramStart"/>
+      <w:r>
+        <w:t>o seguintes códigos</w:t>
+      </w:r>
+      <w:proofErr w:type="gramEnd"/>
+      <w:r>
+        <w:t>:</w:t>
+      </w:r>
+    </w:p>
+    <w:p>
+      <w:pPr>
+        <w:jc w:val="both"/>
+      </w:pPr>
+      <w:r>
+        <w:rPr>
+          <w:noProof/>
+        </w:rPr>
+        <w:drawing>
+          <wp:inline distT="0" distB="0" distL="0" distR="0" wp14:anchorId="4F4A6BB7">
+            <wp:extent cx="1755834" cy="945968"/>
+            <wp:effectExtent l="0" t="0" r="0" b="6985"/>
+            <wp:docPr id="177" name="Imagem 177"/>
+            <wp:cNvGraphicFramePr>
+              <a:graphicFrameLocks xmlns:a="http://schemas.openxmlformats.org/drawingml/2006/main" noChangeAspect="1"/>
+            </wp:cNvGraphicFramePr>
+            <a:graphic xmlns:a="http://schemas.openxmlformats.org/drawingml/2006/main">
+              <a:graphicData uri="http://schemas.openxmlformats.org/drawingml/2006/picture">
+                <pic:pic xmlns:pic="http://schemas.openxmlformats.org/drawingml/2006/picture">
+                  <pic:nvPicPr>
+                    <pic:cNvPr id="0" name="Picture 6"/>
+                    <pic:cNvPicPr>
+                      <a:picLocks noChangeAspect="1" noChangeArrowheads="1"/>
+                    </pic:cNvPicPr>
+                  </pic:nvPicPr>
+                  <pic:blipFill>
+                    <a:blip r:embed="rId186">
+                      <a:extLst>
+                        <a:ext uri="{28A0092B-C50C-407E-A947-70E740481C1C}">
+                          <a14:useLocalDpi xmlns:a14="http://schemas.microsoft.com/office/drawing/2010/main" val="0"/>
+                        </a:ext>
+                      </a:extLst>
+                    </a:blip>
+                    <a:srcRect/>
+                    <a:stretch>
+                      <a:fillRect/>
+                    </a:stretch>
+                  </pic:blipFill>
+                  <pic:spPr bwMode="auto">
+                    <a:xfrm>
+                      <a:off x="0" y="0"/>
+                      <a:ext cx="1779214" cy="958564"/>
+                    </a:xfrm>
+                    <a:prstGeom prst="rect">
+                      <a:avLst/>
+                    </a:prstGeom>
+                    <a:noFill/>
+                  </pic:spPr>
+                </pic:pic>
+              </a:graphicData>
+            </a:graphic>
+          </wp:inline>
+        </w:drawing>
+      </w:r>
+      <w:r>
+        <w:t xml:space="preserve">        </w:t>
+      </w:r>
+      <w:r>
+        <w:rPr>
+          <w:noProof/>
+        </w:rPr>
+        <w:drawing>
+          <wp:inline distT="0" distB="0" distL="0" distR="0" wp14:anchorId="7B759761">
+            <wp:extent cx="1981200" cy="1552575"/>
+            <wp:effectExtent l="0" t="0" r="0" b="9525"/>
+            <wp:docPr id="178" name="Imagem 178"/>
+            <wp:cNvGraphicFramePr>
+              <a:graphicFrameLocks xmlns:a="http://schemas.openxmlformats.org/drawingml/2006/main" noChangeAspect="1"/>
+            </wp:cNvGraphicFramePr>
+            <a:graphic xmlns:a="http://schemas.openxmlformats.org/drawingml/2006/main">
+              <a:graphicData uri="http://schemas.openxmlformats.org/drawingml/2006/picture">
+                <pic:pic xmlns:pic="http://schemas.openxmlformats.org/drawingml/2006/picture">
+                  <pic:nvPicPr>
+                    <pic:cNvPr id="0" name="Picture 7"/>
+                    <pic:cNvPicPr>
+                      <a:picLocks noChangeAspect="1" noChangeArrowheads="1"/>
+                    </pic:cNvPicPr>
+                  </pic:nvPicPr>
+                  <pic:blipFill>
+                    <a:blip r:embed="rId187">
+                      <a:extLst>
+                        <a:ext uri="{28A0092B-C50C-407E-A947-70E740481C1C}">
+                          <a14:useLocalDpi xmlns:a14="http://schemas.microsoft.com/office/drawing/2010/main" val="0"/>
+                        </a:ext>
+                      </a:extLst>
+                    </a:blip>
+                    <a:srcRect/>
+                    <a:stretch>
+                      <a:fillRect/>
+                    </a:stretch>
+                  </pic:blipFill>
+                  <pic:spPr bwMode="auto">
+                    <a:xfrm>
+                      <a:off x="0" y="0"/>
+                      <a:ext cx="1981200" cy="1552575"/>
+                    </a:xfrm>
+                    <a:prstGeom prst="rect">
+                      <a:avLst/>
+                    </a:prstGeom>
+                    <a:noFill/>
+                  </pic:spPr>
+                </pic:pic>
+              </a:graphicData>
+            </a:graphic>
+          </wp:inline>
+        </w:drawing>
+      </w:r>
+    </w:p>
+    <w:p>
+      <w:pPr>
+        <w:jc w:val="both"/>
+      </w:pPr>
+    </w:p>
+    <w:p>
+      <w:pPr>
+        <w:jc w:val="both"/>
+      </w:pPr>
+      <w:r>
+        <w:t>132-</w:t>
+      </w:r>
+      <w:r>
+        <w:t xml:space="preserve">Para deixa os itens </w:t>
+      </w:r>
+      <w:proofErr w:type="gramStart"/>
+      <w:r>
+        <w:t>do produtos responsivos</w:t>
+      </w:r>
+      <w:proofErr w:type="gramEnd"/>
+      <w:r>
+        <w:t xml:space="preserve"> utilizamos o seguinte código:</w:t>
+      </w:r>
+    </w:p>
+    <w:p>
+      <w:pPr>
+        <w:jc w:val="both"/>
+      </w:pPr>
+      <w:r>
+        <w:drawing>
+          <wp:inline distT="0" distB="0" distL="0" distR="0" wp14:anchorId="158F5779" wp14:editId="6E008F27">
+            <wp:extent cx="2162477" cy="2295845"/>
+            <wp:effectExtent l="0" t="0" r="9525" b="0"/>
+            <wp:docPr id="179" name="Imagem 179"/>
+            <wp:cNvGraphicFramePr>
+              <a:graphicFrameLocks xmlns:a="http://schemas.openxmlformats.org/drawingml/2006/main" noChangeAspect="1"/>
+            </wp:cNvGraphicFramePr>
+            <a:graphic xmlns:a="http://schemas.openxmlformats.org/drawingml/2006/main">
+              <a:graphicData uri="http://schemas.openxmlformats.org/drawingml/2006/picture">
+                <pic:pic xmlns:pic="http://schemas.openxmlformats.org/drawingml/2006/picture">
+                  <pic:nvPicPr>
+                    <pic:cNvPr id="1" name=""/>
+                    <pic:cNvPicPr/>
+                  </pic:nvPicPr>
+                  <pic:blipFill>
+                    <a:blip r:embed="rId188"/>
+                    <a:stretch>
+                      <a:fillRect/>
+                    </a:stretch>
+                  </pic:blipFill>
+                  <pic:spPr>
+                    <a:xfrm>
+                      <a:off x="0" y="0"/>
+                      <a:ext cx="2162477" cy="2295845"/>
+                    </a:xfrm>
+                    <a:prstGeom prst="rect">
+                      <a:avLst/>
+                    </a:prstGeom>
+                  </pic:spPr>
+                </pic:pic>
+              </a:graphicData>
+            </a:graphic>
+          </wp:inline>
+        </w:drawing>
       </w:r>
       <w:bookmarkStart w:id="0" w:name="_GoBack"/>
       <w:bookmarkEnd w:id="0"/>
-    </w:p>
-    <w:p>
-      <w:pPr>
-        <w:rPr>
-          <w:i/>
-        </w:rPr>
-      </w:pPr>
-    </w:p>
-    <w:p>
-      <w:pPr>
-        <w:ind w:left="360"/>
-        <w:rPr>
-          <w:i/>
-        </w:rPr>
-      </w:pPr>
-    </w:p>
-    <w:p>
-      <w:pPr>
-        <w:jc w:val="both"/>
-      </w:pPr>
-      <w:r>
-        <w:t xml:space="preserve"> </w:t>
-      </w:r>
     </w:p>
     <w:p>
       <w:pPr>
@@ -15655,12 +17246,30 @@
 </a:theme>
 </file>
 
+<file path=word/webextensions/taskpanes.xml><?xml version="1.0" encoding="utf-8"?>
+<wetp:taskpanes xmlns:wetp="http://schemas.microsoft.com/office/webextensions/taskpanes/2010/11">
+  <wetp:taskpane dockstate="right" visibility="0" width="350" row="1">
+    <wetp:webextensionref xmlns:r="http://schemas.openxmlformats.org/officeDocument/2006/relationships" r:id="rId1"/>
+  </wetp:taskpane>
+</wetp:taskpanes>
+</file>
+
+<file path=word/webextensions/webextension1.xml><?xml version="1.0" encoding="utf-8"?>
+<we:webextension xmlns:we="http://schemas.microsoft.com/office/webextensions/webextension/2010/11" id="{3260632B-0404-46B1-97C1-2954272E4AD9}">
+  <we:reference id="wa104099688" version="1.3.0.0" store="pt-BR" storeType="OMEX"/>
+  <we:alternateReferences/>
+  <we:properties/>
+  <we:bindings/>
+  <we:snapshot xmlns:r="http://schemas.openxmlformats.org/officeDocument/2006/relationships"/>
+</we:webextension>
+</file>
+
 <file path=customXml/item1.xml><?xml version="1.0" encoding="utf-8"?>
 <b:Sources xmlns:b="http://schemas.openxmlformats.org/officeDocument/2006/bibliography" xmlns="http://schemas.openxmlformats.org/officeDocument/2006/bibliography" SelectedStyle="\APASixthEditionOfficeOnline.xsl" StyleName="APA" Version="6"/>
 </file>
 
 <file path=customXml/itemProps1.xml><?xml version="1.0" encoding="utf-8"?>
-<ds:datastoreItem xmlns:ds="http://schemas.openxmlformats.org/officeDocument/2006/customXml" ds:itemID="{94D0ABAE-5E1E-43B9-8765-F8D476A75CC5}">
+<ds:datastoreItem xmlns:ds="http://schemas.openxmlformats.org/officeDocument/2006/customXml" ds:itemID="{7FF5F3BA-5983-4A27-B2E6-21DC69D68EBA}">
   <ds:schemaRefs>
     <ds:schemaRef ds:uri="http://schemas.openxmlformats.org/officeDocument/2006/bibliography"/>
   </ds:schemaRefs>

</xml_diff>

<commit_message>
atualização da aula 15/10/2026
</commit_message>
<xml_diff>
--- a/Apostila/Projeto Space for Men.docx
+++ b/Apostila/Projeto Space for Men.docx
@@ -15703,6 +15703,7 @@
       <w:r>
         <w:rPr>
           <w:i/>
+          <w:noProof/>
         </w:rPr>
         <w:drawing>
           <wp:inline distT="0" distB="0" distL="0" distR="0" wp14:anchorId="0D33F87E" wp14:editId="56DC77BF">
@@ -16215,6 +16216,9 @@
         <w:jc w:val="both"/>
       </w:pPr>
       <w:r>
+        <w:rPr>
+          <w:noProof/>
+        </w:rPr>
         <w:drawing>
           <wp:inline distT="0" distB="0" distL="0" distR="0" wp14:anchorId="158F5779" wp14:editId="6E008F27">
             <wp:extent cx="2162477" cy="2295845"/>
@@ -16251,21 +16255,459 @@
           </wp:inline>
         </w:drawing>
       </w:r>
+    </w:p>
+    <w:p>
+      <w:pPr>
+        <w:jc w:val="both"/>
+      </w:pPr>
+    </w:p>
+    <w:p>
+      <w:pPr>
+        <w:jc w:val="both"/>
+      </w:pPr>
+      <w:r>
+        <w:t>133-</w:t>
+      </w:r>
+      <w:proofErr w:type="gramStart"/>
+      <w:r>
+        <w:t>deixamos</w:t>
+      </w:r>
+      <w:proofErr w:type="gramEnd"/>
+      <w:r>
+        <w:t xml:space="preserve"> a pagina do contato responsiva para </w:t>
+      </w:r>
+      <w:r>
+        <w:t>celular utilizando os seguintes códigos:</w:t>
+      </w:r>
+    </w:p>
+    <w:p>
+      <w:pPr>
+        <w:jc w:val="both"/>
+      </w:pPr>
+    </w:p>
+    <w:p>
+      <w:pPr>
+        <w:pStyle w:val="PargrafodaLista"/>
+        <w:numPr>
+          <w:ilvl w:val="0"/>
+          <w:numId w:val="1"/>
+        </w:numPr>
+        <w:jc w:val="both"/>
+      </w:pPr>
+      <w:r>
+        <w:t>Menu do contato</w:t>
+      </w:r>
+    </w:p>
+    <w:p>
+      <w:pPr>
+        <w:pStyle w:val="PargrafodaLista"/>
+        <w:jc w:val="both"/>
+      </w:pPr>
+      <w:r>
+        <w:rPr>
+          <w:noProof/>
+        </w:rPr>
+        <w:drawing>
+          <wp:inline distT="0" distB="0" distL="0" distR="0" wp14:anchorId="4F9749F9" wp14:editId="35FC1604">
+            <wp:extent cx="2734057" cy="2172003"/>
+            <wp:effectExtent l="0" t="0" r="9525" b="0"/>
+            <wp:docPr id="180" name="Imagem 180"/>
+            <wp:cNvGraphicFramePr>
+              <a:graphicFrameLocks xmlns:a="http://schemas.openxmlformats.org/drawingml/2006/main" noChangeAspect="1"/>
+            </wp:cNvGraphicFramePr>
+            <a:graphic xmlns:a="http://schemas.openxmlformats.org/drawingml/2006/main">
+              <a:graphicData uri="http://schemas.openxmlformats.org/drawingml/2006/picture">
+                <pic:pic xmlns:pic="http://schemas.openxmlformats.org/drawingml/2006/picture">
+                  <pic:nvPicPr>
+                    <pic:cNvPr id="1" name=""/>
+                    <pic:cNvPicPr/>
+                  </pic:nvPicPr>
+                  <pic:blipFill>
+                    <a:blip r:embed="rId189"/>
+                    <a:stretch>
+                      <a:fillRect/>
+                    </a:stretch>
+                  </pic:blipFill>
+                  <pic:spPr>
+                    <a:xfrm>
+                      <a:off x="0" y="0"/>
+                      <a:ext cx="2734057" cy="2172003"/>
+                    </a:xfrm>
+                    <a:prstGeom prst="rect">
+                      <a:avLst/>
+                    </a:prstGeom>
+                  </pic:spPr>
+                </pic:pic>
+              </a:graphicData>
+            </a:graphic>
+          </wp:inline>
+        </w:drawing>
+      </w:r>
+    </w:p>
+    <w:p>
+      <w:pPr>
+        <w:jc w:val="both"/>
+      </w:pPr>
+    </w:p>
+    <w:p>
+      <w:pPr>
+        <w:jc w:val="both"/>
+      </w:pPr>
+      <w:r>
+        <w:t xml:space="preserve">No </w:t>
+      </w:r>
+      <w:proofErr w:type="spellStart"/>
+      <w:r>
+        <w:t>main</w:t>
+      </w:r>
+      <w:proofErr w:type="spellEnd"/>
+      <w:r>
+        <w:t xml:space="preserve"> colocamos a largura, seja automática para cada tamanho do celular </w:t>
+      </w:r>
+    </w:p>
+    <w:p>
+      <w:pPr>
+        <w:jc w:val="both"/>
+      </w:pPr>
+      <w:r>
+        <w:t>E demos um espaço para esquerda.</w:t>
+      </w:r>
+    </w:p>
+    <w:p>
+      <w:pPr>
+        <w:jc w:val="both"/>
+      </w:pPr>
+      <w:r>
+        <w:rPr>
+          <w:noProof/>
+        </w:rPr>
+        <w:drawing>
+          <wp:inline distT="0" distB="0" distL="0" distR="0" wp14:anchorId="7538B928">
+            <wp:extent cx="1933575" cy="742950"/>
+            <wp:effectExtent l="0" t="0" r="9525" b="0"/>
+            <wp:docPr id="181" name="Imagem 181"/>
+            <wp:cNvGraphicFramePr>
+              <a:graphicFrameLocks xmlns:a="http://schemas.openxmlformats.org/drawingml/2006/main" noChangeAspect="1"/>
+            </wp:cNvGraphicFramePr>
+            <a:graphic xmlns:a="http://schemas.openxmlformats.org/drawingml/2006/main">
+              <a:graphicData uri="http://schemas.openxmlformats.org/drawingml/2006/picture">
+                <pic:pic xmlns:pic="http://schemas.openxmlformats.org/drawingml/2006/picture">
+                  <pic:nvPicPr>
+                    <pic:cNvPr id="0" name="Picture 2"/>
+                    <pic:cNvPicPr>
+                      <a:picLocks noChangeAspect="1" noChangeArrowheads="1"/>
+                    </pic:cNvPicPr>
+                  </pic:nvPicPr>
+                  <pic:blipFill>
+                    <a:blip r:embed="rId190">
+                      <a:extLst>
+                        <a:ext uri="{28A0092B-C50C-407E-A947-70E740481C1C}">
+                          <a14:useLocalDpi xmlns:a14="http://schemas.microsoft.com/office/drawing/2010/main" val="0"/>
+                        </a:ext>
+                      </a:extLst>
+                    </a:blip>
+                    <a:srcRect/>
+                    <a:stretch>
+                      <a:fillRect/>
+                    </a:stretch>
+                  </pic:blipFill>
+                  <pic:spPr bwMode="auto">
+                    <a:xfrm>
+                      <a:off x="0" y="0"/>
+                      <a:ext cx="1933575" cy="742950"/>
+                    </a:xfrm>
+                    <a:prstGeom prst="rect">
+                      <a:avLst/>
+                    </a:prstGeom>
+                    <a:noFill/>
+                  </pic:spPr>
+                </pic:pic>
+              </a:graphicData>
+            </a:graphic>
+          </wp:inline>
+        </w:drawing>
+      </w:r>
+    </w:p>
+    <w:p>
+      <w:pPr>
+        <w:jc w:val="both"/>
+      </w:pPr>
+    </w:p>
+    <w:p>
+      <w:pPr>
+        <w:jc w:val="both"/>
+      </w:pPr>
+      <w:r>
+        <w:t>No input demos uma largura de 90% e um espaço interno de 10px para todos os lados.</w:t>
+      </w:r>
+    </w:p>
+    <w:p>
+      <w:pPr>
+        <w:jc w:val="both"/>
+      </w:pPr>
+      <w:r>
+        <w:t xml:space="preserve">  </w:t>
+      </w:r>
+      <w:r>
+        <w:rPr>
+          <w:noProof/>
+        </w:rPr>
+        <w:drawing>
+          <wp:inline distT="0" distB="0" distL="0" distR="0" wp14:anchorId="1FD3C424">
+            <wp:extent cx="1769424" cy="1021278"/>
+            <wp:effectExtent l="0" t="0" r="2540" b="7620"/>
+            <wp:docPr id="182" name="Imagem 182"/>
+            <wp:cNvGraphicFramePr>
+              <a:graphicFrameLocks xmlns:a="http://schemas.openxmlformats.org/drawingml/2006/main" noChangeAspect="1"/>
+            </wp:cNvGraphicFramePr>
+            <a:graphic xmlns:a="http://schemas.openxmlformats.org/drawingml/2006/main">
+              <a:graphicData uri="http://schemas.openxmlformats.org/drawingml/2006/picture">
+                <pic:pic xmlns:pic="http://schemas.openxmlformats.org/drawingml/2006/picture">
+                  <pic:nvPicPr>
+                    <pic:cNvPr id="0" name="Picture 3"/>
+                    <pic:cNvPicPr>
+                      <a:picLocks noChangeAspect="1" noChangeArrowheads="1"/>
+                    </pic:cNvPicPr>
+                  </pic:nvPicPr>
+                  <pic:blipFill>
+                    <a:blip r:embed="rId191">
+                      <a:extLst>
+                        <a:ext uri="{28A0092B-C50C-407E-A947-70E740481C1C}">
+                          <a14:useLocalDpi xmlns:a14="http://schemas.microsoft.com/office/drawing/2010/main" val="0"/>
+                        </a:ext>
+                      </a:extLst>
+                    </a:blip>
+                    <a:srcRect/>
+                    <a:stretch>
+                      <a:fillRect/>
+                    </a:stretch>
+                  </pic:blipFill>
+                  <pic:spPr bwMode="auto">
+                    <a:xfrm>
+                      <a:off x="0" y="0"/>
+                      <a:ext cx="1780669" cy="1027768"/>
+                    </a:xfrm>
+                    <a:prstGeom prst="rect">
+                      <a:avLst/>
+                    </a:prstGeom>
+                    <a:noFill/>
+                  </pic:spPr>
+                </pic:pic>
+              </a:graphicData>
+            </a:graphic>
+          </wp:inline>
+        </w:drawing>
+      </w:r>
+      <w:r>
+        <w:t xml:space="preserve">   </w:t>
+      </w:r>
+    </w:p>
+    <w:p>
+      <w:pPr>
+        <w:jc w:val="both"/>
+      </w:pPr>
+    </w:p>
+    <w:p>
+      <w:pPr>
+        <w:jc w:val="both"/>
+      </w:pPr>
+      <w:r>
+        <w:t>E no botão enviar ficou da seguinte forma:</w:t>
+      </w:r>
+    </w:p>
+    <w:p>
+      <w:pPr>
+        <w:jc w:val="both"/>
+      </w:pPr>
+      <w:r>
+        <w:t xml:space="preserve"> </w:t>
+      </w:r>
+      <w:r>
+        <w:rPr>
+          <w:noProof/>
+        </w:rPr>
+        <w:drawing>
+          <wp:inline distT="0" distB="0" distL="0" distR="0" wp14:anchorId="32DDDC12">
+            <wp:extent cx="2030680" cy="962458"/>
+            <wp:effectExtent l="0" t="0" r="8255" b="9525"/>
+            <wp:docPr id="183" name="Imagem 183"/>
+            <wp:cNvGraphicFramePr>
+              <a:graphicFrameLocks xmlns:a="http://schemas.openxmlformats.org/drawingml/2006/main" noChangeAspect="1"/>
+            </wp:cNvGraphicFramePr>
+            <a:graphic xmlns:a="http://schemas.openxmlformats.org/drawingml/2006/main">
+              <a:graphicData uri="http://schemas.openxmlformats.org/drawingml/2006/picture">
+                <pic:pic xmlns:pic="http://schemas.openxmlformats.org/drawingml/2006/picture">
+                  <pic:nvPicPr>
+                    <pic:cNvPr id="0" name="Picture 4"/>
+                    <pic:cNvPicPr>
+                      <a:picLocks noChangeAspect="1" noChangeArrowheads="1"/>
+                    </pic:cNvPicPr>
+                  </pic:nvPicPr>
+                  <pic:blipFill>
+                    <a:blip r:embed="rId192">
+                      <a:extLst>
+                        <a:ext uri="{28A0092B-C50C-407E-A947-70E740481C1C}">
+                          <a14:useLocalDpi xmlns:a14="http://schemas.microsoft.com/office/drawing/2010/main" val="0"/>
+                        </a:ext>
+                      </a:extLst>
+                    </a:blip>
+                    <a:srcRect/>
+                    <a:stretch>
+                      <a:fillRect/>
+                    </a:stretch>
+                  </pic:blipFill>
+                  <pic:spPr bwMode="auto">
+                    <a:xfrm>
+                      <a:off x="0" y="0"/>
+                      <a:ext cx="2038437" cy="966135"/>
+                    </a:xfrm>
+                    <a:prstGeom prst="rect">
+                      <a:avLst/>
+                    </a:prstGeom>
+                    <a:noFill/>
+                  </pic:spPr>
+                </pic:pic>
+              </a:graphicData>
+            </a:graphic>
+          </wp:inline>
+        </w:drawing>
+      </w:r>
+      <w:r>
+        <w:t xml:space="preserve">                               </w:t>
+      </w:r>
+    </w:p>
+    <w:p>
+      <w:pPr>
+        <w:jc w:val="both"/>
+      </w:pPr>
+    </w:p>
+    <w:p>
+      <w:pPr>
+        <w:jc w:val="both"/>
+      </w:pPr>
+    </w:p>
+    <w:p>
+      <w:pPr>
+        <w:jc w:val="both"/>
+      </w:pPr>
+    </w:p>
+    <w:p>
+      <w:pPr>
+        <w:jc w:val="both"/>
+      </w:pPr>
+      <w:proofErr w:type="spellStart"/>
+      <w:r>
+        <w:t>Codigo</w:t>
+      </w:r>
+      <w:proofErr w:type="spellEnd"/>
+      <w:r>
+        <w:t xml:space="preserve"> inteiro ficou da seguinte forma:</w:t>
+      </w:r>
+    </w:p>
+    <w:p>
+      <w:pPr>
+        <w:jc w:val="both"/>
+      </w:pPr>
+      <w:r>
+        <w:t xml:space="preserve">  </w:t>
+      </w:r>
+      <w:r>
+        <w:rPr>
+          <w:noProof/>
+        </w:rPr>
+        <w:drawing>
+          <wp:inline distT="0" distB="0" distL="0" distR="0" wp14:anchorId="7B36C682">
+            <wp:extent cx="2734310" cy="4991735"/>
+            <wp:effectExtent l="0" t="0" r="8890" b="0"/>
+            <wp:docPr id="184" name="Imagem 184"/>
+            <wp:cNvGraphicFramePr>
+              <a:graphicFrameLocks xmlns:a="http://schemas.openxmlformats.org/drawingml/2006/main" noChangeAspect="1"/>
+            </wp:cNvGraphicFramePr>
+            <a:graphic xmlns:a="http://schemas.openxmlformats.org/drawingml/2006/main">
+              <a:graphicData uri="http://schemas.openxmlformats.org/drawingml/2006/picture">
+                <pic:pic xmlns:pic="http://schemas.openxmlformats.org/drawingml/2006/picture">
+                  <pic:nvPicPr>
+                    <pic:cNvPr id="0" name="Picture 5"/>
+                    <pic:cNvPicPr>
+                      <a:picLocks noChangeAspect="1" noChangeArrowheads="1"/>
+                    </pic:cNvPicPr>
+                  </pic:nvPicPr>
+                  <pic:blipFill>
+                    <a:blip r:embed="rId193">
+                      <a:extLst>
+                        <a:ext uri="{28A0092B-C50C-407E-A947-70E740481C1C}">
+                          <a14:useLocalDpi xmlns:a14="http://schemas.microsoft.com/office/drawing/2010/main" val="0"/>
+                        </a:ext>
+                      </a:extLst>
+                    </a:blip>
+                    <a:srcRect/>
+                    <a:stretch>
+                      <a:fillRect/>
+                    </a:stretch>
+                  </pic:blipFill>
+                  <pic:spPr bwMode="auto">
+                    <a:xfrm>
+                      <a:off x="0" y="0"/>
+                      <a:ext cx="2734310" cy="4991735"/>
+                    </a:xfrm>
+                    <a:prstGeom prst="rect">
+                      <a:avLst/>
+                    </a:prstGeom>
+                    <a:noFill/>
+                  </pic:spPr>
+                </pic:pic>
+              </a:graphicData>
+            </a:graphic>
+          </wp:inline>
+        </w:drawing>
+      </w:r>
+      <w:r>
+        <w:t xml:space="preserve"> </w:t>
+      </w:r>
+    </w:p>
+    <w:p>
+      <w:pPr>
+        <w:jc w:val="both"/>
+      </w:pPr>
+    </w:p>
+    <w:p>
+      <w:pPr>
+        <w:jc w:val="both"/>
+      </w:pPr>
+      <w:r>
+        <w:t>134-</w:t>
+      </w:r>
+      <w:r>
+        <w:t xml:space="preserve">Como hospedar o site e criar uma </w:t>
+      </w:r>
+      <w:proofErr w:type="spellStart"/>
+      <w:r>
+        <w:t>url</w:t>
+      </w:r>
+      <w:proofErr w:type="spellEnd"/>
+      <w:r>
+        <w:t xml:space="preserve"> utilizando o </w:t>
+      </w:r>
+      <w:proofErr w:type="spellStart"/>
+      <w:r>
+        <w:t>github</w:t>
+      </w:r>
+      <w:proofErr w:type="spellEnd"/>
+      <w:r>
+        <w:t>.</w:t>
+      </w:r>
+    </w:p>
+    <w:p>
+      <w:pPr>
+        <w:jc w:val="both"/>
+      </w:pPr>
       <w:bookmarkStart w:id="0" w:name="_GoBack"/>
       <w:bookmarkEnd w:id="0"/>
-    </w:p>
-    <w:p>
-      <w:pPr>
-        <w:jc w:val="both"/>
-      </w:pPr>
-    </w:p>
-    <w:p>
-      <w:pPr>
-        <w:pStyle w:val="PargrafodaLista"/>
-        <w:jc w:val="both"/>
-      </w:pPr>
-      <w:r>
-        <w:t xml:space="preserve">                                                                                                                                                                                                                   </w:t>
+      <w:r>
+        <w:t xml:space="preserve"> </w:t>
+      </w:r>
+      <w:r>
+        <w:t xml:space="preserve">                                                                                                                                                                            </w:t>
       </w:r>
     </w:p>
     <w:sectPr>
@@ -17269,7 +17711,7 @@
 </file>
 
 <file path=customXml/itemProps1.xml><?xml version="1.0" encoding="utf-8"?>
-<ds:datastoreItem xmlns:ds="http://schemas.openxmlformats.org/officeDocument/2006/customXml" ds:itemID="{7FF5F3BA-5983-4A27-B2E6-21DC69D68EBA}">
+<ds:datastoreItem xmlns:ds="http://schemas.openxmlformats.org/officeDocument/2006/customXml" ds:itemID="{14E17E0C-CA1C-4DA6-ABAB-D8703BEFE46D}">
   <ds:schemaRefs>
     <ds:schemaRef ds:uri="http://schemas.openxmlformats.org/officeDocument/2006/bibliography"/>
   </ds:schemaRefs>

</xml_diff>